<commit_message>
Case study: paperclip/cubby turn-in (no photos), 1.1 box fills its page, cover fits one page
Co-Authored-By: Claude Sonnet 5.5 <noreply@anthropic.com>
Claude-Session: https://claude.ai/code/session_01BaPRnyq7pWkkksjSCgkfNC
</commit_message>
<xml_diff>
--- a/casestudy/cases/burn_icu/out/CS-BURN-ICU-1_STUDENT.docx
+++ b/casestudy/cases/burn_icu/out/CS-BURN-ICU-1_STUDENT.docx
@@ -48,28 +48,28 @@
     </w:p>
     <w:p>
       <w:pPr>
-        <w:spacing w:before="0" w:after="60"/>
+        <w:spacing w:before="0" w:after="40"/>
       </w:pPr>
       <w:r>
         <w:rPr>
           <w:rFonts w:ascii="Times New Roman" w:hAnsi="Times New Roman" w:eastAsia="Times New Roman"/>
           <w:b w:val="0"/>
           <w:i w:val="0"/>
-          <w:sz w:val="22"/>
+          <w:sz w:val="20"/>
         </w:rPr>
         <w:t>You are the Burn ICU nurse for Marcus Delaney, a 34-year-old man in room BICU-6 with burns from a house fire. Open the patient in the student EHR (Student View, or the patient file from your instructor). He arrived in the ICU at 0400 on Monday 11/02/26 and the night nurse has cared for him since. You take over at the 0700 shift change, and the chart runs until his transfer to a medical-surgical unit on Thursday 11/05/26 at 0700.</w:t>
       </w:r>
     </w:p>
     <w:p>
       <w:pPr>
-        <w:spacing w:before="0" w:after="60"/>
+        <w:spacing w:before="0" w:after="40"/>
       </w:pPr>
       <w:r>
         <w:rPr>
           <w:rFonts w:ascii="Times New Roman" w:hAnsi="Times New Roman" w:eastAsia="Times New Roman"/>
           <w:b w:val="0"/>
           <w:i w:val="0"/>
-          <w:sz w:val="22"/>
+          <w:sz w:val="20"/>
         </w:rPr>
         <w:t>You will work through his stay one 12-hour shift at a time. At the start of each shift, set the simulation clock to the time written at the top of that shift and read the chart up to that moment. You may not need to look past the end of the shift you are working on. Each question tells you where to look in the EHR.</w:t>
       </w:r>
@@ -90,28 +90,28 @@
     </w:p>
     <w:p>
       <w:pPr>
-        <w:spacing w:before="0" w:after="60"/>
+        <w:spacing w:before="0" w:after="40"/>
       </w:pPr>
       <w:r>
         <w:rPr>
           <w:rFonts w:ascii="Times New Roman" w:hAnsi="Times New Roman" w:eastAsia="Times New Roman"/>
           <w:b w:val="0"/>
           <w:i w:val="0"/>
-          <w:sz w:val="22"/>
+          <w:sz w:val="20"/>
         </w:rPr>
         <w:t>Shift 1: Monday 11/02, 0700 to 1900 (day).   Shift 2: Monday 1900 to Tuesday 11/03 0700 (night).   Shift 3: Tuesday 0700 to 1900 (day).</w:t>
       </w:r>
     </w:p>
     <w:p>
       <w:pPr>
-        <w:spacing w:before="0" w:after="60"/>
+        <w:spacing w:before="0" w:after="40"/>
       </w:pPr>
       <w:r>
         <w:rPr>
           <w:rFonts w:ascii="Times New Roman" w:hAnsi="Times New Roman" w:eastAsia="Times New Roman"/>
           <w:b w:val="0"/>
           <w:i w:val="0"/>
-          <w:sz w:val="22"/>
+          <w:sz w:val="20"/>
         </w:rPr>
         <w:t>Shift 4: Tuesday 1900 to Wednesday 11/04 0700 (night).   Shift 5: Wednesday 0700 to 1900 (day).   Shift 6: Wednesday 1900 to Thursday 11/05 0700 (night, ends with transfer to Med-Surg).</w:t>
       </w:r>
@@ -132,28 +132,28 @@
     </w:p>
     <w:p>
       <w:pPr>
-        <w:spacing w:before="0" w:after="60"/>
+        <w:spacing w:before="0" w:after="40"/>
       </w:pPr>
       <w:r>
         <w:rPr>
           <w:rFonts w:ascii="Times New Roman" w:hAnsi="Times New Roman" w:eastAsia="Times New Roman"/>
           <w:b w:val="0"/>
           <w:i w:val="0"/>
-          <w:sz w:val="22"/>
+          <w:sz w:val="20"/>
         </w:rPr>
         <w:t>Each numbered question is a real nursing decision or a piece of reasoning you would do on the unit: reading the flowsheets, labs, orders, MAR and notes, doing the math, and explaining what you would do and why. Write your answer in the large box under each question. Short, specific answers that use Marcus's own numbers earn more points than general textbook answers.</w:t>
       </w:r>
     </w:p>
     <w:p>
       <w:pPr>
-        <w:spacing w:before="0" w:after="60"/>
+        <w:spacing w:before="0" w:after="40"/>
       </w:pPr>
       <w:r>
         <w:rPr>
           <w:rFonts w:ascii="Times New Roman" w:hAnsi="Times New Roman" w:eastAsia="Times New Roman"/>
           <w:b w:val="0"/>
           <w:i w:val="0"/>
-          <w:sz w:val="22"/>
+          <w:sz w:val="20"/>
         </w:rPr>
         <w:t>Expect to spend about one hour on each shift, six hours in all. It is a take-home, individual, open-book assignment: use your textbooks, drug guide, notes and the chart.</w:t>
       </w:r>
@@ -420,28 +420,28 @@
     </w:p>
     <w:p>
       <w:pPr>
-        <w:spacing w:before="0" w:after="40"/>
+        <w:spacing w:before="0" w:after="20"/>
       </w:pPr>
       <w:r>
         <w:rPr>
           <w:rFonts w:ascii="Times New Roman" w:hAnsi="Times New Roman" w:eastAsia="Times New Roman"/>
           <w:b w:val="0"/>
           <w:i w:val="0"/>
-          <w:sz w:val="22"/>
+          <w:sz w:val="20"/>
         </w:rPr>
         <w:t>- The whole case study is worth 100 points. A score of 78 or higher is passing.</w:t>
       </w:r>
     </w:p>
     <w:p>
       <w:pPr>
-        <w:spacing w:before="0" w:after="40"/>
+        <w:spacing w:before="0" w:after="20"/>
       </w:pPr>
       <w:r>
         <w:rPr>
           <w:rFonts w:ascii="Times New Roman" w:hAnsi="Times New Roman" w:eastAsia="Times New Roman"/>
           <w:b w:val="0"/>
           <w:i w:val="0"/>
-          <w:sz w:val="22"/>
+          <w:sz w:val="20"/>
         </w:rPr>
         <w:t>- Each numbered question shows its point value. Points are given only for what is written in the box.</w:t>
       </w:r>
@@ -457,103 +457,117 @@
           <w:i w:val="0"/>
           <w:sz w:val="25"/>
         </w:rPr>
-        <w:t>Writing so your pages can be scored from photos</w:t>
+        <w:t>Writing and turning it in (your pages will be scanned)</w:t>
       </w:r>
     </w:p>
     <w:p>
       <w:pPr>
-        <w:spacing w:before="0" w:after="40"/>
+        <w:spacing w:before="0" w:after="20"/>
       </w:pPr>
       <w:r>
         <w:rPr>
           <w:rFonts w:ascii="Times New Roman" w:hAnsi="Times New Roman" w:eastAsia="Times New Roman"/>
           <w:b w:val="0"/>
           <w:i w:val="0"/>
-          <w:sz w:val="22"/>
+          <w:sz w:val="20"/>
         </w:rPr>
         <w:t>- Write in dark pen or very dark pencil, print clearly, and stay inside the box. Write the answer in the box with the same number as the question.</w:t>
       </w:r>
     </w:p>
     <w:p>
       <w:pPr>
-        <w:spacing w:before="0" w:after="40"/>
+        <w:spacing w:before="0" w:after="20"/>
       </w:pPr>
       <w:r>
         <w:rPr>
           <w:rFonts w:ascii="Times New Roman" w:hAnsi="Times New Roman" w:eastAsia="Times New Roman"/>
           <w:b w:val="0"/>
           <w:i w:val="0"/>
-          <w:sz w:val="22"/>
+          <w:sz w:val="20"/>
         </w:rPr>
         <w:t>- Write your name and date at the top of every page (the header prints a line for it).</w:t>
       </w:r>
     </w:p>
     <w:p>
       <w:pPr>
-        <w:spacing w:before="0" w:after="40"/>
+        <w:spacing w:before="0" w:after="20"/>
       </w:pPr>
       <w:r>
         <w:rPr>
           <w:rFonts w:ascii="Times New Roman" w:hAnsi="Times New Roman" w:eastAsia="Times New Roman"/>
           <w:b w:val="0"/>
           <w:i w:val="0"/>
-          <w:sz w:val="22"/>
+          <w:sz w:val="20"/>
         </w:rPr>
         <w:t>- If you need more room, write "continued on the back" and put the question number on the back.</w:t>
       </w:r>
     </w:p>
     <w:p>
       <w:pPr>
-        <w:spacing w:before="0" w:after="40"/>
+        <w:spacing w:before="0" w:after="20"/>
       </w:pPr>
       <w:r>
         <w:rPr>
           <w:rFonts w:ascii="Times New Roman" w:hAnsi="Times New Roman" w:eastAsia="Times New Roman"/>
           <w:b w:val="0"/>
           <w:i w:val="0"/>
-          <w:sz w:val="22"/>
+          <w:sz w:val="20"/>
         </w:rPr>
         <w:t>- Spell out drug names. Show your math: write the formula, the numbers and the units.</w:t>
       </w:r>
     </w:p>
     <w:p>
       <w:pPr>
-        <w:spacing w:before="0" w:after="40"/>
+        <w:spacing w:before="0" w:after="20"/>
       </w:pPr>
       <w:r>
         <w:rPr>
           <w:rFonts w:ascii="Times New Roman" w:hAnsi="Times New Roman" w:eastAsia="Times New Roman"/>
           <w:b w:val="0"/>
           <w:i w:val="0"/>
-          <w:sz w:val="22"/>
+          <w:sz w:val="20"/>
         </w:rPr>
-        <w:t>- When you finish: photograph EVERY page, one page per photo, on a flat surface in good light with all four corners and the page number in view.</w:t>
+        <w:t>- Do not take photos of your work. Your instructor will scan it.</w:t>
       </w:r>
     </w:p>
     <w:p>
       <w:pPr>
-        <w:spacing w:before="160" w:after="80"/>
+        <w:spacing w:before="0" w:after="20"/>
+      </w:pPr>
+      <w:r>
+        <w:rPr>
+          <w:rFonts w:ascii="Times New Roman" w:hAnsi="Times New Roman" w:eastAsia="Times New Roman"/>
+          <w:b w:val="0"/>
+          <w:i w:val="0"/>
+          <w:sz w:val="20"/>
+        </w:rPr>
+        <w:t>- TURN-IN: put ALL the pages in order and fasten them with a PAPERCLIP. Do NOT staple (the pages must come apart to be scanned). Leave the packet in the instructor's cubby at office G218i.</w:t>
+      </w:r>
+    </w:p>
+    <w:p>
+      <w:pPr>
+        <w:spacing w:before="80" w:after="80"/>
       </w:pPr>
       <w:r>
         <w:rPr>
           <w:rFonts w:ascii="Times New Roman" w:hAnsi="Times New Roman" w:eastAsia="Times New Roman"/>
           <w:b w:val="0"/>
           <w:i/>
-          <w:sz w:val="21"/>
+          <w:sz w:val="20"/>
         </w:rPr>
         <w:t>Honor statement: I completed this work myself, using only my textbooks, notes, drug references and the patient chart.</w:t>
       </w:r>
     </w:p>
     <w:p>
       <w:pPr>
-        <w:spacing w:before="120" w:after="80"/>
+        <w:spacing w:before="80" w:after="80"/>
       </w:pPr>
       <w:r>
         <w:rPr>
           <w:rFonts w:ascii="Times New Roman" w:hAnsi="Times New Roman" w:eastAsia="Times New Roman"/>
           <w:b w:val="0"/>
           <w:i w:val="0"/>
-          <w:sz w:val="22"/>
+          <w:sz w:val="21"/>
         </w:rPr>
         <w:t>Signature: ______________________________   Date: ______________</w:t>
       </w:r>
@@ -876,6 +890,282 @@
             <w:tcBorders>
               <w:top w:val="single" w:sz="4" w:color="808080" w:space="0"/>
               <w:left w:val="single" w:sz="10" w:color="000000" w:space="0"/>
+              <w:bottom w:val="single" w:sz="4" w:color="808080" w:space="0"/>
+              <w:right w:val="single" w:sz="10" w:color="000000" w:space="0"/>
+            </w:tcBorders>
+          </w:tcPr>
+          <w:p>
+            <w:pPr>
+              <w:keepNext/>
+              <w:spacing w:after="0"/>
+            </w:pPr>
+          </w:p>
+        </w:tc>
+      </w:tr>
+      <w:tr>
+        <w:trPr>
+          <w:trHeight w:val="432" w:hRule="exact"/>
+          <w:cantSplit/>
+        </w:trPr>
+        <w:tc>
+          <w:tcPr>
+            <w:tcW w:type="dxa" w:w="10080"/>
+            <w:tcBorders>
+              <w:top w:val="single" w:sz="4" w:color="808080" w:space="0"/>
+              <w:left w:val="single" w:sz="10" w:color="000000" w:space="0"/>
+              <w:bottom w:val="single" w:sz="4" w:color="808080" w:space="0"/>
+              <w:right w:val="single" w:sz="10" w:color="000000" w:space="0"/>
+            </w:tcBorders>
+          </w:tcPr>
+          <w:p>
+            <w:pPr>
+              <w:keepNext/>
+              <w:spacing w:after="0"/>
+            </w:pPr>
+          </w:p>
+        </w:tc>
+      </w:tr>
+      <w:tr>
+        <w:trPr>
+          <w:trHeight w:val="432" w:hRule="exact"/>
+          <w:cantSplit/>
+        </w:trPr>
+        <w:tc>
+          <w:tcPr>
+            <w:tcW w:type="dxa" w:w="10080"/>
+            <w:tcBorders>
+              <w:top w:val="single" w:sz="4" w:color="808080" w:space="0"/>
+              <w:left w:val="single" w:sz="10" w:color="000000" w:space="0"/>
+              <w:bottom w:val="single" w:sz="4" w:color="808080" w:space="0"/>
+              <w:right w:val="single" w:sz="10" w:color="000000" w:space="0"/>
+            </w:tcBorders>
+          </w:tcPr>
+          <w:p>
+            <w:pPr>
+              <w:keepNext/>
+              <w:spacing w:after="0"/>
+            </w:pPr>
+          </w:p>
+        </w:tc>
+      </w:tr>
+      <w:tr>
+        <w:trPr>
+          <w:trHeight w:val="432" w:hRule="exact"/>
+          <w:cantSplit/>
+        </w:trPr>
+        <w:tc>
+          <w:tcPr>
+            <w:tcW w:type="dxa" w:w="10080"/>
+            <w:tcBorders>
+              <w:top w:val="single" w:sz="4" w:color="808080" w:space="0"/>
+              <w:left w:val="single" w:sz="10" w:color="000000" w:space="0"/>
+              <w:bottom w:val="single" w:sz="4" w:color="808080" w:space="0"/>
+              <w:right w:val="single" w:sz="10" w:color="000000" w:space="0"/>
+            </w:tcBorders>
+          </w:tcPr>
+          <w:p>
+            <w:pPr>
+              <w:keepNext/>
+              <w:spacing w:after="0"/>
+            </w:pPr>
+          </w:p>
+        </w:tc>
+      </w:tr>
+      <w:tr>
+        <w:trPr>
+          <w:trHeight w:val="432" w:hRule="exact"/>
+          <w:cantSplit/>
+        </w:trPr>
+        <w:tc>
+          <w:tcPr>
+            <w:tcW w:type="dxa" w:w="10080"/>
+            <w:tcBorders>
+              <w:top w:val="single" w:sz="4" w:color="808080" w:space="0"/>
+              <w:left w:val="single" w:sz="10" w:color="000000" w:space="0"/>
+              <w:bottom w:val="single" w:sz="4" w:color="808080" w:space="0"/>
+              <w:right w:val="single" w:sz="10" w:color="000000" w:space="0"/>
+            </w:tcBorders>
+          </w:tcPr>
+          <w:p>
+            <w:pPr>
+              <w:keepNext/>
+              <w:spacing w:after="0"/>
+            </w:pPr>
+          </w:p>
+        </w:tc>
+      </w:tr>
+      <w:tr>
+        <w:trPr>
+          <w:trHeight w:val="432" w:hRule="exact"/>
+          <w:cantSplit/>
+        </w:trPr>
+        <w:tc>
+          <w:tcPr>
+            <w:tcW w:type="dxa" w:w="10080"/>
+            <w:tcBorders>
+              <w:top w:val="single" w:sz="4" w:color="808080" w:space="0"/>
+              <w:left w:val="single" w:sz="10" w:color="000000" w:space="0"/>
+              <w:bottom w:val="single" w:sz="4" w:color="808080" w:space="0"/>
+              <w:right w:val="single" w:sz="10" w:color="000000" w:space="0"/>
+            </w:tcBorders>
+          </w:tcPr>
+          <w:p>
+            <w:pPr>
+              <w:keepNext/>
+              <w:spacing w:after="0"/>
+            </w:pPr>
+          </w:p>
+        </w:tc>
+      </w:tr>
+      <w:tr>
+        <w:trPr>
+          <w:trHeight w:val="432" w:hRule="exact"/>
+          <w:cantSplit/>
+        </w:trPr>
+        <w:tc>
+          <w:tcPr>
+            <w:tcW w:type="dxa" w:w="10080"/>
+            <w:tcBorders>
+              <w:top w:val="single" w:sz="4" w:color="808080" w:space="0"/>
+              <w:left w:val="single" w:sz="10" w:color="000000" w:space="0"/>
+              <w:bottom w:val="single" w:sz="4" w:color="808080" w:space="0"/>
+              <w:right w:val="single" w:sz="10" w:color="000000" w:space="0"/>
+            </w:tcBorders>
+          </w:tcPr>
+          <w:p>
+            <w:pPr>
+              <w:keepNext/>
+              <w:spacing w:after="0"/>
+            </w:pPr>
+          </w:p>
+        </w:tc>
+      </w:tr>
+      <w:tr>
+        <w:trPr>
+          <w:trHeight w:val="432" w:hRule="exact"/>
+          <w:cantSplit/>
+        </w:trPr>
+        <w:tc>
+          <w:tcPr>
+            <w:tcW w:type="dxa" w:w="10080"/>
+            <w:tcBorders>
+              <w:top w:val="single" w:sz="4" w:color="808080" w:space="0"/>
+              <w:left w:val="single" w:sz="10" w:color="000000" w:space="0"/>
+              <w:bottom w:val="single" w:sz="4" w:color="808080" w:space="0"/>
+              <w:right w:val="single" w:sz="10" w:color="000000" w:space="0"/>
+            </w:tcBorders>
+          </w:tcPr>
+          <w:p>
+            <w:pPr>
+              <w:keepNext/>
+              <w:spacing w:after="0"/>
+            </w:pPr>
+          </w:p>
+        </w:tc>
+      </w:tr>
+      <w:tr>
+        <w:trPr>
+          <w:trHeight w:val="432" w:hRule="exact"/>
+          <w:cantSplit/>
+        </w:trPr>
+        <w:tc>
+          <w:tcPr>
+            <w:tcW w:type="dxa" w:w="10080"/>
+            <w:tcBorders>
+              <w:top w:val="single" w:sz="4" w:color="808080" w:space="0"/>
+              <w:left w:val="single" w:sz="10" w:color="000000" w:space="0"/>
+              <w:bottom w:val="single" w:sz="4" w:color="808080" w:space="0"/>
+              <w:right w:val="single" w:sz="10" w:color="000000" w:space="0"/>
+            </w:tcBorders>
+          </w:tcPr>
+          <w:p>
+            <w:pPr>
+              <w:keepNext/>
+              <w:spacing w:after="0"/>
+            </w:pPr>
+          </w:p>
+        </w:tc>
+      </w:tr>
+      <w:tr>
+        <w:trPr>
+          <w:trHeight w:val="432" w:hRule="exact"/>
+          <w:cantSplit/>
+        </w:trPr>
+        <w:tc>
+          <w:tcPr>
+            <w:tcW w:type="dxa" w:w="10080"/>
+            <w:tcBorders>
+              <w:top w:val="single" w:sz="4" w:color="808080" w:space="0"/>
+              <w:left w:val="single" w:sz="10" w:color="000000" w:space="0"/>
+              <w:bottom w:val="single" w:sz="4" w:color="808080" w:space="0"/>
+              <w:right w:val="single" w:sz="10" w:color="000000" w:space="0"/>
+            </w:tcBorders>
+          </w:tcPr>
+          <w:p>
+            <w:pPr>
+              <w:keepNext/>
+              <w:spacing w:after="0"/>
+            </w:pPr>
+          </w:p>
+        </w:tc>
+      </w:tr>
+      <w:tr>
+        <w:trPr>
+          <w:trHeight w:val="432" w:hRule="exact"/>
+          <w:cantSplit/>
+        </w:trPr>
+        <w:tc>
+          <w:tcPr>
+            <w:tcW w:type="dxa" w:w="10080"/>
+            <w:tcBorders>
+              <w:top w:val="single" w:sz="4" w:color="808080" w:space="0"/>
+              <w:left w:val="single" w:sz="10" w:color="000000" w:space="0"/>
+              <w:bottom w:val="single" w:sz="4" w:color="808080" w:space="0"/>
+              <w:right w:val="single" w:sz="10" w:color="000000" w:space="0"/>
+            </w:tcBorders>
+          </w:tcPr>
+          <w:p>
+            <w:pPr>
+              <w:keepNext/>
+              <w:spacing w:after="0"/>
+            </w:pPr>
+          </w:p>
+        </w:tc>
+      </w:tr>
+      <w:tr>
+        <w:trPr>
+          <w:trHeight w:val="432" w:hRule="exact"/>
+          <w:cantSplit/>
+        </w:trPr>
+        <w:tc>
+          <w:tcPr>
+            <w:tcW w:type="dxa" w:w="10080"/>
+            <w:tcBorders>
+              <w:top w:val="single" w:sz="4" w:color="808080" w:space="0"/>
+              <w:left w:val="single" w:sz="10" w:color="000000" w:space="0"/>
+              <w:bottom w:val="single" w:sz="4" w:color="808080" w:space="0"/>
+              <w:right w:val="single" w:sz="10" w:color="000000" w:space="0"/>
+            </w:tcBorders>
+          </w:tcPr>
+          <w:p>
+            <w:pPr>
+              <w:keepNext/>
+              <w:spacing w:after="0"/>
+            </w:pPr>
+          </w:p>
+        </w:tc>
+      </w:tr>
+      <w:tr>
+        <w:trPr>
+          <w:trHeight w:val="432" w:hRule="exact"/>
+          <w:cantSplit/>
+        </w:trPr>
+        <w:tc>
+          <w:tcPr>
+            <w:tcW w:type="dxa" w:w="10080"/>
+            <w:tcBorders>
+              <w:top w:val="single" w:sz="4" w:color="808080" w:space="0"/>
+              <w:left w:val="single" w:sz="10" w:color="000000" w:space="0"/>
               <w:bottom w:val="single" w:sz="10" w:color="000000" w:space="0"/>
               <w:right w:val="single" w:sz="10" w:color="000000" w:space="0"/>
             </w:tcBorders>
@@ -892,6 +1182,11 @@
       <w:pPr>
         <w:spacing w:before="0" w:after="40"/>
       </w:pPr>
+    </w:p>
+    <w:p>
+      <w:r>
+        <w:br w:type="page"/>
+      </w:r>
     </w:p>
     <w:p>
       <w:pPr>

</xml_diff>

<commit_message>
Burn case study layout: boxes sized to fill pages, no near-empty pages (9 pages)
Co-Authored-By: Claude Sonnet 5.5 <noreply@anthropic.com>
Claude-Session: https://claude.ai/code/session_01BaPRnyq7pWkkksjSCgkfNC
</commit_message>
<xml_diff>
--- a/casestudy/cases/burn_icu/out/CS-BURN-ICU-1_STUDENT.docx
+++ b/casestudy/cases/burn_icu/out/CS-BURN-ICU-1_STUDENT.docx
@@ -157,252 +157,6 @@
         </w:rPr>
         <w:t>Expect to spend about one hour on each shift, six hours in all. It is a take-home, individual, open-book assignment: use your textbooks, drug guide, notes and the chart.</w:t>
       </w:r>
-    </w:p>
-    <w:tbl>
-      <w:tblPr>
-        <w:tblW w:type="auto" w:w="0"/>
-        <w:tblLayout w:type="fixed"/>
-        <w:tblLook w:firstColumn="1" w:firstRow="1" w:lastColumn="0" w:lastRow="0" w:noHBand="0" w:noVBand="1" w:val="04A0"/>
-      </w:tblPr>
-      <w:tblGrid>
-        <w:gridCol w:w="1152"/>
-        <w:gridCol w:w="7056"/>
-        <w:gridCol w:w="1872"/>
-      </w:tblGrid>
-      <w:tr>
-        <w:tc>
-          <w:tcPr>
-            <w:tcW w:type="dxa" w:w="1152"/>
-            <w:shd w:val="clear" w:color="auto" w:fill="D9D9D9"/>
-            <w:tcBorders>
-              <w:top w:val="single" w:sz="4" w:color="808080" w:space="0"/>
-              <w:left w:val="single" w:sz="4" w:color="808080" w:space="0"/>
-              <w:bottom w:val="single" w:sz="4" w:color="808080" w:space="0"/>
-              <w:right w:val="single" w:sz="4" w:color="808080" w:space="0"/>
-            </w:tcBorders>
-          </w:tcPr>
-          <w:p>
-            <w:pPr>
-              <w:spacing w:after="0" w:before="0"/>
-            </w:pPr>
-            <w:r/>
-            <w:r>
-              <w:rPr>
-                <w:rFonts w:ascii="Times New Roman" w:hAnsi="Times New Roman" w:eastAsia="Times New Roman"/>
-                <w:b/>
-                <w:i w:val="0"/>
-                <w:sz w:val="20"/>
-              </w:rPr>
-              <w:t>Part</w:t>
-            </w:r>
-          </w:p>
-        </w:tc>
-        <w:tc>
-          <w:tcPr>
-            <w:tcW w:type="dxa" w:w="7056"/>
-            <w:shd w:val="clear" w:color="auto" w:fill="D9D9D9"/>
-            <w:tcBorders>
-              <w:top w:val="single" w:sz="4" w:color="808080" w:space="0"/>
-              <w:left w:val="single" w:sz="4" w:color="808080" w:space="0"/>
-              <w:bottom w:val="single" w:sz="4" w:color="808080" w:space="0"/>
-              <w:right w:val="single" w:sz="4" w:color="808080" w:space="0"/>
-            </w:tcBorders>
-          </w:tcPr>
-          <w:p>
-            <w:pPr>
-              <w:spacing w:after="0" w:before="0"/>
-            </w:pPr>
-            <w:r/>
-            <w:r>
-              <w:rPr>
-                <w:rFonts w:ascii="Times New Roman" w:hAnsi="Times New Roman" w:eastAsia="Times New Roman"/>
-                <w:b/>
-                <w:i w:val="0"/>
-                <w:sz w:val="20"/>
-              </w:rPr>
-              <w:t>Nursing process step</w:t>
-            </w:r>
-          </w:p>
-        </w:tc>
-        <w:tc>
-          <w:tcPr>
-            <w:tcW w:type="dxa" w:w="1872"/>
-            <w:shd w:val="clear" w:color="auto" w:fill="D9D9D9"/>
-            <w:tcBorders>
-              <w:top w:val="single" w:sz="4" w:color="808080" w:space="0"/>
-              <w:left w:val="single" w:sz="4" w:color="808080" w:space="0"/>
-              <w:bottom w:val="single" w:sz="4" w:color="808080" w:space="0"/>
-              <w:right w:val="single" w:sz="4" w:color="808080" w:space="0"/>
-            </w:tcBorders>
-          </w:tcPr>
-          <w:p>
-            <w:pPr>
-              <w:spacing w:after="0" w:before="0"/>
-            </w:pPr>
-            <w:r/>
-            <w:r>
-              <w:rPr>
-                <w:rFonts w:ascii="Times New Roman" w:hAnsi="Times New Roman" w:eastAsia="Times New Roman"/>
-                <w:b/>
-                <w:i w:val="0"/>
-                <w:sz w:val="20"/>
-              </w:rPr>
-              <w:t>Estimated time</w:t>
-            </w:r>
-          </w:p>
-        </w:tc>
-      </w:tr>
-      <w:tr>
-        <w:tc>
-          <w:tcPr>
-            <w:tcW w:type="dxa" w:w="1152"/>
-            <w:tcBorders>
-              <w:top w:val="single" w:sz="4" w:color="808080" w:space="0"/>
-              <w:left w:val="single" w:sz="4" w:color="808080" w:space="0"/>
-              <w:bottom w:val="single" w:sz="4" w:color="808080" w:space="0"/>
-              <w:right w:val="single" w:sz="4" w:color="808080" w:space="0"/>
-            </w:tcBorders>
-          </w:tcPr>
-          <w:p>
-            <w:pPr>
-              <w:spacing w:after="0" w:before="0"/>
-            </w:pPr>
-            <w:r/>
-            <w:r>
-              <w:rPr>
-                <w:rFonts w:ascii="Times New Roman" w:hAnsi="Times New Roman" w:eastAsia="Times New Roman"/>
-                <w:b w:val="0"/>
-                <w:i w:val="0"/>
-                <w:sz w:val="20"/>
-              </w:rPr>
-              <w:t>1</w:t>
-            </w:r>
-          </w:p>
-        </w:tc>
-        <w:tc>
-          <w:tcPr>
-            <w:tcW w:type="dxa" w:w="7056"/>
-            <w:tcBorders>
-              <w:top w:val="single" w:sz="4" w:color="808080" w:space="0"/>
-              <w:left w:val="single" w:sz="4" w:color="808080" w:space="0"/>
-              <w:bottom w:val="single" w:sz="4" w:color="808080" w:space="0"/>
-              <w:right w:val="single" w:sz="4" w:color="808080" w:space="0"/>
-            </w:tcBorders>
-          </w:tcPr>
-          <w:p>
-            <w:pPr>
-              <w:spacing w:after="0" w:before="0"/>
-            </w:pPr>
-            <w:r/>
-            <w:r>
-              <w:rPr>
-                <w:rFonts w:ascii="Times New Roman" w:hAnsi="Times New Roman" w:eastAsia="Times New Roman"/>
-                <w:b w:val="0"/>
-                <w:i w:val="0"/>
-                <w:sz w:val="20"/>
-              </w:rPr>
-              <w:t>Shift 1: Monday 11/02, 0700 to 1900 (day shift)   (Day 1 of the stay)</w:t>
-            </w:r>
-          </w:p>
-        </w:tc>
-        <w:tc>
-          <w:tcPr>
-            <w:tcW w:type="dxa" w:w="1872"/>
-            <w:tcBorders>
-              <w:top w:val="single" w:sz="4" w:color="808080" w:space="0"/>
-              <w:left w:val="single" w:sz="4" w:color="808080" w:space="0"/>
-              <w:bottom w:val="single" w:sz="4" w:color="808080" w:space="0"/>
-              <w:right w:val="single" w:sz="4" w:color="808080" w:space="0"/>
-            </w:tcBorders>
-          </w:tcPr>
-          <w:p>
-            <w:pPr>
-              <w:spacing w:after="0" w:before="0"/>
-            </w:pPr>
-            <w:r/>
-            <w:r>
-              <w:rPr>
-                <w:rFonts w:ascii="Times New Roman" w:hAnsi="Times New Roman" w:eastAsia="Times New Roman"/>
-                <w:b w:val="0"/>
-                <w:i w:val="0"/>
-                <w:sz w:val="20"/>
-              </w:rPr>
-              <w:t>60 min</w:t>
-            </w:r>
-          </w:p>
-        </w:tc>
-      </w:tr>
-      <w:tr>
-        <w:tc>
-          <w:tcPr>
-            <w:tcW w:type="dxa" w:w="1152"/>
-            <w:tcBorders>
-              <w:top w:val="single" w:sz="4" w:color="808080" w:space="0"/>
-              <w:left w:val="single" w:sz="4" w:color="808080" w:space="0"/>
-              <w:bottom w:val="single" w:sz="4" w:color="808080" w:space="0"/>
-              <w:right w:val="single" w:sz="4" w:color="808080" w:space="0"/>
-            </w:tcBorders>
-          </w:tcPr>
-          <w:p/>
-        </w:tc>
-        <w:tc>
-          <w:tcPr>
-            <w:tcW w:type="dxa" w:w="7056"/>
-            <w:tcBorders>
-              <w:top w:val="single" w:sz="4" w:color="808080" w:space="0"/>
-              <w:left w:val="single" w:sz="4" w:color="808080" w:space="0"/>
-              <w:bottom w:val="single" w:sz="4" w:color="808080" w:space="0"/>
-              <w:right w:val="single" w:sz="4" w:color="808080" w:space="0"/>
-            </w:tcBorders>
-          </w:tcPr>
-          <w:p>
-            <w:pPr>
-              <w:spacing w:after="0" w:before="0"/>
-            </w:pPr>
-            <w:r/>
-            <w:r>
-              <w:rPr>
-                <w:rFonts w:ascii="Times New Roman" w:hAnsi="Times New Roman" w:eastAsia="Times New Roman"/>
-                <w:b/>
-                <w:i w:val="0"/>
-                <w:sz w:val="20"/>
-              </w:rPr>
-              <w:t>Estimated total</w:t>
-            </w:r>
-          </w:p>
-        </w:tc>
-        <w:tc>
-          <w:tcPr>
-            <w:tcW w:type="dxa" w:w="1872"/>
-            <w:tcBorders>
-              <w:top w:val="single" w:sz="4" w:color="808080" w:space="0"/>
-              <w:left w:val="single" w:sz="4" w:color="808080" w:space="0"/>
-              <w:bottom w:val="single" w:sz="4" w:color="808080" w:space="0"/>
-              <w:right w:val="single" w:sz="4" w:color="808080" w:space="0"/>
-            </w:tcBorders>
-          </w:tcPr>
-          <w:p>
-            <w:pPr>
-              <w:spacing w:after="0" w:before="0"/>
-            </w:pPr>
-            <w:r/>
-            <w:r>
-              <w:rPr>
-                <w:rFonts w:ascii="Times New Roman" w:hAnsi="Times New Roman" w:eastAsia="Times New Roman"/>
-                <w:b/>
-                <w:i w:val="0"/>
-                <w:sz w:val="20"/>
-              </w:rPr>
-              <w:t>1 h 0 min</w:t>
-            </w:r>
-          </w:p>
-        </w:tc>
-      </w:tr>
-    </w:tbl>
-    <w:p>
-      <w:pPr>
-        <w:spacing w:before="0" w:after="80"/>
-      </w:pPr>
     </w:p>
     <w:p>
       <w:pPr>
@@ -2411,6 +2165,75 @@
             <w:tcBorders>
               <w:top w:val="single" w:sz="4" w:color="808080" w:space="0"/>
               <w:left w:val="single" w:sz="10" w:color="000000" w:space="0"/>
+              <w:bottom w:val="single" w:sz="4" w:color="808080" w:space="0"/>
+              <w:right w:val="single" w:sz="10" w:color="000000" w:space="0"/>
+            </w:tcBorders>
+          </w:tcPr>
+          <w:p>
+            <w:pPr>
+              <w:keepNext/>
+              <w:spacing w:after="0"/>
+            </w:pPr>
+          </w:p>
+        </w:tc>
+      </w:tr>
+      <w:tr>
+        <w:trPr>
+          <w:trHeight w:val="432" w:hRule="exact"/>
+          <w:cantSplit/>
+        </w:trPr>
+        <w:tc>
+          <w:tcPr>
+            <w:tcW w:type="dxa" w:w="10080"/>
+            <w:tcBorders>
+              <w:top w:val="single" w:sz="4" w:color="808080" w:space="0"/>
+              <w:left w:val="single" w:sz="10" w:color="000000" w:space="0"/>
+              <w:bottom w:val="single" w:sz="4" w:color="808080" w:space="0"/>
+              <w:right w:val="single" w:sz="10" w:color="000000" w:space="0"/>
+            </w:tcBorders>
+          </w:tcPr>
+          <w:p>
+            <w:pPr>
+              <w:keepNext/>
+              <w:spacing w:after="0"/>
+            </w:pPr>
+          </w:p>
+        </w:tc>
+      </w:tr>
+      <w:tr>
+        <w:trPr>
+          <w:trHeight w:val="432" w:hRule="exact"/>
+          <w:cantSplit/>
+        </w:trPr>
+        <w:tc>
+          <w:tcPr>
+            <w:tcW w:type="dxa" w:w="10080"/>
+            <w:tcBorders>
+              <w:top w:val="single" w:sz="4" w:color="808080" w:space="0"/>
+              <w:left w:val="single" w:sz="10" w:color="000000" w:space="0"/>
+              <w:bottom w:val="single" w:sz="4" w:color="808080" w:space="0"/>
+              <w:right w:val="single" w:sz="10" w:color="000000" w:space="0"/>
+            </w:tcBorders>
+          </w:tcPr>
+          <w:p>
+            <w:pPr>
+              <w:keepNext/>
+              <w:spacing w:after="0"/>
+            </w:pPr>
+          </w:p>
+        </w:tc>
+      </w:tr>
+      <w:tr>
+        <w:trPr>
+          <w:trHeight w:val="432" w:hRule="exact"/>
+          <w:cantSplit/>
+        </w:trPr>
+        <w:tc>
+          <w:tcPr>
+            <w:tcW w:type="dxa" w:w="10080"/>
+            <w:tcBorders>
+              <w:top w:val="single" w:sz="4" w:color="808080" w:space="0"/>
+              <w:left w:val="single" w:sz="10" w:color="000000" w:space="0"/>
               <w:bottom w:val="single" w:sz="10" w:color="000000" w:space="0"/>
               <w:right w:val="single" w:sz="10" w:color="000000" w:space="0"/>
             </w:tcBorders>
@@ -2513,6 +2336,98 @@
             <w:tcW w:type="dxa" w:w="10080"/>
             <w:tcBorders>
               <w:top w:val="single" w:sz="10" w:color="000000" w:space="0"/>
+              <w:left w:val="single" w:sz="10" w:color="000000" w:space="0"/>
+              <w:bottom w:val="single" w:sz="4" w:color="808080" w:space="0"/>
+              <w:right w:val="single" w:sz="10" w:color="000000" w:space="0"/>
+            </w:tcBorders>
+          </w:tcPr>
+          <w:p>
+            <w:pPr>
+              <w:keepNext/>
+              <w:spacing w:after="0"/>
+            </w:pPr>
+          </w:p>
+        </w:tc>
+      </w:tr>
+      <w:tr>
+        <w:trPr>
+          <w:trHeight w:val="432" w:hRule="exact"/>
+          <w:cantSplit/>
+        </w:trPr>
+        <w:tc>
+          <w:tcPr>
+            <w:tcW w:type="dxa" w:w="10080"/>
+            <w:tcBorders>
+              <w:top w:val="single" w:sz="4" w:color="808080" w:space="0"/>
+              <w:left w:val="single" w:sz="10" w:color="000000" w:space="0"/>
+              <w:bottom w:val="single" w:sz="4" w:color="808080" w:space="0"/>
+              <w:right w:val="single" w:sz="10" w:color="000000" w:space="0"/>
+            </w:tcBorders>
+          </w:tcPr>
+          <w:p>
+            <w:pPr>
+              <w:keepNext/>
+              <w:spacing w:after="0"/>
+            </w:pPr>
+          </w:p>
+        </w:tc>
+      </w:tr>
+      <w:tr>
+        <w:trPr>
+          <w:trHeight w:val="432" w:hRule="exact"/>
+          <w:cantSplit/>
+        </w:trPr>
+        <w:tc>
+          <w:tcPr>
+            <w:tcW w:type="dxa" w:w="10080"/>
+            <w:tcBorders>
+              <w:top w:val="single" w:sz="4" w:color="808080" w:space="0"/>
+              <w:left w:val="single" w:sz="10" w:color="000000" w:space="0"/>
+              <w:bottom w:val="single" w:sz="4" w:color="808080" w:space="0"/>
+              <w:right w:val="single" w:sz="10" w:color="000000" w:space="0"/>
+            </w:tcBorders>
+          </w:tcPr>
+          <w:p>
+            <w:pPr>
+              <w:keepNext/>
+              <w:spacing w:after="0"/>
+            </w:pPr>
+          </w:p>
+        </w:tc>
+      </w:tr>
+      <w:tr>
+        <w:trPr>
+          <w:trHeight w:val="432" w:hRule="exact"/>
+          <w:cantSplit/>
+        </w:trPr>
+        <w:tc>
+          <w:tcPr>
+            <w:tcW w:type="dxa" w:w="10080"/>
+            <w:tcBorders>
+              <w:top w:val="single" w:sz="4" w:color="808080" w:space="0"/>
+              <w:left w:val="single" w:sz="10" w:color="000000" w:space="0"/>
+              <w:bottom w:val="single" w:sz="4" w:color="808080" w:space="0"/>
+              <w:right w:val="single" w:sz="10" w:color="000000" w:space="0"/>
+            </w:tcBorders>
+          </w:tcPr>
+          <w:p>
+            <w:pPr>
+              <w:keepNext/>
+              <w:spacing w:after="0"/>
+            </w:pPr>
+          </w:p>
+        </w:tc>
+      </w:tr>
+      <w:tr>
+        <w:trPr>
+          <w:trHeight w:val="432" w:hRule="exact"/>
+          <w:cantSplit/>
+        </w:trPr>
+        <w:tc>
+          <w:tcPr>
+            <w:tcW w:type="dxa" w:w="10080"/>
+            <w:tcBorders>
+              <w:top w:val="single" w:sz="4" w:color="808080" w:space="0"/>
               <w:left w:val="single" w:sz="10" w:color="000000" w:space="0"/>
               <w:bottom w:val="single" w:sz="4" w:color="808080" w:space="0"/>
               <w:right w:val="single" w:sz="10" w:color="000000" w:space="0"/>
@@ -3341,52 +3256,6 @@
             <w:tcBorders>
               <w:top w:val="single" w:sz="4" w:color="808080" w:space="0"/>
               <w:left w:val="single" w:sz="10" w:color="000000" w:space="0"/>
-              <w:bottom w:val="single" w:sz="4" w:color="808080" w:space="0"/>
-              <w:right w:val="single" w:sz="10" w:color="000000" w:space="0"/>
-            </w:tcBorders>
-          </w:tcPr>
-          <w:p>
-            <w:pPr>
-              <w:keepNext/>
-              <w:spacing w:after="0"/>
-            </w:pPr>
-          </w:p>
-        </w:tc>
-      </w:tr>
-      <w:tr>
-        <w:trPr>
-          <w:trHeight w:val="432" w:hRule="exact"/>
-          <w:cantSplit/>
-        </w:trPr>
-        <w:tc>
-          <w:tcPr>
-            <w:tcW w:type="dxa" w:w="10080"/>
-            <w:tcBorders>
-              <w:top w:val="single" w:sz="4" w:color="808080" w:space="0"/>
-              <w:left w:val="single" w:sz="10" w:color="000000" w:space="0"/>
-              <w:bottom w:val="single" w:sz="4" w:color="808080" w:space="0"/>
-              <w:right w:val="single" w:sz="10" w:color="000000" w:space="0"/>
-            </w:tcBorders>
-          </w:tcPr>
-          <w:p>
-            <w:pPr>
-              <w:keepNext/>
-              <w:spacing w:after="0"/>
-            </w:pPr>
-          </w:p>
-        </w:tc>
-      </w:tr>
-      <w:tr>
-        <w:trPr>
-          <w:trHeight w:val="432" w:hRule="exact"/>
-          <w:cantSplit/>
-        </w:trPr>
-        <w:tc>
-          <w:tcPr>
-            <w:tcW w:type="dxa" w:w="10080"/>
-            <w:tcBorders>
-              <w:top w:val="single" w:sz="4" w:color="808080" w:space="0"/>
-              <w:left w:val="single" w:sz="10" w:color="000000" w:space="0"/>
               <w:bottom w:val="single" w:sz="10" w:color="000000" w:space="0"/>
               <w:right w:val="single" w:sz="10" w:color="000000" w:space="0"/>
             </w:tcBorders>
@@ -3566,7 +3435,7 @@
       </w:tr>
       <w:tr>
         <w:trPr>
-          <w:trHeight w:val="893" w:hRule="atLeast"/>
+          <w:trHeight w:val="1800" w:hRule="atLeast"/>
           <w:cantSplit/>
         </w:trPr>
         <w:tc>
@@ -3608,7 +3477,7 @@
       </w:tr>
       <w:tr>
         <w:trPr>
-          <w:trHeight w:val="893" w:hRule="atLeast"/>
+          <w:trHeight w:val="1800" w:hRule="atLeast"/>
           <w:cantSplit/>
         </w:trPr>
         <w:tc>
@@ -3650,7 +3519,7 @@
       </w:tr>
       <w:tr>
         <w:trPr>
-          <w:trHeight w:val="893" w:hRule="atLeast"/>
+          <w:trHeight w:val="1800" w:hRule="atLeast"/>
           <w:cantSplit/>
         </w:trPr>
         <w:tc>
@@ -3692,7 +3561,7 @@
       </w:tr>
       <w:tr>
         <w:trPr>
-          <w:trHeight w:val="893" w:hRule="atLeast"/>
+          <w:trHeight w:val="1800" w:hRule="atLeast"/>
           <w:cantSplit/>
         </w:trPr>
         <w:tc>
@@ -3734,7 +3603,7 @@
       </w:tr>
       <w:tr>
         <w:trPr>
-          <w:trHeight w:val="893" w:hRule="atLeast"/>
+          <w:trHeight w:val="1800" w:hRule="atLeast"/>
           <w:cantSplit/>
         </w:trPr>
         <w:tc>
@@ -3776,7 +3645,7 @@
       </w:tr>
       <w:tr>
         <w:trPr>
-          <w:trHeight w:val="893" w:hRule="atLeast"/>
+          <w:trHeight w:val="1800" w:hRule="atLeast"/>
           <w:cantSplit/>
         </w:trPr>
         <w:tc>
@@ -4782,6 +4651,259 @@
             <w:tcBorders>
               <w:top w:val="single" w:sz="4" w:color="808080" w:space="0"/>
               <w:left w:val="single" w:sz="10" w:color="000000" w:space="0"/>
+              <w:bottom w:val="single" w:sz="4" w:color="808080" w:space="0"/>
+              <w:right w:val="single" w:sz="10" w:color="000000" w:space="0"/>
+            </w:tcBorders>
+          </w:tcPr>
+          <w:p>
+            <w:pPr>
+              <w:keepNext/>
+              <w:spacing w:after="0"/>
+            </w:pPr>
+          </w:p>
+        </w:tc>
+      </w:tr>
+      <w:tr>
+        <w:trPr>
+          <w:trHeight w:val="432" w:hRule="exact"/>
+          <w:cantSplit/>
+        </w:trPr>
+        <w:tc>
+          <w:tcPr>
+            <w:tcW w:type="dxa" w:w="10080"/>
+            <w:tcBorders>
+              <w:top w:val="single" w:sz="4" w:color="808080" w:space="0"/>
+              <w:left w:val="single" w:sz="10" w:color="000000" w:space="0"/>
+              <w:bottom w:val="single" w:sz="4" w:color="808080" w:space="0"/>
+              <w:right w:val="single" w:sz="10" w:color="000000" w:space="0"/>
+            </w:tcBorders>
+          </w:tcPr>
+          <w:p>
+            <w:pPr>
+              <w:keepNext/>
+              <w:spacing w:after="0"/>
+            </w:pPr>
+          </w:p>
+        </w:tc>
+      </w:tr>
+      <w:tr>
+        <w:trPr>
+          <w:trHeight w:val="432" w:hRule="exact"/>
+          <w:cantSplit/>
+        </w:trPr>
+        <w:tc>
+          <w:tcPr>
+            <w:tcW w:type="dxa" w:w="10080"/>
+            <w:tcBorders>
+              <w:top w:val="single" w:sz="4" w:color="808080" w:space="0"/>
+              <w:left w:val="single" w:sz="10" w:color="000000" w:space="0"/>
+              <w:bottom w:val="single" w:sz="4" w:color="808080" w:space="0"/>
+              <w:right w:val="single" w:sz="10" w:color="000000" w:space="0"/>
+            </w:tcBorders>
+          </w:tcPr>
+          <w:p>
+            <w:pPr>
+              <w:keepNext/>
+              <w:spacing w:after="0"/>
+            </w:pPr>
+          </w:p>
+        </w:tc>
+      </w:tr>
+      <w:tr>
+        <w:trPr>
+          <w:trHeight w:val="432" w:hRule="exact"/>
+          <w:cantSplit/>
+        </w:trPr>
+        <w:tc>
+          <w:tcPr>
+            <w:tcW w:type="dxa" w:w="10080"/>
+            <w:tcBorders>
+              <w:top w:val="single" w:sz="4" w:color="808080" w:space="0"/>
+              <w:left w:val="single" w:sz="10" w:color="000000" w:space="0"/>
+              <w:bottom w:val="single" w:sz="4" w:color="808080" w:space="0"/>
+              <w:right w:val="single" w:sz="10" w:color="000000" w:space="0"/>
+            </w:tcBorders>
+          </w:tcPr>
+          <w:p>
+            <w:pPr>
+              <w:keepNext/>
+              <w:spacing w:after="0"/>
+            </w:pPr>
+          </w:p>
+        </w:tc>
+      </w:tr>
+      <w:tr>
+        <w:trPr>
+          <w:trHeight w:val="432" w:hRule="exact"/>
+          <w:cantSplit/>
+        </w:trPr>
+        <w:tc>
+          <w:tcPr>
+            <w:tcW w:type="dxa" w:w="10080"/>
+            <w:tcBorders>
+              <w:top w:val="single" w:sz="4" w:color="808080" w:space="0"/>
+              <w:left w:val="single" w:sz="10" w:color="000000" w:space="0"/>
+              <w:bottom w:val="single" w:sz="4" w:color="808080" w:space="0"/>
+              <w:right w:val="single" w:sz="10" w:color="000000" w:space="0"/>
+            </w:tcBorders>
+          </w:tcPr>
+          <w:p>
+            <w:pPr>
+              <w:keepNext/>
+              <w:spacing w:after="0"/>
+            </w:pPr>
+          </w:p>
+        </w:tc>
+      </w:tr>
+      <w:tr>
+        <w:trPr>
+          <w:trHeight w:val="432" w:hRule="exact"/>
+          <w:cantSplit/>
+        </w:trPr>
+        <w:tc>
+          <w:tcPr>
+            <w:tcW w:type="dxa" w:w="10080"/>
+            <w:tcBorders>
+              <w:top w:val="single" w:sz="4" w:color="808080" w:space="0"/>
+              <w:left w:val="single" w:sz="10" w:color="000000" w:space="0"/>
+              <w:bottom w:val="single" w:sz="4" w:color="808080" w:space="0"/>
+              <w:right w:val="single" w:sz="10" w:color="000000" w:space="0"/>
+            </w:tcBorders>
+          </w:tcPr>
+          <w:p>
+            <w:pPr>
+              <w:keepNext/>
+              <w:spacing w:after="0"/>
+            </w:pPr>
+          </w:p>
+        </w:tc>
+      </w:tr>
+      <w:tr>
+        <w:trPr>
+          <w:trHeight w:val="432" w:hRule="exact"/>
+          <w:cantSplit/>
+        </w:trPr>
+        <w:tc>
+          <w:tcPr>
+            <w:tcW w:type="dxa" w:w="10080"/>
+            <w:tcBorders>
+              <w:top w:val="single" w:sz="4" w:color="808080" w:space="0"/>
+              <w:left w:val="single" w:sz="10" w:color="000000" w:space="0"/>
+              <w:bottom w:val="single" w:sz="4" w:color="808080" w:space="0"/>
+              <w:right w:val="single" w:sz="10" w:color="000000" w:space="0"/>
+            </w:tcBorders>
+          </w:tcPr>
+          <w:p>
+            <w:pPr>
+              <w:keepNext/>
+              <w:spacing w:after="0"/>
+            </w:pPr>
+          </w:p>
+        </w:tc>
+      </w:tr>
+      <w:tr>
+        <w:trPr>
+          <w:trHeight w:val="432" w:hRule="exact"/>
+          <w:cantSplit/>
+        </w:trPr>
+        <w:tc>
+          <w:tcPr>
+            <w:tcW w:type="dxa" w:w="10080"/>
+            <w:tcBorders>
+              <w:top w:val="single" w:sz="4" w:color="808080" w:space="0"/>
+              <w:left w:val="single" w:sz="10" w:color="000000" w:space="0"/>
+              <w:bottom w:val="single" w:sz="4" w:color="808080" w:space="0"/>
+              <w:right w:val="single" w:sz="10" w:color="000000" w:space="0"/>
+            </w:tcBorders>
+          </w:tcPr>
+          <w:p>
+            <w:pPr>
+              <w:keepNext/>
+              <w:spacing w:after="0"/>
+            </w:pPr>
+          </w:p>
+        </w:tc>
+      </w:tr>
+      <w:tr>
+        <w:trPr>
+          <w:trHeight w:val="432" w:hRule="exact"/>
+          <w:cantSplit/>
+        </w:trPr>
+        <w:tc>
+          <w:tcPr>
+            <w:tcW w:type="dxa" w:w="10080"/>
+            <w:tcBorders>
+              <w:top w:val="single" w:sz="4" w:color="808080" w:space="0"/>
+              <w:left w:val="single" w:sz="10" w:color="000000" w:space="0"/>
+              <w:bottom w:val="single" w:sz="4" w:color="808080" w:space="0"/>
+              <w:right w:val="single" w:sz="10" w:color="000000" w:space="0"/>
+            </w:tcBorders>
+          </w:tcPr>
+          <w:p>
+            <w:pPr>
+              <w:keepNext/>
+              <w:spacing w:after="0"/>
+            </w:pPr>
+          </w:p>
+        </w:tc>
+      </w:tr>
+      <w:tr>
+        <w:trPr>
+          <w:trHeight w:val="432" w:hRule="exact"/>
+          <w:cantSplit/>
+        </w:trPr>
+        <w:tc>
+          <w:tcPr>
+            <w:tcW w:type="dxa" w:w="10080"/>
+            <w:tcBorders>
+              <w:top w:val="single" w:sz="4" w:color="808080" w:space="0"/>
+              <w:left w:val="single" w:sz="10" w:color="000000" w:space="0"/>
+              <w:bottom w:val="single" w:sz="4" w:color="808080" w:space="0"/>
+              <w:right w:val="single" w:sz="10" w:color="000000" w:space="0"/>
+            </w:tcBorders>
+          </w:tcPr>
+          <w:p>
+            <w:pPr>
+              <w:keepNext/>
+              <w:spacing w:after="0"/>
+            </w:pPr>
+          </w:p>
+        </w:tc>
+      </w:tr>
+      <w:tr>
+        <w:trPr>
+          <w:trHeight w:val="432" w:hRule="exact"/>
+          <w:cantSplit/>
+        </w:trPr>
+        <w:tc>
+          <w:tcPr>
+            <w:tcW w:type="dxa" w:w="10080"/>
+            <w:tcBorders>
+              <w:top w:val="single" w:sz="4" w:color="808080" w:space="0"/>
+              <w:left w:val="single" w:sz="10" w:color="000000" w:space="0"/>
+              <w:bottom w:val="single" w:sz="4" w:color="808080" w:space="0"/>
+              <w:right w:val="single" w:sz="10" w:color="000000" w:space="0"/>
+            </w:tcBorders>
+          </w:tcPr>
+          <w:p>
+            <w:pPr>
+              <w:keepNext/>
+              <w:spacing w:after="0"/>
+            </w:pPr>
+          </w:p>
+        </w:tc>
+      </w:tr>
+      <w:tr>
+        <w:trPr>
+          <w:trHeight w:val="432" w:hRule="exact"/>
+          <w:cantSplit/>
+        </w:trPr>
+        <w:tc>
+          <w:tcPr>
+            <w:tcW w:type="dxa" w:w="10080"/>
+            <w:tcBorders>
+              <w:top w:val="single" w:sz="4" w:color="808080" w:space="0"/>
+              <w:left w:val="single" w:sz="10" w:color="000000" w:space="0"/>
               <w:bottom w:val="single" w:sz="10" w:color="000000" w:space="0"/>
               <w:right w:val="single" w:sz="10" w:color="000000" w:space="0"/>
             </w:tcBorders>
@@ -4884,52 +5006,6 @@
             <w:tcW w:type="dxa" w:w="10080"/>
             <w:tcBorders>
               <w:top w:val="single" w:sz="10" w:color="000000" w:space="0"/>
-              <w:left w:val="single" w:sz="10" w:color="000000" w:space="0"/>
-              <w:bottom w:val="single" w:sz="4" w:color="808080" w:space="0"/>
-              <w:right w:val="single" w:sz="10" w:color="000000" w:space="0"/>
-            </w:tcBorders>
-          </w:tcPr>
-          <w:p>
-            <w:pPr>
-              <w:keepNext/>
-              <w:spacing w:after="0"/>
-            </w:pPr>
-          </w:p>
-        </w:tc>
-      </w:tr>
-      <w:tr>
-        <w:trPr>
-          <w:trHeight w:val="432" w:hRule="exact"/>
-          <w:cantSplit/>
-        </w:trPr>
-        <w:tc>
-          <w:tcPr>
-            <w:tcW w:type="dxa" w:w="10080"/>
-            <w:tcBorders>
-              <w:top w:val="single" w:sz="4" w:color="808080" w:space="0"/>
-              <w:left w:val="single" w:sz="10" w:color="000000" w:space="0"/>
-              <w:bottom w:val="single" w:sz="4" w:color="808080" w:space="0"/>
-              <w:right w:val="single" w:sz="10" w:color="000000" w:space="0"/>
-            </w:tcBorders>
-          </w:tcPr>
-          <w:p>
-            <w:pPr>
-              <w:keepNext/>
-              <w:spacing w:after="0"/>
-            </w:pPr>
-          </w:p>
-        </w:tc>
-      </w:tr>
-      <w:tr>
-        <w:trPr>
-          <w:trHeight w:val="432" w:hRule="exact"/>
-          <w:cantSplit/>
-        </w:trPr>
-        <w:tc>
-          <w:tcPr>
-            <w:tcW w:type="dxa" w:w="10080"/>
-            <w:tcBorders>
-              <w:top w:val="single" w:sz="4" w:color="808080" w:space="0"/>
               <w:left w:val="single" w:sz="10" w:color="000000" w:space="0"/>
               <w:bottom w:val="single" w:sz="4" w:color="808080" w:space="0"/>
               <w:right w:val="single" w:sz="10" w:color="000000" w:space="0"/>
@@ -5448,75 +5524,6 @@
             <w:tcBorders>
               <w:top w:val="single" w:sz="4" w:color="808080" w:space="0"/>
               <w:left w:val="single" w:sz="10" w:color="000000" w:space="0"/>
-              <w:bottom w:val="single" w:sz="4" w:color="808080" w:space="0"/>
-              <w:right w:val="single" w:sz="10" w:color="000000" w:space="0"/>
-            </w:tcBorders>
-          </w:tcPr>
-          <w:p>
-            <w:pPr>
-              <w:keepNext/>
-              <w:spacing w:after="0"/>
-            </w:pPr>
-          </w:p>
-        </w:tc>
-      </w:tr>
-      <w:tr>
-        <w:trPr>
-          <w:trHeight w:val="432" w:hRule="exact"/>
-          <w:cantSplit/>
-        </w:trPr>
-        <w:tc>
-          <w:tcPr>
-            <w:tcW w:type="dxa" w:w="10080"/>
-            <w:tcBorders>
-              <w:top w:val="single" w:sz="4" w:color="808080" w:space="0"/>
-              <w:left w:val="single" w:sz="10" w:color="000000" w:space="0"/>
-              <w:bottom w:val="single" w:sz="4" w:color="808080" w:space="0"/>
-              <w:right w:val="single" w:sz="10" w:color="000000" w:space="0"/>
-            </w:tcBorders>
-          </w:tcPr>
-          <w:p>
-            <w:pPr>
-              <w:keepNext/>
-              <w:spacing w:after="0"/>
-            </w:pPr>
-          </w:p>
-        </w:tc>
-      </w:tr>
-      <w:tr>
-        <w:trPr>
-          <w:trHeight w:val="432" w:hRule="exact"/>
-          <w:cantSplit/>
-        </w:trPr>
-        <w:tc>
-          <w:tcPr>
-            <w:tcW w:type="dxa" w:w="10080"/>
-            <w:tcBorders>
-              <w:top w:val="single" w:sz="4" w:color="808080" w:space="0"/>
-              <w:left w:val="single" w:sz="10" w:color="000000" w:space="0"/>
-              <w:bottom w:val="single" w:sz="4" w:color="808080" w:space="0"/>
-              <w:right w:val="single" w:sz="10" w:color="000000" w:space="0"/>
-            </w:tcBorders>
-          </w:tcPr>
-          <w:p>
-            <w:pPr>
-              <w:keepNext/>
-              <w:spacing w:after="0"/>
-            </w:pPr>
-          </w:p>
-        </w:tc>
-      </w:tr>
-      <w:tr>
-        <w:trPr>
-          <w:trHeight w:val="432" w:hRule="exact"/>
-          <w:cantSplit/>
-        </w:trPr>
-        <w:tc>
-          <w:tcPr>
-            <w:tcW w:type="dxa" w:w="10080"/>
-            <w:tcBorders>
-              <w:top w:val="single" w:sz="4" w:color="808080" w:space="0"/>
-              <w:left w:val="single" w:sz="10" w:color="000000" w:space="0"/>
               <w:bottom w:val="single" w:sz="10" w:color="000000" w:space="0"/>
               <w:right w:val="single" w:sz="10" w:color="000000" w:space="0"/>
             </w:tcBorders>

</xml_diff>

<commit_message>
Burn case study: Shift 2 (night 1900-0700) packet and key; weight consistency fix in a note
Co-Authored-By: Claude Sonnet 5.5 <noreply@anthropic.com>
Claude-Session: https://claude.ai/code/session_01BaPRnyq7pWkkksjSCgkfNC
</commit_message>
<xml_diff>
--- a/casestudy/cases/burn_icu/out/CS-BURN-ICU-1_STUDENT.docx
+++ b/casestudy/cases/burn_icu/out/CS-BURN-ICU-1_STUDENT.docx
@@ -5339,6 +5339,4485 @@
             <w:tcW w:type="dxa" w:w="10080"/>
             <w:tcBorders>
               <w:top w:val="single" w:sz="4" w:color="808080" w:space="0"/>
+              <w:left w:val="single" w:sz="10" w:color="000000" w:space="0"/>
+              <w:bottom w:val="single" w:sz="4" w:color="808080" w:space="0"/>
+              <w:right w:val="single" w:sz="10" w:color="000000" w:space="0"/>
+            </w:tcBorders>
+          </w:tcPr>
+          <w:p>
+            <w:pPr>
+              <w:keepNext/>
+              <w:spacing w:after="0"/>
+            </w:pPr>
+          </w:p>
+        </w:tc>
+      </w:tr>
+      <w:tr>
+        <w:trPr>
+          <w:trHeight w:val="432" w:hRule="exact"/>
+          <w:cantSplit/>
+        </w:trPr>
+        <w:tc>
+          <w:tcPr>
+            <w:tcW w:type="dxa" w:w="10080"/>
+            <w:tcBorders>
+              <w:top w:val="single" w:sz="4" w:color="808080" w:space="0"/>
+              <w:left w:val="single" w:sz="10" w:color="000000" w:space="0"/>
+              <w:bottom w:val="single" w:sz="4" w:color="808080" w:space="0"/>
+              <w:right w:val="single" w:sz="10" w:color="000000" w:space="0"/>
+            </w:tcBorders>
+          </w:tcPr>
+          <w:p>
+            <w:pPr>
+              <w:keepNext/>
+              <w:spacing w:after="0"/>
+            </w:pPr>
+          </w:p>
+        </w:tc>
+      </w:tr>
+      <w:tr>
+        <w:trPr>
+          <w:trHeight w:val="432" w:hRule="exact"/>
+          <w:cantSplit/>
+        </w:trPr>
+        <w:tc>
+          <w:tcPr>
+            <w:tcW w:type="dxa" w:w="10080"/>
+            <w:tcBorders>
+              <w:top w:val="single" w:sz="4" w:color="808080" w:space="0"/>
+              <w:left w:val="single" w:sz="10" w:color="000000" w:space="0"/>
+              <w:bottom w:val="single" w:sz="4" w:color="808080" w:space="0"/>
+              <w:right w:val="single" w:sz="10" w:color="000000" w:space="0"/>
+            </w:tcBorders>
+          </w:tcPr>
+          <w:p>
+            <w:pPr>
+              <w:keepNext/>
+              <w:spacing w:after="0"/>
+            </w:pPr>
+          </w:p>
+        </w:tc>
+      </w:tr>
+      <w:tr>
+        <w:trPr>
+          <w:trHeight w:val="432" w:hRule="exact"/>
+          <w:cantSplit/>
+        </w:trPr>
+        <w:tc>
+          <w:tcPr>
+            <w:tcW w:type="dxa" w:w="10080"/>
+            <w:tcBorders>
+              <w:top w:val="single" w:sz="4" w:color="808080" w:space="0"/>
+              <w:left w:val="single" w:sz="10" w:color="000000" w:space="0"/>
+              <w:bottom w:val="single" w:sz="4" w:color="808080" w:space="0"/>
+              <w:right w:val="single" w:sz="10" w:color="000000" w:space="0"/>
+            </w:tcBorders>
+          </w:tcPr>
+          <w:p>
+            <w:pPr>
+              <w:keepNext/>
+              <w:spacing w:after="0"/>
+            </w:pPr>
+          </w:p>
+        </w:tc>
+      </w:tr>
+      <w:tr>
+        <w:trPr>
+          <w:trHeight w:val="432" w:hRule="exact"/>
+          <w:cantSplit/>
+        </w:trPr>
+        <w:tc>
+          <w:tcPr>
+            <w:tcW w:type="dxa" w:w="10080"/>
+            <w:tcBorders>
+              <w:top w:val="single" w:sz="4" w:color="808080" w:space="0"/>
+              <w:left w:val="single" w:sz="10" w:color="000000" w:space="0"/>
+              <w:bottom w:val="single" w:sz="4" w:color="808080" w:space="0"/>
+              <w:right w:val="single" w:sz="10" w:color="000000" w:space="0"/>
+            </w:tcBorders>
+          </w:tcPr>
+          <w:p>
+            <w:pPr>
+              <w:keepNext/>
+              <w:spacing w:after="0"/>
+            </w:pPr>
+          </w:p>
+        </w:tc>
+      </w:tr>
+      <w:tr>
+        <w:trPr>
+          <w:trHeight w:val="432" w:hRule="exact"/>
+          <w:cantSplit/>
+        </w:trPr>
+        <w:tc>
+          <w:tcPr>
+            <w:tcW w:type="dxa" w:w="10080"/>
+            <w:tcBorders>
+              <w:top w:val="single" w:sz="4" w:color="808080" w:space="0"/>
+              <w:left w:val="single" w:sz="10" w:color="000000" w:space="0"/>
+              <w:bottom w:val="single" w:sz="4" w:color="808080" w:space="0"/>
+              <w:right w:val="single" w:sz="10" w:color="000000" w:space="0"/>
+            </w:tcBorders>
+          </w:tcPr>
+          <w:p>
+            <w:pPr>
+              <w:keepNext/>
+              <w:spacing w:after="0"/>
+            </w:pPr>
+          </w:p>
+        </w:tc>
+      </w:tr>
+      <w:tr>
+        <w:trPr>
+          <w:trHeight w:val="432" w:hRule="exact"/>
+          <w:cantSplit/>
+        </w:trPr>
+        <w:tc>
+          <w:tcPr>
+            <w:tcW w:type="dxa" w:w="10080"/>
+            <w:tcBorders>
+              <w:top w:val="single" w:sz="4" w:color="808080" w:space="0"/>
+              <w:left w:val="single" w:sz="10" w:color="000000" w:space="0"/>
+              <w:bottom w:val="single" w:sz="4" w:color="808080" w:space="0"/>
+              <w:right w:val="single" w:sz="10" w:color="000000" w:space="0"/>
+            </w:tcBorders>
+          </w:tcPr>
+          <w:p>
+            <w:pPr>
+              <w:keepNext/>
+              <w:spacing w:after="0"/>
+            </w:pPr>
+          </w:p>
+        </w:tc>
+      </w:tr>
+      <w:tr>
+        <w:trPr>
+          <w:trHeight w:val="432" w:hRule="exact"/>
+          <w:cantSplit/>
+        </w:trPr>
+        <w:tc>
+          <w:tcPr>
+            <w:tcW w:type="dxa" w:w="10080"/>
+            <w:tcBorders>
+              <w:top w:val="single" w:sz="4" w:color="808080" w:space="0"/>
+              <w:left w:val="single" w:sz="10" w:color="000000" w:space="0"/>
+              <w:bottom w:val="single" w:sz="4" w:color="808080" w:space="0"/>
+              <w:right w:val="single" w:sz="10" w:color="000000" w:space="0"/>
+            </w:tcBorders>
+          </w:tcPr>
+          <w:p>
+            <w:pPr>
+              <w:keepNext/>
+              <w:spacing w:after="0"/>
+            </w:pPr>
+          </w:p>
+        </w:tc>
+      </w:tr>
+      <w:tr>
+        <w:trPr>
+          <w:trHeight w:val="432" w:hRule="exact"/>
+          <w:cantSplit/>
+        </w:trPr>
+        <w:tc>
+          <w:tcPr>
+            <w:tcW w:type="dxa" w:w="10080"/>
+            <w:tcBorders>
+              <w:top w:val="single" w:sz="4" w:color="808080" w:space="0"/>
+              <w:left w:val="single" w:sz="10" w:color="000000" w:space="0"/>
+              <w:bottom w:val="single" w:sz="10" w:color="000000" w:space="0"/>
+              <w:right w:val="single" w:sz="10" w:color="000000" w:space="0"/>
+            </w:tcBorders>
+          </w:tcPr>
+          <w:p>
+            <w:pPr>
+              <w:spacing w:after="0"/>
+            </w:pPr>
+          </w:p>
+        </w:tc>
+      </w:tr>
+    </w:tbl>
+    <w:p>
+      <w:pPr>
+        <w:spacing w:before="0" w:after="40"/>
+      </w:pPr>
+    </w:p>
+    <w:p>
+      <w:r>
+        <w:br w:type="page"/>
+      </w:r>
+    </w:p>
+    <w:p>
+      <w:pPr>
+        <w:spacing w:before="0" w:after="0"/>
+      </w:pPr>
+      <w:r>
+        <w:rPr>
+          <w:rFonts w:ascii="Times New Roman" w:hAnsi="Times New Roman" w:eastAsia="Times New Roman"/>
+          <w:b/>
+          <w:i w:val="0"/>
+          <w:sz w:val="30"/>
+        </w:rPr>
+        <w:t>PART 2: SHIFT 2: MONDAY 11/02 1900 TO TUESDAY 11/03 0700 (NIGHT SHIFT)</w:t>
+      </w:r>
+    </w:p>
+    <w:p>
+      <w:pPr>
+        <w:spacing w:before="0" w:after="80"/>
+      </w:pPr>
+      <w:r>
+        <w:rPr>
+          <w:rFonts w:ascii="Times New Roman" w:hAnsi="Times New Roman" w:eastAsia="Times New Roman"/>
+          <w:b w:val="0"/>
+          <w:i/>
+          <w:color w:val="444444"/>
+          <w:sz w:val="20"/>
+        </w:rPr>
+        <w:t>Nursing process step: Night of day 1 to day 2   |   About 60 minutes   |   16 points</w:t>
+      </w:r>
+    </w:p>
+    <w:p>
+      <w:pPr>
+        <w:spacing w:before="0" w:after="80"/>
+      </w:pPr>
+      <w:r>
+        <w:rPr>
+          <w:rFonts w:ascii="Times New Roman" w:hAnsi="Times New Roman" w:eastAsia="Times New Roman"/>
+          <w:b w:val="0"/>
+          <w:i w:val="0"/>
+          <w:sz w:val="22"/>
+        </w:rPr>
+        <w:t>Set the simulation clock to 1900 on Monday 11/02/26. You take report from the day nurse and care for Marcus until you hand off at 0700. Keep reading forward in the chart as the clock moves; do not look past 0700 for this shift.</w:t>
+      </w:r>
+    </w:p>
+    <w:p>
+      <w:pPr>
+        <w:keepNext/>
+        <w:spacing w:before="160" w:after="40"/>
+      </w:pPr>
+      <w:r>
+        <w:rPr>
+          <w:rFonts w:ascii="Times New Roman" w:hAnsi="Times New Roman" w:eastAsia="Times New Roman"/>
+          <w:b/>
+          <w:i w:val="0"/>
+          <w:sz w:val="25"/>
+        </w:rPr>
+        <w:t xml:space="preserve">2.1  </w:t>
+      </w:r>
+      <w:r>
+        <w:rPr>
+          <w:rFonts w:ascii="Times New Roman" w:hAnsi="Times New Roman" w:eastAsia="Times New Roman"/>
+          <w:b/>
+          <w:i w:val="0"/>
+          <w:sz w:val="25"/>
+        </w:rPr>
+        <w:t>Vital Sign Trend Through the Night</w:t>
+      </w:r>
+      <w:r>
+        <w:rPr>
+          <w:rFonts w:ascii="Times New Roman" w:hAnsi="Times New Roman" w:eastAsia="Times New Roman"/>
+          <w:b w:val="0"/>
+          <w:i/>
+          <w:color w:val="444444"/>
+          <w:sz w:val="21"/>
+        </w:rPr>
+        <w:t xml:space="preserve">   (1.5 pts)</w:t>
+      </w:r>
+    </w:p>
+    <w:p>
+      <w:pPr>
+        <w:keepNext/>
+        <w:spacing w:before="0" w:after="40"/>
+      </w:pPr>
+      <w:r>
+        <w:rPr>
+          <w:rFonts w:ascii="Times New Roman" w:hAnsi="Times New Roman" w:eastAsia="Times New Roman"/>
+          <w:b w:val="0"/>
+          <w:i w:val="0"/>
+          <w:sz w:val="23"/>
+        </w:rPr>
+        <w:t>Set the clock to 1900 on Monday. You take report from the day nurse. Copy the vital signs at each time, circle every abnormal value, then write two sentences below: what the night looked like overall, and what the flowsheet does NOT show about the agitation event that happened around 0245.</w:t>
+      </w:r>
+    </w:p>
+    <w:p>
+      <w:pPr>
+        <w:keepNext/>
+        <w:spacing w:before="0" w:after="60"/>
+      </w:pPr>
+      <w:r>
+        <w:rPr>
+          <w:rFonts w:ascii="Times New Roman" w:hAnsi="Times New Roman" w:eastAsia="Times New Roman"/>
+          <w:b w:val="0"/>
+          <w:i/>
+          <w:color w:val="555555"/>
+          <w:sz w:val="19"/>
+        </w:rPr>
+        <w:t>Where to look in the EHR: Flowsheets &gt; Vital Signs</w:t>
+      </w:r>
+    </w:p>
+    <w:tbl>
+      <w:tblPr>
+        <w:tblW w:type="auto" w:w="0"/>
+        <w:jc w:val="center"/>
+        <w:tblLayout w:type="fixed"/>
+        <w:tblLook w:firstColumn="1" w:firstRow="1" w:lastColumn="0" w:lastRow="0" w:noHBand="0" w:noVBand="1" w:val="04A0"/>
+      </w:tblPr>
+      <w:tblGrid>
+        <w:gridCol w:w="2304"/>
+        <w:gridCol w:w="1944"/>
+        <w:gridCol w:w="1944"/>
+        <w:gridCol w:w="1944"/>
+        <w:gridCol w:w="1944"/>
+      </w:tblGrid>
+      <w:tr>
+        <w:tc>
+          <w:tcPr>
+            <w:tcW w:type="dxa" w:w="2304"/>
+            <w:shd w:val="clear" w:color="auto" w:fill="D9D9D9"/>
+            <w:tcBorders>
+              <w:top w:val="single" w:sz="10" w:color="000000" w:space="0"/>
+              <w:left w:val="single" w:sz="10" w:color="000000" w:space="0"/>
+              <w:bottom w:val="single" w:sz="10" w:color="000000" w:space="0"/>
+              <w:right w:val="single" w:sz="10" w:color="000000" w:space="0"/>
+            </w:tcBorders>
+          </w:tcPr>
+          <w:p>
+            <w:pPr>
+              <w:spacing w:after="0" w:before="0"/>
+            </w:pPr>
+            <w:r/>
+            <w:r>
+              <w:rPr>
+                <w:rFonts w:ascii="Times New Roman" w:hAnsi="Times New Roman" w:eastAsia="Times New Roman"/>
+                <w:b/>
+                <w:i w:val="0"/>
+                <w:sz w:val="19"/>
+              </w:rPr>
+              <w:t>Vital sign</w:t>
+            </w:r>
+          </w:p>
+        </w:tc>
+        <w:tc>
+          <w:tcPr>
+            <w:tcW w:type="dxa" w:w="1944"/>
+            <w:shd w:val="clear" w:color="auto" w:fill="D9D9D9"/>
+            <w:tcBorders>
+              <w:top w:val="single" w:sz="10" w:color="000000" w:space="0"/>
+              <w:left w:val="single" w:sz="10" w:color="000000" w:space="0"/>
+              <w:bottom w:val="single" w:sz="10" w:color="000000" w:space="0"/>
+              <w:right w:val="single" w:sz="10" w:color="000000" w:space="0"/>
+            </w:tcBorders>
+          </w:tcPr>
+          <w:p>
+            <w:pPr>
+              <w:spacing w:after="0" w:before="0"/>
+            </w:pPr>
+            <w:r/>
+            <w:r>
+              <w:rPr>
+                <w:rFonts w:ascii="Times New Roman" w:hAnsi="Times New Roman" w:eastAsia="Times New Roman"/>
+                <w:b/>
+                <w:i w:val="0"/>
+                <w:sz w:val="19"/>
+              </w:rPr>
+              <w:t>Mon 1900</w:t>
+            </w:r>
+          </w:p>
+        </w:tc>
+        <w:tc>
+          <w:tcPr>
+            <w:tcW w:type="dxa" w:w="1944"/>
+            <w:shd w:val="clear" w:color="auto" w:fill="D9D9D9"/>
+            <w:tcBorders>
+              <w:top w:val="single" w:sz="10" w:color="000000" w:space="0"/>
+              <w:left w:val="single" w:sz="10" w:color="000000" w:space="0"/>
+              <w:bottom w:val="single" w:sz="10" w:color="000000" w:space="0"/>
+              <w:right w:val="single" w:sz="10" w:color="000000" w:space="0"/>
+            </w:tcBorders>
+          </w:tcPr>
+          <w:p>
+            <w:pPr>
+              <w:spacing w:after="0" w:before="0"/>
+            </w:pPr>
+            <w:r/>
+            <w:r>
+              <w:rPr>
+                <w:rFonts w:ascii="Times New Roman" w:hAnsi="Times New Roman" w:eastAsia="Times New Roman"/>
+                <w:b/>
+                <w:i w:val="0"/>
+                <w:sz w:val="19"/>
+              </w:rPr>
+              <w:t>Mon 2300</w:t>
+            </w:r>
+          </w:p>
+        </w:tc>
+        <w:tc>
+          <w:tcPr>
+            <w:tcW w:type="dxa" w:w="1944"/>
+            <w:shd w:val="clear" w:color="auto" w:fill="D9D9D9"/>
+            <w:tcBorders>
+              <w:top w:val="single" w:sz="10" w:color="000000" w:space="0"/>
+              <w:left w:val="single" w:sz="10" w:color="000000" w:space="0"/>
+              <w:bottom w:val="single" w:sz="10" w:color="000000" w:space="0"/>
+              <w:right w:val="single" w:sz="10" w:color="000000" w:space="0"/>
+            </w:tcBorders>
+          </w:tcPr>
+          <w:p>
+            <w:pPr>
+              <w:spacing w:after="0" w:before="0"/>
+            </w:pPr>
+            <w:r/>
+            <w:r>
+              <w:rPr>
+                <w:rFonts w:ascii="Times New Roman" w:hAnsi="Times New Roman" w:eastAsia="Times New Roman"/>
+                <w:b/>
+                <w:i w:val="0"/>
+                <w:sz w:val="19"/>
+              </w:rPr>
+              <w:t>Tue 0300</w:t>
+            </w:r>
+          </w:p>
+        </w:tc>
+        <w:tc>
+          <w:tcPr>
+            <w:tcW w:type="dxa" w:w="1944"/>
+            <w:shd w:val="clear" w:color="auto" w:fill="D9D9D9"/>
+            <w:tcBorders>
+              <w:top w:val="single" w:sz="10" w:color="000000" w:space="0"/>
+              <w:left w:val="single" w:sz="10" w:color="000000" w:space="0"/>
+              <w:bottom w:val="single" w:sz="10" w:color="000000" w:space="0"/>
+              <w:right w:val="single" w:sz="10" w:color="000000" w:space="0"/>
+            </w:tcBorders>
+          </w:tcPr>
+          <w:p>
+            <w:pPr>
+              <w:spacing w:after="0" w:before="0"/>
+            </w:pPr>
+            <w:r/>
+            <w:r>
+              <w:rPr>
+                <w:rFonts w:ascii="Times New Roman" w:hAnsi="Times New Roman" w:eastAsia="Times New Roman"/>
+                <w:b/>
+                <w:i w:val="0"/>
+                <w:sz w:val="19"/>
+              </w:rPr>
+              <w:t>Tue 0700</w:t>
+            </w:r>
+          </w:p>
+        </w:tc>
+      </w:tr>
+      <w:tr>
+        <w:trPr>
+          <w:trHeight w:val="605" w:hRule="atLeast"/>
+          <w:cantSplit/>
+        </w:trPr>
+        <w:tc>
+          <w:tcPr>
+            <w:tcW w:type="dxa" w:w="2304"/>
+            <w:tcBorders>
+              <w:top w:val="single" w:sz="10" w:color="000000" w:space="0"/>
+              <w:left w:val="single" w:sz="10" w:color="000000" w:space="0"/>
+              <w:bottom w:val="single" w:sz="10" w:color="000000" w:space="0"/>
+              <w:right w:val="single" w:sz="10" w:color="000000" w:space="0"/>
+            </w:tcBorders>
+          </w:tcPr>
+          <w:p>
+            <w:pPr>
+              <w:spacing w:after="0" w:before="0"/>
+            </w:pPr>
+            <w:r/>
+            <w:r>
+              <w:rPr>
+                <w:rFonts w:ascii="Times New Roman" w:hAnsi="Times New Roman" w:eastAsia="Times New Roman"/>
+                <w:b/>
+                <w:i w:val="0"/>
+                <w:sz w:val="20"/>
+              </w:rPr>
+              <w:t>Temperature</w:t>
+            </w:r>
+          </w:p>
+        </w:tc>
+        <w:tc>
+          <w:tcPr>
+            <w:tcW w:type="dxa" w:w="1944"/>
+            <w:tcBorders>
+              <w:top w:val="single" w:sz="10" w:color="000000" w:space="0"/>
+              <w:left w:val="single" w:sz="10" w:color="000000" w:space="0"/>
+              <w:bottom w:val="single" w:sz="10" w:color="000000" w:space="0"/>
+              <w:right w:val="single" w:sz="10" w:color="000000" w:space="0"/>
+            </w:tcBorders>
+          </w:tcPr>
+          <w:p/>
+        </w:tc>
+        <w:tc>
+          <w:tcPr>
+            <w:tcW w:type="dxa" w:w="1944"/>
+            <w:tcBorders>
+              <w:top w:val="single" w:sz="10" w:color="000000" w:space="0"/>
+              <w:left w:val="single" w:sz="10" w:color="000000" w:space="0"/>
+              <w:bottom w:val="single" w:sz="10" w:color="000000" w:space="0"/>
+              <w:right w:val="single" w:sz="10" w:color="000000" w:space="0"/>
+            </w:tcBorders>
+          </w:tcPr>
+          <w:p/>
+        </w:tc>
+        <w:tc>
+          <w:tcPr>
+            <w:tcW w:type="dxa" w:w="1944"/>
+            <w:tcBorders>
+              <w:top w:val="single" w:sz="10" w:color="000000" w:space="0"/>
+              <w:left w:val="single" w:sz="10" w:color="000000" w:space="0"/>
+              <w:bottom w:val="single" w:sz="10" w:color="000000" w:space="0"/>
+              <w:right w:val="single" w:sz="10" w:color="000000" w:space="0"/>
+            </w:tcBorders>
+          </w:tcPr>
+          <w:p/>
+        </w:tc>
+        <w:tc>
+          <w:tcPr>
+            <w:tcW w:type="dxa" w:w="1944"/>
+            <w:tcBorders>
+              <w:top w:val="single" w:sz="10" w:color="000000" w:space="0"/>
+              <w:left w:val="single" w:sz="10" w:color="000000" w:space="0"/>
+              <w:bottom w:val="single" w:sz="10" w:color="000000" w:space="0"/>
+              <w:right w:val="single" w:sz="10" w:color="000000" w:space="0"/>
+            </w:tcBorders>
+          </w:tcPr>
+          <w:p/>
+        </w:tc>
+      </w:tr>
+      <w:tr>
+        <w:trPr>
+          <w:trHeight w:val="605" w:hRule="atLeast"/>
+          <w:cantSplit/>
+        </w:trPr>
+        <w:tc>
+          <w:tcPr>
+            <w:tcW w:type="dxa" w:w="2304"/>
+            <w:tcBorders>
+              <w:top w:val="single" w:sz="10" w:color="000000" w:space="0"/>
+              <w:left w:val="single" w:sz="10" w:color="000000" w:space="0"/>
+              <w:bottom w:val="single" w:sz="10" w:color="000000" w:space="0"/>
+              <w:right w:val="single" w:sz="10" w:color="000000" w:space="0"/>
+            </w:tcBorders>
+          </w:tcPr>
+          <w:p>
+            <w:pPr>
+              <w:spacing w:after="0" w:before="0"/>
+            </w:pPr>
+            <w:r/>
+            <w:r>
+              <w:rPr>
+                <w:rFonts w:ascii="Times New Roman" w:hAnsi="Times New Roman" w:eastAsia="Times New Roman"/>
+                <w:b/>
+                <w:i w:val="0"/>
+                <w:sz w:val="20"/>
+              </w:rPr>
+              <w:t>Heart rate</w:t>
+            </w:r>
+          </w:p>
+        </w:tc>
+        <w:tc>
+          <w:tcPr>
+            <w:tcW w:type="dxa" w:w="1944"/>
+            <w:tcBorders>
+              <w:top w:val="single" w:sz="10" w:color="000000" w:space="0"/>
+              <w:left w:val="single" w:sz="10" w:color="000000" w:space="0"/>
+              <w:bottom w:val="single" w:sz="10" w:color="000000" w:space="0"/>
+              <w:right w:val="single" w:sz="10" w:color="000000" w:space="0"/>
+            </w:tcBorders>
+          </w:tcPr>
+          <w:p/>
+        </w:tc>
+        <w:tc>
+          <w:tcPr>
+            <w:tcW w:type="dxa" w:w="1944"/>
+            <w:tcBorders>
+              <w:top w:val="single" w:sz="10" w:color="000000" w:space="0"/>
+              <w:left w:val="single" w:sz="10" w:color="000000" w:space="0"/>
+              <w:bottom w:val="single" w:sz="10" w:color="000000" w:space="0"/>
+              <w:right w:val="single" w:sz="10" w:color="000000" w:space="0"/>
+            </w:tcBorders>
+          </w:tcPr>
+          <w:p/>
+        </w:tc>
+        <w:tc>
+          <w:tcPr>
+            <w:tcW w:type="dxa" w:w="1944"/>
+            <w:tcBorders>
+              <w:top w:val="single" w:sz="10" w:color="000000" w:space="0"/>
+              <w:left w:val="single" w:sz="10" w:color="000000" w:space="0"/>
+              <w:bottom w:val="single" w:sz="10" w:color="000000" w:space="0"/>
+              <w:right w:val="single" w:sz="10" w:color="000000" w:space="0"/>
+            </w:tcBorders>
+          </w:tcPr>
+          <w:p/>
+        </w:tc>
+        <w:tc>
+          <w:tcPr>
+            <w:tcW w:type="dxa" w:w="1944"/>
+            <w:tcBorders>
+              <w:top w:val="single" w:sz="10" w:color="000000" w:space="0"/>
+              <w:left w:val="single" w:sz="10" w:color="000000" w:space="0"/>
+              <w:bottom w:val="single" w:sz="10" w:color="000000" w:space="0"/>
+              <w:right w:val="single" w:sz="10" w:color="000000" w:space="0"/>
+            </w:tcBorders>
+          </w:tcPr>
+          <w:p/>
+        </w:tc>
+      </w:tr>
+      <w:tr>
+        <w:trPr>
+          <w:trHeight w:val="605" w:hRule="atLeast"/>
+          <w:cantSplit/>
+        </w:trPr>
+        <w:tc>
+          <w:tcPr>
+            <w:tcW w:type="dxa" w:w="2304"/>
+            <w:tcBorders>
+              <w:top w:val="single" w:sz="10" w:color="000000" w:space="0"/>
+              <w:left w:val="single" w:sz="10" w:color="000000" w:space="0"/>
+              <w:bottom w:val="single" w:sz="10" w:color="000000" w:space="0"/>
+              <w:right w:val="single" w:sz="10" w:color="000000" w:space="0"/>
+            </w:tcBorders>
+          </w:tcPr>
+          <w:p>
+            <w:pPr>
+              <w:spacing w:after="0" w:before="0"/>
+            </w:pPr>
+            <w:r/>
+            <w:r>
+              <w:rPr>
+                <w:rFonts w:ascii="Times New Roman" w:hAnsi="Times New Roman" w:eastAsia="Times New Roman"/>
+                <w:b/>
+                <w:i w:val="0"/>
+                <w:sz w:val="20"/>
+              </w:rPr>
+              <w:t>Blood pressure</w:t>
+            </w:r>
+          </w:p>
+        </w:tc>
+        <w:tc>
+          <w:tcPr>
+            <w:tcW w:type="dxa" w:w="1944"/>
+            <w:tcBorders>
+              <w:top w:val="single" w:sz="10" w:color="000000" w:space="0"/>
+              <w:left w:val="single" w:sz="10" w:color="000000" w:space="0"/>
+              <w:bottom w:val="single" w:sz="10" w:color="000000" w:space="0"/>
+              <w:right w:val="single" w:sz="10" w:color="000000" w:space="0"/>
+            </w:tcBorders>
+          </w:tcPr>
+          <w:p/>
+        </w:tc>
+        <w:tc>
+          <w:tcPr>
+            <w:tcW w:type="dxa" w:w="1944"/>
+            <w:tcBorders>
+              <w:top w:val="single" w:sz="10" w:color="000000" w:space="0"/>
+              <w:left w:val="single" w:sz="10" w:color="000000" w:space="0"/>
+              <w:bottom w:val="single" w:sz="10" w:color="000000" w:space="0"/>
+              <w:right w:val="single" w:sz="10" w:color="000000" w:space="0"/>
+            </w:tcBorders>
+          </w:tcPr>
+          <w:p/>
+        </w:tc>
+        <w:tc>
+          <w:tcPr>
+            <w:tcW w:type="dxa" w:w="1944"/>
+            <w:tcBorders>
+              <w:top w:val="single" w:sz="10" w:color="000000" w:space="0"/>
+              <w:left w:val="single" w:sz="10" w:color="000000" w:space="0"/>
+              <w:bottom w:val="single" w:sz="10" w:color="000000" w:space="0"/>
+              <w:right w:val="single" w:sz="10" w:color="000000" w:space="0"/>
+            </w:tcBorders>
+          </w:tcPr>
+          <w:p/>
+        </w:tc>
+        <w:tc>
+          <w:tcPr>
+            <w:tcW w:type="dxa" w:w="1944"/>
+            <w:tcBorders>
+              <w:top w:val="single" w:sz="10" w:color="000000" w:space="0"/>
+              <w:left w:val="single" w:sz="10" w:color="000000" w:space="0"/>
+              <w:bottom w:val="single" w:sz="10" w:color="000000" w:space="0"/>
+              <w:right w:val="single" w:sz="10" w:color="000000" w:space="0"/>
+            </w:tcBorders>
+          </w:tcPr>
+          <w:p/>
+        </w:tc>
+      </w:tr>
+      <w:tr>
+        <w:trPr>
+          <w:trHeight w:val="605" w:hRule="atLeast"/>
+          <w:cantSplit/>
+        </w:trPr>
+        <w:tc>
+          <w:tcPr>
+            <w:tcW w:type="dxa" w:w="2304"/>
+            <w:tcBorders>
+              <w:top w:val="single" w:sz="10" w:color="000000" w:space="0"/>
+              <w:left w:val="single" w:sz="10" w:color="000000" w:space="0"/>
+              <w:bottom w:val="single" w:sz="10" w:color="000000" w:space="0"/>
+              <w:right w:val="single" w:sz="10" w:color="000000" w:space="0"/>
+            </w:tcBorders>
+          </w:tcPr>
+          <w:p>
+            <w:pPr>
+              <w:spacing w:after="0" w:before="0"/>
+            </w:pPr>
+            <w:r/>
+            <w:r>
+              <w:rPr>
+                <w:rFonts w:ascii="Times New Roman" w:hAnsi="Times New Roman" w:eastAsia="Times New Roman"/>
+                <w:b/>
+                <w:i w:val="0"/>
+                <w:sz w:val="20"/>
+              </w:rPr>
+              <w:t>Respiratory rate</w:t>
+            </w:r>
+          </w:p>
+        </w:tc>
+        <w:tc>
+          <w:tcPr>
+            <w:tcW w:type="dxa" w:w="1944"/>
+            <w:tcBorders>
+              <w:top w:val="single" w:sz="10" w:color="000000" w:space="0"/>
+              <w:left w:val="single" w:sz="10" w:color="000000" w:space="0"/>
+              <w:bottom w:val="single" w:sz="10" w:color="000000" w:space="0"/>
+              <w:right w:val="single" w:sz="10" w:color="000000" w:space="0"/>
+            </w:tcBorders>
+          </w:tcPr>
+          <w:p/>
+        </w:tc>
+        <w:tc>
+          <w:tcPr>
+            <w:tcW w:type="dxa" w:w="1944"/>
+            <w:tcBorders>
+              <w:top w:val="single" w:sz="10" w:color="000000" w:space="0"/>
+              <w:left w:val="single" w:sz="10" w:color="000000" w:space="0"/>
+              <w:bottom w:val="single" w:sz="10" w:color="000000" w:space="0"/>
+              <w:right w:val="single" w:sz="10" w:color="000000" w:space="0"/>
+            </w:tcBorders>
+          </w:tcPr>
+          <w:p/>
+        </w:tc>
+        <w:tc>
+          <w:tcPr>
+            <w:tcW w:type="dxa" w:w="1944"/>
+            <w:tcBorders>
+              <w:top w:val="single" w:sz="10" w:color="000000" w:space="0"/>
+              <w:left w:val="single" w:sz="10" w:color="000000" w:space="0"/>
+              <w:bottom w:val="single" w:sz="10" w:color="000000" w:space="0"/>
+              <w:right w:val="single" w:sz="10" w:color="000000" w:space="0"/>
+            </w:tcBorders>
+          </w:tcPr>
+          <w:p/>
+        </w:tc>
+        <w:tc>
+          <w:tcPr>
+            <w:tcW w:type="dxa" w:w="1944"/>
+            <w:tcBorders>
+              <w:top w:val="single" w:sz="10" w:color="000000" w:space="0"/>
+              <w:left w:val="single" w:sz="10" w:color="000000" w:space="0"/>
+              <w:bottom w:val="single" w:sz="10" w:color="000000" w:space="0"/>
+              <w:right w:val="single" w:sz="10" w:color="000000" w:space="0"/>
+            </w:tcBorders>
+          </w:tcPr>
+          <w:p/>
+        </w:tc>
+      </w:tr>
+      <w:tr>
+        <w:trPr>
+          <w:trHeight w:val="605" w:hRule="atLeast"/>
+          <w:cantSplit/>
+        </w:trPr>
+        <w:tc>
+          <w:tcPr>
+            <w:tcW w:type="dxa" w:w="2304"/>
+            <w:tcBorders>
+              <w:top w:val="single" w:sz="10" w:color="000000" w:space="0"/>
+              <w:left w:val="single" w:sz="10" w:color="000000" w:space="0"/>
+              <w:bottom w:val="single" w:sz="10" w:color="000000" w:space="0"/>
+              <w:right w:val="single" w:sz="10" w:color="000000" w:space="0"/>
+            </w:tcBorders>
+          </w:tcPr>
+          <w:p>
+            <w:pPr>
+              <w:spacing w:after="0" w:before="0"/>
+            </w:pPr>
+            <w:r/>
+            <w:r>
+              <w:rPr>
+                <w:rFonts w:ascii="Times New Roman" w:hAnsi="Times New Roman" w:eastAsia="Times New Roman"/>
+                <w:b/>
+                <w:i w:val="0"/>
+                <w:sz w:val="20"/>
+              </w:rPr>
+              <w:t>SpO2 (%)</w:t>
+            </w:r>
+          </w:p>
+        </w:tc>
+        <w:tc>
+          <w:tcPr>
+            <w:tcW w:type="dxa" w:w="1944"/>
+            <w:tcBorders>
+              <w:top w:val="single" w:sz="10" w:color="000000" w:space="0"/>
+              <w:left w:val="single" w:sz="10" w:color="000000" w:space="0"/>
+              <w:bottom w:val="single" w:sz="10" w:color="000000" w:space="0"/>
+              <w:right w:val="single" w:sz="10" w:color="000000" w:space="0"/>
+            </w:tcBorders>
+          </w:tcPr>
+          <w:p/>
+        </w:tc>
+        <w:tc>
+          <w:tcPr>
+            <w:tcW w:type="dxa" w:w="1944"/>
+            <w:tcBorders>
+              <w:top w:val="single" w:sz="10" w:color="000000" w:space="0"/>
+              <w:left w:val="single" w:sz="10" w:color="000000" w:space="0"/>
+              <w:bottom w:val="single" w:sz="10" w:color="000000" w:space="0"/>
+              <w:right w:val="single" w:sz="10" w:color="000000" w:space="0"/>
+            </w:tcBorders>
+          </w:tcPr>
+          <w:p/>
+        </w:tc>
+        <w:tc>
+          <w:tcPr>
+            <w:tcW w:type="dxa" w:w="1944"/>
+            <w:tcBorders>
+              <w:top w:val="single" w:sz="10" w:color="000000" w:space="0"/>
+              <w:left w:val="single" w:sz="10" w:color="000000" w:space="0"/>
+              <w:bottom w:val="single" w:sz="10" w:color="000000" w:space="0"/>
+              <w:right w:val="single" w:sz="10" w:color="000000" w:space="0"/>
+            </w:tcBorders>
+          </w:tcPr>
+          <w:p/>
+        </w:tc>
+        <w:tc>
+          <w:tcPr>
+            <w:tcW w:type="dxa" w:w="1944"/>
+            <w:tcBorders>
+              <w:top w:val="single" w:sz="10" w:color="000000" w:space="0"/>
+              <w:left w:val="single" w:sz="10" w:color="000000" w:space="0"/>
+              <w:bottom w:val="single" w:sz="10" w:color="000000" w:space="0"/>
+              <w:right w:val="single" w:sz="10" w:color="000000" w:space="0"/>
+            </w:tcBorders>
+          </w:tcPr>
+          <w:p/>
+        </w:tc>
+      </w:tr>
+      <w:tr>
+        <w:trPr>
+          <w:trHeight w:val="605" w:hRule="atLeast"/>
+          <w:cantSplit/>
+        </w:trPr>
+        <w:tc>
+          <w:tcPr>
+            <w:tcW w:type="dxa" w:w="2304"/>
+            <w:tcBorders>
+              <w:top w:val="single" w:sz="10" w:color="000000" w:space="0"/>
+              <w:left w:val="single" w:sz="10" w:color="000000" w:space="0"/>
+              <w:bottom w:val="single" w:sz="10" w:color="000000" w:space="0"/>
+              <w:right w:val="single" w:sz="10" w:color="000000" w:space="0"/>
+            </w:tcBorders>
+          </w:tcPr>
+          <w:p>
+            <w:pPr>
+              <w:spacing w:after="0" w:before="0"/>
+            </w:pPr>
+            <w:r/>
+            <w:r>
+              <w:rPr>
+                <w:rFonts w:ascii="Times New Roman" w:hAnsi="Times New Roman" w:eastAsia="Times New Roman"/>
+                <w:b/>
+                <w:i w:val="0"/>
+                <w:sz w:val="20"/>
+              </w:rPr>
+              <w:t>Pain (CPOT)</w:t>
+            </w:r>
+          </w:p>
+        </w:tc>
+        <w:tc>
+          <w:tcPr>
+            <w:tcW w:type="dxa" w:w="1944"/>
+            <w:tcBorders>
+              <w:top w:val="single" w:sz="10" w:color="000000" w:space="0"/>
+              <w:left w:val="single" w:sz="10" w:color="000000" w:space="0"/>
+              <w:bottom w:val="single" w:sz="10" w:color="000000" w:space="0"/>
+              <w:right w:val="single" w:sz="10" w:color="000000" w:space="0"/>
+            </w:tcBorders>
+          </w:tcPr>
+          <w:p/>
+        </w:tc>
+        <w:tc>
+          <w:tcPr>
+            <w:tcW w:type="dxa" w:w="1944"/>
+            <w:tcBorders>
+              <w:top w:val="single" w:sz="10" w:color="000000" w:space="0"/>
+              <w:left w:val="single" w:sz="10" w:color="000000" w:space="0"/>
+              <w:bottom w:val="single" w:sz="10" w:color="000000" w:space="0"/>
+              <w:right w:val="single" w:sz="10" w:color="000000" w:space="0"/>
+            </w:tcBorders>
+          </w:tcPr>
+          <w:p/>
+        </w:tc>
+        <w:tc>
+          <w:tcPr>
+            <w:tcW w:type="dxa" w:w="1944"/>
+            <w:tcBorders>
+              <w:top w:val="single" w:sz="10" w:color="000000" w:space="0"/>
+              <w:left w:val="single" w:sz="10" w:color="000000" w:space="0"/>
+              <w:bottom w:val="single" w:sz="10" w:color="000000" w:space="0"/>
+              <w:right w:val="single" w:sz="10" w:color="000000" w:space="0"/>
+            </w:tcBorders>
+          </w:tcPr>
+          <w:p/>
+        </w:tc>
+        <w:tc>
+          <w:tcPr>
+            <w:tcW w:type="dxa" w:w="1944"/>
+            <w:tcBorders>
+              <w:top w:val="single" w:sz="10" w:color="000000" w:space="0"/>
+              <w:left w:val="single" w:sz="10" w:color="000000" w:space="0"/>
+              <w:bottom w:val="single" w:sz="10" w:color="000000" w:space="0"/>
+              <w:right w:val="single" w:sz="10" w:color="000000" w:space="0"/>
+            </w:tcBorders>
+          </w:tcPr>
+          <w:p/>
+        </w:tc>
+      </w:tr>
+    </w:tbl>
+    <w:p>
+      <w:pPr>
+        <w:spacing w:before="0" w:after="40"/>
+      </w:pPr>
+    </w:p>
+    <w:tbl>
+      <w:tblPr>
+        <w:tblW w:type="auto" w:w="0"/>
+        <w:jc w:val="center"/>
+        <w:tblLayout w:type="fixed"/>
+        <w:tblLook w:firstColumn="1" w:firstRow="1" w:lastColumn="0" w:lastRow="0" w:noHBand="0" w:noVBand="1" w:val="04A0"/>
+      </w:tblPr>
+      <w:tblGrid>
+        <w:gridCol w:w="10080"/>
+      </w:tblGrid>
+      <w:tr>
+        <w:trPr>
+          <w:trHeight w:val="547" w:hRule="exact"/>
+          <w:cantSplit/>
+        </w:trPr>
+        <w:tc>
+          <w:tcPr>
+            <w:tcW w:type="dxa" w:w="10080"/>
+            <w:tcBorders>
+              <w:top w:val="single" w:sz="10" w:color="000000" w:space="0"/>
+              <w:left w:val="single" w:sz="10" w:color="000000" w:space="0"/>
+              <w:bottom w:val="single" w:sz="10" w:color="000000" w:space="0"/>
+              <w:right w:val="single" w:sz="10" w:color="000000" w:space="0"/>
+            </w:tcBorders>
+          </w:tcPr>
+          <w:p>
+            <w:pPr>
+              <w:spacing w:after="0" w:before="0"/>
+            </w:pPr>
+            <w:r/>
+            <w:r>
+              <w:rPr>
+                <w:rFonts w:ascii="Times New Roman" w:hAnsi="Times New Roman" w:eastAsia="Times New Roman"/>
+                <w:b w:val="0"/>
+                <w:i/>
+                <w:color w:val="888888"/>
+                <w:sz w:val="16"/>
+              </w:rPr>
+              <w:t>Trend in one sentence:</w:t>
+            </w:r>
+          </w:p>
+        </w:tc>
+      </w:tr>
+    </w:tbl>
+    <w:p>
+      <w:pPr>
+        <w:spacing w:before="0" w:after="40"/>
+      </w:pPr>
+    </w:p>
+    <w:p>
+      <w:pPr>
+        <w:keepNext/>
+        <w:spacing w:before="160" w:after="40"/>
+      </w:pPr>
+      <w:r>
+        <w:rPr>
+          <w:rFonts w:ascii="Times New Roman" w:hAnsi="Times New Roman" w:eastAsia="Times New Roman"/>
+          <w:b/>
+          <w:i w:val="0"/>
+          <w:sz w:val="25"/>
+        </w:rPr>
+        <w:t xml:space="preserve">2.1b  </w:t>
+      </w:r>
+      <w:r>
+        <w:rPr>
+          <w:rFonts w:ascii="Times New Roman" w:hAnsi="Times New Roman" w:eastAsia="Times New Roman"/>
+          <w:b/>
+          <w:i w:val="0"/>
+          <w:sz w:val="25"/>
+        </w:rPr>
+        <w:t>Overall night, and what the vitals do not show (scored with 2.1)</w:t>
+      </w:r>
+      <w:r>
+        <w:rPr>
+          <w:rFonts w:ascii="Times New Roman" w:hAnsi="Times New Roman" w:eastAsia="Times New Roman"/>
+          <w:b w:val="0"/>
+          <w:i/>
+          <w:color w:val="444444"/>
+          <w:sz w:val="21"/>
+        </w:rPr>
+        <w:t xml:space="preserve">   (0 pts)</w:t>
+      </w:r>
+    </w:p>
+    <w:tbl>
+      <w:tblPr>
+        <w:tblW w:type="auto" w:w="0"/>
+        <w:jc w:val="center"/>
+        <w:tblLayout w:type="fixed"/>
+        <w:tblLook w:firstColumn="1" w:firstRow="1" w:lastColumn="0" w:lastRow="0" w:noHBand="0" w:noVBand="1" w:val="04A0"/>
+      </w:tblPr>
+      <w:tblGrid>
+        <w:gridCol w:w="10080"/>
+      </w:tblGrid>
+      <w:tr>
+        <w:trPr>
+          <w:trHeight w:val="432" w:hRule="exact"/>
+          <w:cantSplit/>
+        </w:trPr>
+        <w:tc>
+          <w:tcPr>
+            <w:tcW w:type="dxa" w:w="10080"/>
+            <w:tcBorders>
+              <w:top w:val="single" w:sz="10" w:color="000000" w:space="0"/>
+              <w:left w:val="single" w:sz="10" w:color="000000" w:space="0"/>
+              <w:bottom w:val="single" w:sz="4" w:color="808080" w:space="0"/>
+              <w:right w:val="single" w:sz="10" w:color="000000" w:space="0"/>
+            </w:tcBorders>
+          </w:tcPr>
+          <w:p>
+            <w:pPr>
+              <w:keepNext/>
+              <w:spacing w:after="0"/>
+            </w:pPr>
+          </w:p>
+        </w:tc>
+      </w:tr>
+      <w:tr>
+        <w:trPr>
+          <w:trHeight w:val="432" w:hRule="exact"/>
+          <w:cantSplit/>
+        </w:trPr>
+        <w:tc>
+          <w:tcPr>
+            <w:tcW w:type="dxa" w:w="10080"/>
+            <w:tcBorders>
+              <w:top w:val="single" w:sz="4" w:color="808080" w:space="0"/>
+              <w:left w:val="single" w:sz="10" w:color="000000" w:space="0"/>
+              <w:bottom w:val="single" w:sz="4" w:color="808080" w:space="0"/>
+              <w:right w:val="single" w:sz="10" w:color="000000" w:space="0"/>
+            </w:tcBorders>
+          </w:tcPr>
+          <w:p>
+            <w:pPr>
+              <w:keepNext/>
+              <w:spacing w:after="0"/>
+            </w:pPr>
+          </w:p>
+        </w:tc>
+      </w:tr>
+      <w:tr>
+        <w:trPr>
+          <w:trHeight w:val="432" w:hRule="exact"/>
+          <w:cantSplit/>
+        </w:trPr>
+        <w:tc>
+          <w:tcPr>
+            <w:tcW w:type="dxa" w:w="10080"/>
+            <w:tcBorders>
+              <w:top w:val="single" w:sz="4" w:color="808080" w:space="0"/>
+              <w:left w:val="single" w:sz="10" w:color="000000" w:space="0"/>
+              <w:bottom w:val="single" w:sz="4" w:color="808080" w:space="0"/>
+              <w:right w:val="single" w:sz="10" w:color="000000" w:space="0"/>
+            </w:tcBorders>
+          </w:tcPr>
+          <w:p>
+            <w:pPr>
+              <w:keepNext/>
+              <w:spacing w:after="0"/>
+            </w:pPr>
+          </w:p>
+        </w:tc>
+      </w:tr>
+      <w:tr>
+        <w:trPr>
+          <w:trHeight w:val="432" w:hRule="exact"/>
+          <w:cantSplit/>
+        </w:trPr>
+        <w:tc>
+          <w:tcPr>
+            <w:tcW w:type="dxa" w:w="10080"/>
+            <w:tcBorders>
+              <w:top w:val="single" w:sz="4" w:color="808080" w:space="0"/>
+              <w:left w:val="single" w:sz="10" w:color="000000" w:space="0"/>
+              <w:bottom w:val="single" w:sz="4" w:color="808080" w:space="0"/>
+              <w:right w:val="single" w:sz="10" w:color="000000" w:space="0"/>
+            </w:tcBorders>
+          </w:tcPr>
+          <w:p>
+            <w:pPr>
+              <w:keepNext/>
+              <w:spacing w:after="0"/>
+            </w:pPr>
+          </w:p>
+        </w:tc>
+      </w:tr>
+      <w:tr>
+        <w:trPr>
+          <w:trHeight w:val="432" w:hRule="exact"/>
+          <w:cantSplit/>
+        </w:trPr>
+        <w:tc>
+          <w:tcPr>
+            <w:tcW w:type="dxa" w:w="10080"/>
+            <w:tcBorders>
+              <w:top w:val="single" w:sz="4" w:color="808080" w:space="0"/>
+              <w:left w:val="single" w:sz="10" w:color="000000" w:space="0"/>
+              <w:bottom w:val="single" w:sz="4" w:color="808080" w:space="0"/>
+              <w:right w:val="single" w:sz="10" w:color="000000" w:space="0"/>
+            </w:tcBorders>
+          </w:tcPr>
+          <w:p>
+            <w:pPr>
+              <w:keepNext/>
+              <w:spacing w:after="0"/>
+            </w:pPr>
+          </w:p>
+        </w:tc>
+      </w:tr>
+      <w:tr>
+        <w:trPr>
+          <w:trHeight w:val="432" w:hRule="exact"/>
+          <w:cantSplit/>
+        </w:trPr>
+        <w:tc>
+          <w:tcPr>
+            <w:tcW w:type="dxa" w:w="10080"/>
+            <w:tcBorders>
+              <w:top w:val="single" w:sz="4" w:color="808080" w:space="0"/>
+              <w:left w:val="single" w:sz="10" w:color="000000" w:space="0"/>
+              <w:bottom w:val="single" w:sz="4" w:color="808080" w:space="0"/>
+              <w:right w:val="single" w:sz="10" w:color="000000" w:space="0"/>
+            </w:tcBorders>
+          </w:tcPr>
+          <w:p>
+            <w:pPr>
+              <w:keepNext/>
+              <w:spacing w:after="0"/>
+            </w:pPr>
+          </w:p>
+        </w:tc>
+      </w:tr>
+      <w:tr>
+        <w:trPr>
+          <w:trHeight w:val="432" w:hRule="exact"/>
+          <w:cantSplit/>
+        </w:trPr>
+        <w:tc>
+          <w:tcPr>
+            <w:tcW w:type="dxa" w:w="10080"/>
+            <w:tcBorders>
+              <w:top w:val="single" w:sz="4" w:color="808080" w:space="0"/>
+              <w:left w:val="single" w:sz="10" w:color="000000" w:space="0"/>
+              <w:bottom w:val="single" w:sz="4" w:color="808080" w:space="0"/>
+              <w:right w:val="single" w:sz="10" w:color="000000" w:space="0"/>
+            </w:tcBorders>
+          </w:tcPr>
+          <w:p>
+            <w:pPr>
+              <w:keepNext/>
+              <w:spacing w:after="0"/>
+            </w:pPr>
+          </w:p>
+        </w:tc>
+      </w:tr>
+      <w:tr>
+        <w:trPr>
+          <w:trHeight w:val="432" w:hRule="exact"/>
+          <w:cantSplit/>
+        </w:trPr>
+        <w:tc>
+          <w:tcPr>
+            <w:tcW w:type="dxa" w:w="10080"/>
+            <w:tcBorders>
+              <w:top w:val="single" w:sz="4" w:color="808080" w:space="0"/>
+              <w:left w:val="single" w:sz="10" w:color="000000" w:space="0"/>
+              <w:bottom w:val="single" w:sz="10" w:color="000000" w:space="0"/>
+              <w:right w:val="single" w:sz="10" w:color="000000" w:space="0"/>
+            </w:tcBorders>
+          </w:tcPr>
+          <w:p>
+            <w:pPr>
+              <w:spacing w:after="0"/>
+            </w:pPr>
+          </w:p>
+        </w:tc>
+      </w:tr>
+    </w:tbl>
+    <w:p>
+      <w:pPr>
+        <w:spacing w:before="0" w:after="40"/>
+      </w:pPr>
+    </w:p>
+    <w:p>
+      <w:pPr>
+        <w:keepNext/>
+        <w:spacing w:before="160" w:after="40"/>
+      </w:pPr>
+      <w:r>
+        <w:rPr>
+          <w:rFonts w:ascii="Times New Roman" w:hAnsi="Times New Roman" w:eastAsia="Times New Roman"/>
+          <w:b/>
+          <w:i w:val="0"/>
+          <w:sz w:val="25"/>
+        </w:rPr>
+        <w:t xml:space="preserve">2.2  </w:t>
+      </w:r>
+      <w:r>
+        <w:rPr>
+          <w:rFonts w:ascii="Times New Roman" w:hAnsi="Times New Roman" w:eastAsia="Times New Roman"/>
+          <w:b/>
+          <w:i w:val="0"/>
+          <w:sz w:val="25"/>
+        </w:rPr>
+        <w:t>Glucose and the Insulin Infusion</w:t>
+      </w:r>
+      <w:r>
+        <w:rPr>
+          <w:rFonts w:ascii="Times New Roman" w:hAnsi="Times New Roman" w:eastAsia="Times New Roman"/>
+          <w:b w:val="0"/>
+          <w:i/>
+          <w:color w:val="444444"/>
+          <w:sz w:val="21"/>
+        </w:rPr>
+        <w:t xml:space="preserve">   (2 pts)</w:t>
+      </w:r>
+    </w:p>
+    <w:p>
+      <w:pPr>
+        <w:keepNext/>
+        <w:spacing w:before="0" w:after="40"/>
+      </w:pPr>
+      <w:r>
+        <w:rPr>
+          <w:rFonts w:ascii="Times New Roman" w:hAnsi="Times New Roman" w:eastAsia="Times New Roman"/>
+          <w:b w:val="0"/>
+          <w:i w:val="0"/>
+          <w:sz w:val="23"/>
+        </w:rPr>
+        <w:t>Open Lab Results (Glucose, point of care and serum), Orders, the MAR and the 0150-0320 nursing notes. (a) List his glucose values from 1800 through 0300 and explain why the insulin infusion was started at 0030 and at what rate. (b) Why does a burn patient have a high glucose even though he has no diabetes? (c) What is the glucose goal and how often do you check it on the infusion? (d) Give TWO safety actions for an insulin infusion, including what you must do if the tube feeding is stopped, and name one lab that you watch closely with insulin.</w:t>
+      </w:r>
+    </w:p>
+    <w:p>
+      <w:pPr>
+        <w:keepNext/>
+        <w:spacing w:before="0" w:after="60"/>
+      </w:pPr>
+      <w:r>
+        <w:rPr>
+          <w:rFonts w:ascii="Times New Roman" w:hAnsi="Times New Roman" w:eastAsia="Times New Roman"/>
+          <w:b w:val="0"/>
+          <w:i/>
+          <w:color w:val="555555"/>
+          <w:sz w:val="19"/>
+        </w:rPr>
+        <w:t>Where to look in the EHR: Lab Results (Chemistry, Bedside Testing); Orders; MAR (insulin infusion); Chart Review &gt; Notes</w:t>
+      </w:r>
+    </w:p>
+    <w:tbl>
+      <w:tblPr>
+        <w:tblW w:type="auto" w:w="0"/>
+        <w:jc w:val="center"/>
+        <w:tblLayout w:type="fixed"/>
+        <w:tblLook w:firstColumn="1" w:firstRow="1" w:lastColumn="0" w:lastRow="0" w:noHBand="0" w:noVBand="1" w:val="04A0"/>
+      </w:tblPr>
+      <w:tblGrid>
+        <w:gridCol w:w="10080"/>
+      </w:tblGrid>
+      <w:tr>
+        <w:trPr>
+          <w:trHeight w:val="432" w:hRule="exact"/>
+          <w:cantSplit/>
+        </w:trPr>
+        <w:tc>
+          <w:tcPr>
+            <w:tcW w:type="dxa" w:w="10080"/>
+            <w:tcBorders>
+              <w:top w:val="single" w:sz="10" w:color="000000" w:space="0"/>
+              <w:left w:val="single" w:sz="10" w:color="000000" w:space="0"/>
+              <w:bottom w:val="single" w:sz="4" w:color="808080" w:space="0"/>
+              <w:right w:val="single" w:sz="10" w:color="000000" w:space="0"/>
+            </w:tcBorders>
+          </w:tcPr>
+          <w:p>
+            <w:pPr>
+              <w:keepNext/>
+              <w:spacing w:after="0"/>
+            </w:pPr>
+          </w:p>
+        </w:tc>
+      </w:tr>
+      <w:tr>
+        <w:trPr>
+          <w:trHeight w:val="432" w:hRule="exact"/>
+          <w:cantSplit/>
+        </w:trPr>
+        <w:tc>
+          <w:tcPr>
+            <w:tcW w:type="dxa" w:w="10080"/>
+            <w:tcBorders>
+              <w:top w:val="single" w:sz="4" w:color="808080" w:space="0"/>
+              <w:left w:val="single" w:sz="10" w:color="000000" w:space="0"/>
+              <w:bottom w:val="single" w:sz="4" w:color="808080" w:space="0"/>
+              <w:right w:val="single" w:sz="10" w:color="000000" w:space="0"/>
+            </w:tcBorders>
+          </w:tcPr>
+          <w:p>
+            <w:pPr>
+              <w:keepNext/>
+              <w:spacing w:after="0"/>
+            </w:pPr>
+          </w:p>
+        </w:tc>
+      </w:tr>
+      <w:tr>
+        <w:trPr>
+          <w:trHeight w:val="432" w:hRule="exact"/>
+          <w:cantSplit/>
+        </w:trPr>
+        <w:tc>
+          <w:tcPr>
+            <w:tcW w:type="dxa" w:w="10080"/>
+            <w:tcBorders>
+              <w:top w:val="single" w:sz="4" w:color="808080" w:space="0"/>
+              <w:left w:val="single" w:sz="10" w:color="000000" w:space="0"/>
+              <w:bottom w:val="single" w:sz="4" w:color="808080" w:space="0"/>
+              <w:right w:val="single" w:sz="10" w:color="000000" w:space="0"/>
+            </w:tcBorders>
+          </w:tcPr>
+          <w:p>
+            <w:pPr>
+              <w:keepNext/>
+              <w:spacing w:after="0"/>
+            </w:pPr>
+          </w:p>
+        </w:tc>
+      </w:tr>
+      <w:tr>
+        <w:trPr>
+          <w:trHeight w:val="432" w:hRule="exact"/>
+          <w:cantSplit/>
+        </w:trPr>
+        <w:tc>
+          <w:tcPr>
+            <w:tcW w:type="dxa" w:w="10080"/>
+            <w:tcBorders>
+              <w:top w:val="single" w:sz="4" w:color="808080" w:space="0"/>
+              <w:left w:val="single" w:sz="10" w:color="000000" w:space="0"/>
+              <w:bottom w:val="single" w:sz="4" w:color="808080" w:space="0"/>
+              <w:right w:val="single" w:sz="10" w:color="000000" w:space="0"/>
+            </w:tcBorders>
+          </w:tcPr>
+          <w:p>
+            <w:pPr>
+              <w:keepNext/>
+              <w:spacing w:after="0"/>
+            </w:pPr>
+          </w:p>
+        </w:tc>
+      </w:tr>
+      <w:tr>
+        <w:trPr>
+          <w:trHeight w:val="432" w:hRule="exact"/>
+          <w:cantSplit/>
+        </w:trPr>
+        <w:tc>
+          <w:tcPr>
+            <w:tcW w:type="dxa" w:w="10080"/>
+            <w:tcBorders>
+              <w:top w:val="single" w:sz="4" w:color="808080" w:space="0"/>
+              <w:left w:val="single" w:sz="10" w:color="000000" w:space="0"/>
+              <w:bottom w:val="single" w:sz="4" w:color="808080" w:space="0"/>
+              <w:right w:val="single" w:sz="10" w:color="000000" w:space="0"/>
+            </w:tcBorders>
+          </w:tcPr>
+          <w:p>
+            <w:pPr>
+              <w:keepNext/>
+              <w:spacing w:after="0"/>
+            </w:pPr>
+          </w:p>
+        </w:tc>
+      </w:tr>
+      <w:tr>
+        <w:trPr>
+          <w:trHeight w:val="432" w:hRule="exact"/>
+          <w:cantSplit/>
+        </w:trPr>
+        <w:tc>
+          <w:tcPr>
+            <w:tcW w:type="dxa" w:w="10080"/>
+            <w:tcBorders>
+              <w:top w:val="single" w:sz="4" w:color="808080" w:space="0"/>
+              <w:left w:val="single" w:sz="10" w:color="000000" w:space="0"/>
+              <w:bottom w:val="single" w:sz="4" w:color="808080" w:space="0"/>
+              <w:right w:val="single" w:sz="10" w:color="000000" w:space="0"/>
+            </w:tcBorders>
+          </w:tcPr>
+          <w:p>
+            <w:pPr>
+              <w:keepNext/>
+              <w:spacing w:after="0"/>
+            </w:pPr>
+          </w:p>
+        </w:tc>
+      </w:tr>
+      <w:tr>
+        <w:trPr>
+          <w:trHeight w:val="432" w:hRule="exact"/>
+          <w:cantSplit/>
+        </w:trPr>
+        <w:tc>
+          <w:tcPr>
+            <w:tcW w:type="dxa" w:w="10080"/>
+            <w:tcBorders>
+              <w:top w:val="single" w:sz="4" w:color="808080" w:space="0"/>
+              <w:left w:val="single" w:sz="10" w:color="000000" w:space="0"/>
+              <w:bottom w:val="single" w:sz="4" w:color="808080" w:space="0"/>
+              <w:right w:val="single" w:sz="10" w:color="000000" w:space="0"/>
+            </w:tcBorders>
+          </w:tcPr>
+          <w:p>
+            <w:pPr>
+              <w:keepNext/>
+              <w:spacing w:after="0"/>
+            </w:pPr>
+          </w:p>
+        </w:tc>
+      </w:tr>
+      <w:tr>
+        <w:trPr>
+          <w:trHeight w:val="432" w:hRule="exact"/>
+          <w:cantSplit/>
+        </w:trPr>
+        <w:tc>
+          <w:tcPr>
+            <w:tcW w:type="dxa" w:w="10080"/>
+            <w:tcBorders>
+              <w:top w:val="single" w:sz="4" w:color="808080" w:space="0"/>
+              <w:left w:val="single" w:sz="10" w:color="000000" w:space="0"/>
+              <w:bottom w:val="single" w:sz="4" w:color="808080" w:space="0"/>
+              <w:right w:val="single" w:sz="10" w:color="000000" w:space="0"/>
+            </w:tcBorders>
+          </w:tcPr>
+          <w:p>
+            <w:pPr>
+              <w:keepNext/>
+              <w:spacing w:after="0"/>
+            </w:pPr>
+          </w:p>
+        </w:tc>
+      </w:tr>
+      <w:tr>
+        <w:trPr>
+          <w:trHeight w:val="432" w:hRule="exact"/>
+          <w:cantSplit/>
+        </w:trPr>
+        <w:tc>
+          <w:tcPr>
+            <w:tcW w:type="dxa" w:w="10080"/>
+            <w:tcBorders>
+              <w:top w:val="single" w:sz="4" w:color="808080" w:space="0"/>
+              <w:left w:val="single" w:sz="10" w:color="000000" w:space="0"/>
+              <w:bottom w:val="single" w:sz="4" w:color="808080" w:space="0"/>
+              <w:right w:val="single" w:sz="10" w:color="000000" w:space="0"/>
+            </w:tcBorders>
+          </w:tcPr>
+          <w:p>
+            <w:pPr>
+              <w:keepNext/>
+              <w:spacing w:after="0"/>
+            </w:pPr>
+          </w:p>
+        </w:tc>
+      </w:tr>
+      <w:tr>
+        <w:trPr>
+          <w:trHeight w:val="432" w:hRule="exact"/>
+          <w:cantSplit/>
+        </w:trPr>
+        <w:tc>
+          <w:tcPr>
+            <w:tcW w:type="dxa" w:w="10080"/>
+            <w:tcBorders>
+              <w:top w:val="single" w:sz="4" w:color="808080" w:space="0"/>
+              <w:left w:val="single" w:sz="10" w:color="000000" w:space="0"/>
+              <w:bottom w:val="single" w:sz="4" w:color="808080" w:space="0"/>
+              <w:right w:val="single" w:sz="10" w:color="000000" w:space="0"/>
+            </w:tcBorders>
+          </w:tcPr>
+          <w:p>
+            <w:pPr>
+              <w:keepNext/>
+              <w:spacing w:after="0"/>
+            </w:pPr>
+          </w:p>
+        </w:tc>
+      </w:tr>
+      <w:tr>
+        <w:trPr>
+          <w:trHeight w:val="432" w:hRule="exact"/>
+          <w:cantSplit/>
+        </w:trPr>
+        <w:tc>
+          <w:tcPr>
+            <w:tcW w:type="dxa" w:w="10080"/>
+            <w:tcBorders>
+              <w:top w:val="single" w:sz="4" w:color="808080" w:space="0"/>
+              <w:left w:val="single" w:sz="10" w:color="000000" w:space="0"/>
+              <w:bottom w:val="single" w:sz="4" w:color="808080" w:space="0"/>
+              <w:right w:val="single" w:sz="10" w:color="000000" w:space="0"/>
+            </w:tcBorders>
+          </w:tcPr>
+          <w:p>
+            <w:pPr>
+              <w:keepNext/>
+              <w:spacing w:after="0"/>
+            </w:pPr>
+          </w:p>
+        </w:tc>
+      </w:tr>
+      <w:tr>
+        <w:trPr>
+          <w:trHeight w:val="432" w:hRule="exact"/>
+          <w:cantSplit/>
+        </w:trPr>
+        <w:tc>
+          <w:tcPr>
+            <w:tcW w:type="dxa" w:w="10080"/>
+            <w:tcBorders>
+              <w:top w:val="single" w:sz="4" w:color="808080" w:space="0"/>
+              <w:left w:val="single" w:sz="10" w:color="000000" w:space="0"/>
+              <w:bottom w:val="single" w:sz="4" w:color="808080" w:space="0"/>
+              <w:right w:val="single" w:sz="10" w:color="000000" w:space="0"/>
+            </w:tcBorders>
+          </w:tcPr>
+          <w:p>
+            <w:pPr>
+              <w:keepNext/>
+              <w:spacing w:after="0"/>
+            </w:pPr>
+          </w:p>
+        </w:tc>
+      </w:tr>
+      <w:tr>
+        <w:trPr>
+          <w:trHeight w:val="432" w:hRule="exact"/>
+          <w:cantSplit/>
+        </w:trPr>
+        <w:tc>
+          <w:tcPr>
+            <w:tcW w:type="dxa" w:w="10080"/>
+            <w:tcBorders>
+              <w:top w:val="single" w:sz="4" w:color="808080" w:space="0"/>
+              <w:left w:val="single" w:sz="10" w:color="000000" w:space="0"/>
+              <w:bottom w:val="single" w:sz="4" w:color="808080" w:space="0"/>
+              <w:right w:val="single" w:sz="10" w:color="000000" w:space="0"/>
+            </w:tcBorders>
+          </w:tcPr>
+          <w:p>
+            <w:pPr>
+              <w:keepNext/>
+              <w:spacing w:after="0"/>
+            </w:pPr>
+          </w:p>
+        </w:tc>
+      </w:tr>
+      <w:tr>
+        <w:trPr>
+          <w:trHeight w:val="432" w:hRule="exact"/>
+          <w:cantSplit/>
+        </w:trPr>
+        <w:tc>
+          <w:tcPr>
+            <w:tcW w:type="dxa" w:w="10080"/>
+            <w:tcBorders>
+              <w:top w:val="single" w:sz="4" w:color="808080" w:space="0"/>
+              <w:left w:val="single" w:sz="10" w:color="000000" w:space="0"/>
+              <w:bottom w:val="single" w:sz="4" w:color="808080" w:space="0"/>
+              <w:right w:val="single" w:sz="10" w:color="000000" w:space="0"/>
+            </w:tcBorders>
+          </w:tcPr>
+          <w:p>
+            <w:pPr>
+              <w:keepNext/>
+              <w:spacing w:after="0"/>
+            </w:pPr>
+          </w:p>
+        </w:tc>
+      </w:tr>
+      <w:tr>
+        <w:trPr>
+          <w:trHeight w:val="432" w:hRule="exact"/>
+          <w:cantSplit/>
+        </w:trPr>
+        <w:tc>
+          <w:tcPr>
+            <w:tcW w:type="dxa" w:w="10080"/>
+            <w:tcBorders>
+              <w:top w:val="single" w:sz="4" w:color="808080" w:space="0"/>
+              <w:left w:val="single" w:sz="10" w:color="000000" w:space="0"/>
+              <w:bottom w:val="single" w:sz="4" w:color="808080" w:space="0"/>
+              <w:right w:val="single" w:sz="10" w:color="000000" w:space="0"/>
+            </w:tcBorders>
+          </w:tcPr>
+          <w:p>
+            <w:pPr>
+              <w:keepNext/>
+              <w:spacing w:after="0"/>
+            </w:pPr>
+          </w:p>
+        </w:tc>
+      </w:tr>
+      <w:tr>
+        <w:trPr>
+          <w:trHeight w:val="432" w:hRule="exact"/>
+          <w:cantSplit/>
+        </w:trPr>
+        <w:tc>
+          <w:tcPr>
+            <w:tcW w:type="dxa" w:w="10080"/>
+            <w:tcBorders>
+              <w:top w:val="single" w:sz="4" w:color="808080" w:space="0"/>
+              <w:left w:val="single" w:sz="10" w:color="000000" w:space="0"/>
+              <w:bottom w:val="single" w:sz="4" w:color="808080" w:space="0"/>
+              <w:right w:val="single" w:sz="10" w:color="000000" w:space="0"/>
+            </w:tcBorders>
+          </w:tcPr>
+          <w:p>
+            <w:pPr>
+              <w:keepNext/>
+              <w:spacing w:after="0"/>
+            </w:pPr>
+          </w:p>
+        </w:tc>
+      </w:tr>
+      <w:tr>
+        <w:trPr>
+          <w:trHeight w:val="432" w:hRule="exact"/>
+          <w:cantSplit/>
+        </w:trPr>
+        <w:tc>
+          <w:tcPr>
+            <w:tcW w:type="dxa" w:w="10080"/>
+            <w:tcBorders>
+              <w:top w:val="single" w:sz="4" w:color="808080" w:space="0"/>
+              <w:left w:val="single" w:sz="10" w:color="000000" w:space="0"/>
+              <w:bottom w:val="single" w:sz="4" w:color="808080" w:space="0"/>
+              <w:right w:val="single" w:sz="10" w:color="000000" w:space="0"/>
+            </w:tcBorders>
+          </w:tcPr>
+          <w:p>
+            <w:pPr>
+              <w:keepNext/>
+              <w:spacing w:after="0"/>
+            </w:pPr>
+          </w:p>
+        </w:tc>
+      </w:tr>
+      <w:tr>
+        <w:trPr>
+          <w:trHeight w:val="432" w:hRule="exact"/>
+          <w:cantSplit/>
+        </w:trPr>
+        <w:tc>
+          <w:tcPr>
+            <w:tcW w:type="dxa" w:w="10080"/>
+            <w:tcBorders>
+              <w:top w:val="single" w:sz="4" w:color="808080" w:space="0"/>
+              <w:left w:val="single" w:sz="10" w:color="000000" w:space="0"/>
+              <w:bottom w:val="single" w:sz="4" w:color="808080" w:space="0"/>
+              <w:right w:val="single" w:sz="10" w:color="000000" w:space="0"/>
+            </w:tcBorders>
+          </w:tcPr>
+          <w:p>
+            <w:pPr>
+              <w:keepNext/>
+              <w:spacing w:after="0"/>
+            </w:pPr>
+          </w:p>
+        </w:tc>
+      </w:tr>
+      <w:tr>
+        <w:trPr>
+          <w:trHeight w:val="432" w:hRule="exact"/>
+          <w:cantSplit/>
+        </w:trPr>
+        <w:tc>
+          <w:tcPr>
+            <w:tcW w:type="dxa" w:w="10080"/>
+            <w:tcBorders>
+              <w:top w:val="single" w:sz="4" w:color="808080" w:space="0"/>
+              <w:left w:val="single" w:sz="10" w:color="000000" w:space="0"/>
+              <w:bottom w:val="single" w:sz="4" w:color="808080" w:space="0"/>
+              <w:right w:val="single" w:sz="10" w:color="000000" w:space="0"/>
+            </w:tcBorders>
+          </w:tcPr>
+          <w:p>
+            <w:pPr>
+              <w:keepNext/>
+              <w:spacing w:after="0"/>
+            </w:pPr>
+          </w:p>
+        </w:tc>
+      </w:tr>
+      <w:tr>
+        <w:trPr>
+          <w:trHeight w:val="432" w:hRule="exact"/>
+          <w:cantSplit/>
+        </w:trPr>
+        <w:tc>
+          <w:tcPr>
+            <w:tcW w:type="dxa" w:w="10080"/>
+            <w:tcBorders>
+              <w:top w:val="single" w:sz="4" w:color="808080" w:space="0"/>
+              <w:left w:val="single" w:sz="10" w:color="000000" w:space="0"/>
+              <w:bottom w:val="single" w:sz="4" w:color="808080" w:space="0"/>
+              <w:right w:val="single" w:sz="10" w:color="000000" w:space="0"/>
+            </w:tcBorders>
+          </w:tcPr>
+          <w:p>
+            <w:pPr>
+              <w:keepNext/>
+              <w:spacing w:after="0"/>
+            </w:pPr>
+          </w:p>
+        </w:tc>
+      </w:tr>
+      <w:tr>
+        <w:trPr>
+          <w:trHeight w:val="432" w:hRule="exact"/>
+          <w:cantSplit/>
+        </w:trPr>
+        <w:tc>
+          <w:tcPr>
+            <w:tcW w:type="dxa" w:w="10080"/>
+            <w:tcBorders>
+              <w:top w:val="single" w:sz="4" w:color="808080" w:space="0"/>
+              <w:left w:val="single" w:sz="10" w:color="000000" w:space="0"/>
+              <w:bottom w:val="single" w:sz="4" w:color="808080" w:space="0"/>
+              <w:right w:val="single" w:sz="10" w:color="000000" w:space="0"/>
+            </w:tcBorders>
+          </w:tcPr>
+          <w:p>
+            <w:pPr>
+              <w:keepNext/>
+              <w:spacing w:after="0"/>
+            </w:pPr>
+          </w:p>
+        </w:tc>
+      </w:tr>
+      <w:tr>
+        <w:trPr>
+          <w:trHeight w:val="432" w:hRule="exact"/>
+          <w:cantSplit/>
+        </w:trPr>
+        <w:tc>
+          <w:tcPr>
+            <w:tcW w:type="dxa" w:w="10080"/>
+            <w:tcBorders>
+              <w:top w:val="single" w:sz="4" w:color="808080" w:space="0"/>
+              <w:left w:val="single" w:sz="10" w:color="000000" w:space="0"/>
+              <w:bottom w:val="single" w:sz="4" w:color="808080" w:space="0"/>
+              <w:right w:val="single" w:sz="10" w:color="000000" w:space="0"/>
+            </w:tcBorders>
+          </w:tcPr>
+          <w:p>
+            <w:pPr>
+              <w:keepNext/>
+              <w:spacing w:after="0"/>
+            </w:pPr>
+          </w:p>
+        </w:tc>
+      </w:tr>
+      <w:tr>
+        <w:trPr>
+          <w:trHeight w:val="432" w:hRule="exact"/>
+          <w:cantSplit/>
+        </w:trPr>
+        <w:tc>
+          <w:tcPr>
+            <w:tcW w:type="dxa" w:w="10080"/>
+            <w:tcBorders>
+              <w:top w:val="single" w:sz="4" w:color="808080" w:space="0"/>
+              <w:left w:val="single" w:sz="10" w:color="000000" w:space="0"/>
+              <w:bottom w:val="single" w:sz="4" w:color="808080" w:space="0"/>
+              <w:right w:val="single" w:sz="10" w:color="000000" w:space="0"/>
+            </w:tcBorders>
+          </w:tcPr>
+          <w:p>
+            <w:pPr>
+              <w:keepNext/>
+              <w:spacing w:after="0"/>
+            </w:pPr>
+          </w:p>
+        </w:tc>
+      </w:tr>
+      <w:tr>
+        <w:trPr>
+          <w:trHeight w:val="432" w:hRule="exact"/>
+          <w:cantSplit/>
+        </w:trPr>
+        <w:tc>
+          <w:tcPr>
+            <w:tcW w:type="dxa" w:w="10080"/>
+            <w:tcBorders>
+              <w:top w:val="single" w:sz="4" w:color="808080" w:space="0"/>
+              <w:left w:val="single" w:sz="10" w:color="000000" w:space="0"/>
+              <w:bottom w:val="single" w:sz="10" w:color="000000" w:space="0"/>
+              <w:right w:val="single" w:sz="10" w:color="000000" w:space="0"/>
+            </w:tcBorders>
+          </w:tcPr>
+          <w:p>
+            <w:pPr>
+              <w:spacing w:after="0"/>
+            </w:pPr>
+          </w:p>
+        </w:tc>
+      </w:tr>
+    </w:tbl>
+    <w:p>
+      <w:pPr>
+        <w:spacing w:before="0" w:after="40"/>
+      </w:pPr>
+    </w:p>
+    <w:p>
+      <w:pPr>
+        <w:keepNext/>
+        <w:spacing w:before="160" w:after="40"/>
+      </w:pPr>
+      <w:r>
+        <w:rPr>
+          <w:rFonts w:ascii="Times New Roman" w:hAnsi="Times New Roman" w:eastAsia="Times New Roman"/>
+          <w:b/>
+          <w:i w:val="0"/>
+          <w:sz w:val="25"/>
+        </w:rPr>
+        <w:t xml:space="preserve">2.3  </w:t>
+      </w:r>
+      <w:r>
+        <w:rPr>
+          <w:rFonts w:ascii="Times New Roman" w:hAnsi="Times New Roman" w:eastAsia="Times New Roman"/>
+          <w:b/>
+          <w:i w:val="0"/>
+          <w:sz w:val="25"/>
+        </w:rPr>
+        <w:t>The End of the First 24 Hours</w:t>
+      </w:r>
+      <w:r>
+        <w:rPr>
+          <w:rFonts w:ascii="Times New Roman" w:hAnsi="Times New Roman" w:eastAsia="Times New Roman"/>
+          <w:b w:val="0"/>
+          <w:i/>
+          <w:color w:val="444444"/>
+          <w:sz w:val="21"/>
+        </w:rPr>
+        <w:t xml:space="preserve">   (1.5 pts)</w:t>
+      </w:r>
+    </w:p>
+    <w:p>
+      <w:pPr>
+        <w:keepNext/>
+        <w:spacing w:before="0" w:after="40"/>
+      </w:pPr>
+      <w:r>
+        <w:rPr>
+          <w:rFonts w:ascii="Times New Roman" w:hAnsi="Times New Roman" w:eastAsia="Times New Roman"/>
+          <w:b w:val="0"/>
+          <w:i w:val="0"/>
+          <w:sz w:val="23"/>
+        </w:rPr>
+        <w:t>The Parkland period ends at 0130 (24 hours after the injury). Using the lactated Ringer's rates and times on the MAR (EMS 500 mL, ED 450 mL/h from 0230 to 0400, then the ICU rates), (a) add up the total crystalloid he received from the injury to 0130 and compare it with the Parkland goal. (b) What did the order change to at 0130 and what new fluid starts at 0600? (c) Why do the fluids not simply stop at 24 hours? (d) His weight was 82 kg on arrival and is now 89.6 kg: what does that tell you and what else do you watch for?</w:t>
+      </w:r>
+    </w:p>
+    <w:p>
+      <w:pPr>
+        <w:keepNext/>
+        <w:spacing w:before="0" w:after="60"/>
+      </w:pPr>
+      <w:r>
+        <w:rPr>
+          <w:rFonts w:ascii="Times New Roman" w:hAnsi="Times New Roman" w:eastAsia="Times New Roman"/>
+          <w:b w:val="0"/>
+          <w:i/>
+          <w:color w:val="555555"/>
+          <w:sz w:val="19"/>
+        </w:rPr>
+        <w:t>Where to look in the EHR: MAR (lactated Ringer's rate changes); Orders; Flowsheets &gt; Cardiac (daily weight) and Intake/Output; Nursing Note 0150</w:t>
+      </w:r>
+    </w:p>
+    <w:tbl>
+      <w:tblPr>
+        <w:tblW w:type="auto" w:w="0"/>
+        <w:jc w:val="center"/>
+        <w:tblLayout w:type="fixed"/>
+        <w:tblLook w:firstColumn="1" w:firstRow="1" w:lastColumn="0" w:lastRow="0" w:noHBand="0" w:noVBand="1" w:val="04A0"/>
+      </w:tblPr>
+      <w:tblGrid>
+        <w:gridCol w:w="10080"/>
+      </w:tblGrid>
+      <w:tr>
+        <w:trPr>
+          <w:trHeight w:val="432" w:hRule="exact"/>
+          <w:cantSplit/>
+        </w:trPr>
+        <w:tc>
+          <w:tcPr>
+            <w:tcW w:type="dxa" w:w="10080"/>
+            <w:tcBorders>
+              <w:top w:val="single" w:sz="10" w:color="000000" w:space="0"/>
+              <w:left w:val="single" w:sz="10" w:color="000000" w:space="0"/>
+              <w:bottom w:val="single" w:sz="4" w:color="808080" w:space="0"/>
+              <w:right w:val="single" w:sz="10" w:color="000000" w:space="0"/>
+            </w:tcBorders>
+          </w:tcPr>
+          <w:p>
+            <w:pPr>
+              <w:keepNext/>
+              <w:spacing w:after="0"/>
+            </w:pPr>
+          </w:p>
+        </w:tc>
+      </w:tr>
+      <w:tr>
+        <w:trPr>
+          <w:trHeight w:val="432" w:hRule="exact"/>
+          <w:cantSplit/>
+        </w:trPr>
+        <w:tc>
+          <w:tcPr>
+            <w:tcW w:type="dxa" w:w="10080"/>
+            <w:tcBorders>
+              <w:top w:val="single" w:sz="4" w:color="808080" w:space="0"/>
+              <w:left w:val="single" w:sz="10" w:color="000000" w:space="0"/>
+              <w:bottom w:val="single" w:sz="4" w:color="808080" w:space="0"/>
+              <w:right w:val="single" w:sz="10" w:color="000000" w:space="0"/>
+            </w:tcBorders>
+          </w:tcPr>
+          <w:p>
+            <w:pPr>
+              <w:keepNext/>
+              <w:spacing w:after="0"/>
+            </w:pPr>
+          </w:p>
+        </w:tc>
+      </w:tr>
+      <w:tr>
+        <w:trPr>
+          <w:trHeight w:val="432" w:hRule="exact"/>
+          <w:cantSplit/>
+        </w:trPr>
+        <w:tc>
+          <w:tcPr>
+            <w:tcW w:type="dxa" w:w="10080"/>
+            <w:tcBorders>
+              <w:top w:val="single" w:sz="4" w:color="808080" w:space="0"/>
+              <w:left w:val="single" w:sz="10" w:color="000000" w:space="0"/>
+              <w:bottom w:val="single" w:sz="4" w:color="808080" w:space="0"/>
+              <w:right w:val="single" w:sz="10" w:color="000000" w:space="0"/>
+            </w:tcBorders>
+          </w:tcPr>
+          <w:p>
+            <w:pPr>
+              <w:keepNext/>
+              <w:spacing w:after="0"/>
+            </w:pPr>
+          </w:p>
+        </w:tc>
+      </w:tr>
+      <w:tr>
+        <w:trPr>
+          <w:trHeight w:val="432" w:hRule="exact"/>
+          <w:cantSplit/>
+        </w:trPr>
+        <w:tc>
+          <w:tcPr>
+            <w:tcW w:type="dxa" w:w="10080"/>
+            <w:tcBorders>
+              <w:top w:val="single" w:sz="4" w:color="808080" w:space="0"/>
+              <w:left w:val="single" w:sz="10" w:color="000000" w:space="0"/>
+              <w:bottom w:val="single" w:sz="4" w:color="808080" w:space="0"/>
+              <w:right w:val="single" w:sz="10" w:color="000000" w:space="0"/>
+            </w:tcBorders>
+          </w:tcPr>
+          <w:p>
+            <w:pPr>
+              <w:keepNext/>
+              <w:spacing w:after="0"/>
+            </w:pPr>
+          </w:p>
+        </w:tc>
+      </w:tr>
+      <w:tr>
+        <w:trPr>
+          <w:trHeight w:val="432" w:hRule="exact"/>
+          <w:cantSplit/>
+        </w:trPr>
+        <w:tc>
+          <w:tcPr>
+            <w:tcW w:type="dxa" w:w="10080"/>
+            <w:tcBorders>
+              <w:top w:val="single" w:sz="4" w:color="808080" w:space="0"/>
+              <w:left w:val="single" w:sz="10" w:color="000000" w:space="0"/>
+              <w:bottom w:val="single" w:sz="4" w:color="808080" w:space="0"/>
+              <w:right w:val="single" w:sz="10" w:color="000000" w:space="0"/>
+            </w:tcBorders>
+          </w:tcPr>
+          <w:p>
+            <w:pPr>
+              <w:keepNext/>
+              <w:spacing w:after="0"/>
+            </w:pPr>
+          </w:p>
+        </w:tc>
+      </w:tr>
+      <w:tr>
+        <w:trPr>
+          <w:trHeight w:val="432" w:hRule="exact"/>
+          <w:cantSplit/>
+        </w:trPr>
+        <w:tc>
+          <w:tcPr>
+            <w:tcW w:type="dxa" w:w="10080"/>
+            <w:tcBorders>
+              <w:top w:val="single" w:sz="4" w:color="808080" w:space="0"/>
+              <w:left w:val="single" w:sz="10" w:color="000000" w:space="0"/>
+              <w:bottom w:val="single" w:sz="4" w:color="808080" w:space="0"/>
+              <w:right w:val="single" w:sz="10" w:color="000000" w:space="0"/>
+            </w:tcBorders>
+          </w:tcPr>
+          <w:p>
+            <w:pPr>
+              <w:keepNext/>
+              <w:spacing w:after="0"/>
+            </w:pPr>
+          </w:p>
+        </w:tc>
+      </w:tr>
+      <w:tr>
+        <w:trPr>
+          <w:trHeight w:val="432" w:hRule="exact"/>
+          <w:cantSplit/>
+        </w:trPr>
+        <w:tc>
+          <w:tcPr>
+            <w:tcW w:type="dxa" w:w="10080"/>
+            <w:tcBorders>
+              <w:top w:val="single" w:sz="4" w:color="808080" w:space="0"/>
+              <w:left w:val="single" w:sz="10" w:color="000000" w:space="0"/>
+              <w:bottom w:val="single" w:sz="4" w:color="808080" w:space="0"/>
+              <w:right w:val="single" w:sz="10" w:color="000000" w:space="0"/>
+            </w:tcBorders>
+          </w:tcPr>
+          <w:p>
+            <w:pPr>
+              <w:keepNext/>
+              <w:spacing w:after="0"/>
+            </w:pPr>
+          </w:p>
+        </w:tc>
+      </w:tr>
+      <w:tr>
+        <w:trPr>
+          <w:trHeight w:val="432" w:hRule="exact"/>
+          <w:cantSplit/>
+        </w:trPr>
+        <w:tc>
+          <w:tcPr>
+            <w:tcW w:type="dxa" w:w="10080"/>
+            <w:tcBorders>
+              <w:top w:val="single" w:sz="4" w:color="808080" w:space="0"/>
+              <w:left w:val="single" w:sz="10" w:color="000000" w:space="0"/>
+              <w:bottom w:val="single" w:sz="4" w:color="808080" w:space="0"/>
+              <w:right w:val="single" w:sz="10" w:color="000000" w:space="0"/>
+            </w:tcBorders>
+          </w:tcPr>
+          <w:p>
+            <w:pPr>
+              <w:keepNext/>
+              <w:spacing w:after="0"/>
+            </w:pPr>
+          </w:p>
+        </w:tc>
+      </w:tr>
+      <w:tr>
+        <w:trPr>
+          <w:trHeight w:val="432" w:hRule="exact"/>
+          <w:cantSplit/>
+        </w:trPr>
+        <w:tc>
+          <w:tcPr>
+            <w:tcW w:type="dxa" w:w="10080"/>
+            <w:tcBorders>
+              <w:top w:val="single" w:sz="4" w:color="808080" w:space="0"/>
+              <w:left w:val="single" w:sz="10" w:color="000000" w:space="0"/>
+              <w:bottom w:val="single" w:sz="4" w:color="808080" w:space="0"/>
+              <w:right w:val="single" w:sz="10" w:color="000000" w:space="0"/>
+            </w:tcBorders>
+          </w:tcPr>
+          <w:p>
+            <w:pPr>
+              <w:keepNext/>
+              <w:spacing w:after="0"/>
+            </w:pPr>
+          </w:p>
+        </w:tc>
+      </w:tr>
+      <w:tr>
+        <w:trPr>
+          <w:trHeight w:val="432" w:hRule="exact"/>
+          <w:cantSplit/>
+        </w:trPr>
+        <w:tc>
+          <w:tcPr>
+            <w:tcW w:type="dxa" w:w="10080"/>
+            <w:tcBorders>
+              <w:top w:val="single" w:sz="4" w:color="808080" w:space="0"/>
+              <w:left w:val="single" w:sz="10" w:color="000000" w:space="0"/>
+              <w:bottom w:val="single" w:sz="4" w:color="808080" w:space="0"/>
+              <w:right w:val="single" w:sz="10" w:color="000000" w:space="0"/>
+            </w:tcBorders>
+          </w:tcPr>
+          <w:p>
+            <w:pPr>
+              <w:keepNext/>
+              <w:spacing w:after="0"/>
+            </w:pPr>
+          </w:p>
+        </w:tc>
+      </w:tr>
+      <w:tr>
+        <w:trPr>
+          <w:trHeight w:val="432" w:hRule="exact"/>
+          <w:cantSplit/>
+        </w:trPr>
+        <w:tc>
+          <w:tcPr>
+            <w:tcW w:type="dxa" w:w="10080"/>
+            <w:tcBorders>
+              <w:top w:val="single" w:sz="4" w:color="808080" w:space="0"/>
+              <w:left w:val="single" w:sz="10" w:color="000000" w:space="0"/>
+              <w:bottom w:val="single" w:sz="10" w:color="000000" w:space="0"/>
+              <w:right w:val="single" w:sz="10" w:color="000000" w:space="0"/>
+            </w:tcBorders>
+          </w:tcPr>
+          <w:p>
+            <w:pPr>
+              <w:spacing w:after="0"/>
+            </w:pPr>
+          </w:p>
+        </w:tc>
+      </w:tr>
+    </w:tbl>
+    <w:p>
+      <w:pPr>
+        <w:spacing w:before="0" w:after="40"/>
+      </w:pPr>
+    </w:p>
+    <w:p>
+      <w:pPr>
+        <w:keepNext/>
+        <w:spacing w:before="160" w:after="40"/>
+      </w:pPr>
+      <w:r>
+        <w:rPr>
+          <w:rFonts w:ascii="Times New Roman" w:hAnsi="Times New Roman" w:eastAsia="Times New Roman"/>
+          <w:b/>
+          <w:i w:val="0"/>
+          <w:sz w:val="25"/>
+        </w:rPr>
+        <w:t xml:space="preserve">2.4  </w:t>
+      </w:r>
+      <w:r>
+        <w:rPr>
+          <w:rFonts w:ascii="Times New Roman" w:hAnsi="Times New Roman" w:eastAsia="Times New Roman"/>
+          <w:b/>
+          <w:i w:val="0"/>
+          <w:sz w:val="25"/>
+        </w:rPr>
+        <w:t>Alcohol and the Next Three Days</w:t>
+      </w:r>
+      <w:r>
+        <w:rPr>
+          <w:rFonts w:ascii="Times New Roman" w:hAnsi="Times New Roman" w:eastAsia="Times New Roman"/>
+          <w:b w:val="0"/>
+          <w:i/>
+          <w:color w:val="444444"/>
+          <w:sz w:val="21"/>
+        </w:rPr>
+        <w:t xml:space="preserve">   (1 pt)</w:t>
+      </w:r>
+    </w:p>
+    <w:p>
+      <w:pPr>
+        <w:keepNext/>
+        <w:spacing w:before="0" w:after="40"/>
+      </w:pPr>
+      <w:r>
+        <w:rPr>
+          <w:rFonts w:ascii="Times New Roman" w:hAnsi="Times New Roman" w:eastAsia="Times New Roman"/>
+          <w:b w:val="0"/>
+          <w:i w:val="0"/>
+          <w:sz w:val="23"/>
+        </w:rPr>
+        <w:t>His ethanol level was 42 mg/dL at 0240 and he usually drinks 4 to 6 beers on weekends, more than that the night of the fire. (a) When could alcohol withdrawal begin, and when are seizures and delirium tremens most likely? (b) Why may you not see the signs yet? (c) Which two vitamins are ordered and why? (d) Name three signs you would watch for.</w:t>
+      </w:r>
+    </w:p>
+    <w:p>
+      <w:pPr>
+        <w:keepNext/>
+        <w:spacing w:before="0" w:after="60"/>
+      </w:pPr>
+      <w:r>
+        <w:rPr>
+          <w:rFonts w:ascii="Times New Roman" w:hAnsi="Times New Roman" w:eastAsia="Times New Roman"/>
+          <w:b w:val="0"/>
+          <w:i/>
+          <w:color w:val="555555"/>
+          <w:sz w:val="19"/>
+        </w:rPr>
+        <w:t>Where to look in the EHR: Lab Results (Toxicology); H&amp;P (social history); MAR (thiamine and folic acid)</w:t>
+      </w:r>
+    </w:p>
+    <w:tbl>
+      <w:tblPr>
+        <w:tblW w:type="auto" w:w="0"/>
+        <w:jc w:val="center"/>
+        <w:tblLayout w:type="fixed"/>
+        <w:tblLook w:firstColumn="1" w:firstRow="1" w:lastColumn="0" w:lastRow="0" w:noHBand="0" w:noVBand="1" w:val="04A0"/>
+      </w:tblPr>
+      <w:tblGrid>
+        <w:gridCol w:w="10080"/>
+      </w:tblGrid>
+      <w:tr>
+        <w:trPr>
+          <w:trHeight w:val="432" w:hRule="exact"/>
+          <w:cantSplit/>
+        </w:trPr>
+        <w:tc>
+          <w:tcPr>
+            <w:tcW w:type="dxa" w:w="10080"/>
+            <w:tcBorders>
+              <w:top w:val="single" w:sz="10" w:color="000000" w:space="0"/>
+              <w:left w:val="single" w:sz="10" w:color="000000" w:space="0"/>
+              <w:bottom w:val="single" w:sz="4" w:color="808080" w:space="0"/>
+              <w:right w:val="single" w:sz="10" w:color="000000" w:space="0"/>
+            </w:tcBorders>
+          </w:tcPr>
+          <w:p>
+            <w:pPr>
+              <w:keepNext/>
+              <w:spacing w:after="0"/>
+            </w:pPr>
+          </w:p>
+        </w:tc>
+      </w:tr>
+      <w:tr>
+        <w:trPr>
+          <w:trHeight w:val="432" w:hRule="exact"/>
+          <w:cantSplit/>
+        </w:trPr>
+        <w:tc>
+          <w:tcPr>
+            <w:tcW w:type="dxa" w:w="10080"/>
+            <w:tcBorders>
+              <w:top w:val="single" w:sz="4" w:color="808080" w:space="0"/>
+              <w:left w:val="single" w:sz="10" w:color="000000" w:space="0"/>
+              <w:bottom w:val="single" w:sz="4" w:color="808080" w:space="0"/>
+              <w:right w:val="single" w:sz="10" w:color="000000" w:space="0"/>
+            </w:tcBorders>
+          </w:tcPr>
+          <w:p>
+            <w:pPr>
+              <w:keepNext/>
+              <w:spacing w:after="0"/>
+            </w:pPr>
+          </w:p>
+        </w:tc>
+      </w:tr>
+      <w:tr>
+        <w:trPr>
+          <w:trHeight w:val="432" w:hRule="exact"/>
+          <w:cantSplit/>
+        </w:trPr>
+        <w:tc>
+          <w:tcPr>
+            <w:tcW w:type="dxa" w:w="10080"/>
+            <w:tcBorders>
+              <w:top w:val="single" w:sz="4" w:color="808080" w:space="0"/>
+              <w:left w:val="single" w:sz="10" w:color="000000" w:space="0"/>
+              <w:bottom w:val="single" w:sz="4" w:color="808080" w:space="0"/>
+              <w:right w:val="single" w:sz="10" w:color="000000" w:space="0"/>
+            </w:tcBorders>
+          </w:tcPr>
+          <w:p>
+            <w:pPr>
+              <w:keepNext/>
+              <w:spacing w:after="0"/>
+            </w:pPr>
+          </w:p>
+        </w:tc>
+      </w:tr>
+      <w:tr>
+        <w:trPr>
+          <w:trHeight w:val="432" w:hRule="exact"/>
+          <w:cantSplit/>
+        </w:trPr>
+        <w:tc>
+          <w:tcPr>
+            <w:tcW w:type="dxa" w:w="10080"/>
+            <w:tcBorders>
+              <w:top w:val="single" w:sz="4" w:color="808080" w:space="0"/>
+              <w:left w:val="single" w:sz="10" w:color="000000" w:space="0"/>
+              <w:bottom w:val="single" w:sz="4" w:color="808080" w:space="0"/>
+              <w:right w:val="single" w:sz="10" w:color="000000" w:space="0"/>
+            </w:tcBorders>
+          </w:tcPr>
+          <w:p>
+            <w:pPr>
+              <w:keepNext/>
+              <w:spacing w:after="0"/>
+            </w:pPr>
+          </w:p>
+        </w:tc>
+      </w:tr>
+      <w:tr>
+        <w:trPr>
+          <w:trHeight w:val="432" w:hRule="exact"/>
+          <w:cantSplit/>
+        </w:trPr>
+        <w:tc>
+          <w:tcPr>
+            <w:tcW w:type="dxa" w:w="10080"/>
+            <w:tcBorders>
+              <w:top w:val="single" w:sz="4" w:color="808080" w:space="0"/>
+              <w:left w:val="single" w:sz="10" w:color="000000" w:space="0"/>
+              <w:bottom w:val="single" w:sz="4" w:color="808080" w:space="0"/>
+              <w:right w:val="single" w:sz="10" w:color="000000" w:space="0"/>
+            </w:tcBorders>
+          </w:tcPr>
+          <w:p>
+            <w:pPr>
+              <w:keepNext/>
+              <w:spacing w:after="0"/>
+            </w:pPr>
+          </w:p>
+        </w:tc>
+      </w:tr>
+      <w:tr>
+        <w:trPr>
+          <w:trHeight w:val="432" w:hRule="exact"/>
+          <w:cantSplit/>
+        </w:trPr>
+        <w:tc>
+          <w:tcPr>
+            <w:tcW w:type="dxa" w:w="10080"/>
+            <w:tcBorders>
+              <w:top w:val="single" w:sz="4" w:color="808080" w:space="0"/>
+              <w:left w:val="single" w:sz="10" w:color="000000" w:space="0"/>
+              <w:bottom w:val="single" w:sz="4" w:color="808080" w:space="0"/>
+              <w:right w:val="single" w:sz="10" w:color="000000" w:space="0"/>
+            </w:tcBorders>
+          </w:tcPr>
+          <w:p>
+            <w:pPr>
+              <w:keepNext/>
+              <w:spacing w:after="0"/>
+            </w:pPr>
+          </w:p>
+        </w:tc>
+      </w:tr>
+      <w:tr>
+        <w:trPr>
+          <w:trHeight w:val="432" w:hRule="exact"/>
+          <w:cantSplit/>
+        </w:trPr>
+        <w:tc>
+          <w:tcPr>
+            <w:tcW w:type="dxa" w:w="10080"/>
+            <w:tcBorders>
+              <w:top w:val="single" w:sz="4" w:color="808080" w:space="0"/>
+              <w:left w:val="single" w:sz="10" w:color="000000" w:space="0"/>
+              <w:bottom w:val="single" w:sz="4" w:color="808080" w:space="0"/>
+              <w:right w:val="single" w:sz="10" w:color="000000" w:space="0"/>
+            </w:tcBorders>
+          </w:tcPr>
+          <w:p>
+            <w:pPr>
+              <w:keepNext/>
+              <w:spacing w:after="0"/>
+            </w:pPr>
+          </w:p>
+        </w:tc>
+      </w:tr>
+      <w:tr>
+        <w:trPr>
+          <w:trHeight w:val="432" w:hRule="exact"/>
+          <w:cantSplit/>
+        </w:trPr>
+        <w:tc>
+          <w:tcPr>
+            <w:tcW w:type="dxa" w:w="10080"/>
+            <w:tcBorders>
+              <w:top w:val="single" w:sz="4" w:color="808080" w:space="0"/>
+              <w:left w:val="single" w:sz="10" w:color="000000" w:space="0"/>
+              <w:bottom w:val="single" w:sz="10" w:color="000000" w:space="0"/>
+              <w:right w:val="single" w:sz="10" w:color="000000" w:space="0"/>
+            </w:tcBorders>
+          </w:tcPr>
+          <w:p>
+            <w:pPr>
+              <w:spacing w:after="0"/>
+            </w:pPr>
+          </w:p>
+        </w:tc>
+      </w:tr>
+    </w:tbl>
+    <w:p>
+      <w:pPr>
+        <w:spacing w:before="0" w:after="40"/>
+      </w:pPr>
+    </w:p>
+    <w:p>
+      <w:pPr>
+        <w:keepNext/>
+        <w:spacing w:before="160" w:after="40"/>
+      </w:pPr>
+      <w:r>
+        <w:rPr>
+          <w:rFonts w:ascii="Times New Roman" w:hAnsi="Times New Roman" w:eastAsia="Times New Roman"/>
+          <w:b/>
+          <w:i w:val="0"/>
+          <w:sz w:val="25"/>
+        </w:rPr>
+        <w:t xml:space="preserve">2.5  </w:t>
+      </w:r>
+      <w:r>
+        <w:rPr>
+          <w:rFonts w:ascii="Times New Roman" w:hAnsi="Times New Roman" w:eastAsia="Times New Roman"/>
+          <w:b/>
+          <w:i w:val="0"/>
+          <w:sz w:val="25"/>
+        </w:rPr>
+        <w:t>The Agitation Event at 0245</w:t>
+      </w:r>
+      <w:r>
+        <w:rPr>
+          <w:rFonts w:ascii="Times New Roman" w:hAnsi="Times New Roman" w:eastAsia="Times New Roman"/>
+          <w:b w:val="0"/>
+          <w:i/>
+          <w:color w:val="444444"/>
+          <w:sz w:val="21"/>
+        </w:rPr>
+        <w:t xml:space="preserve">   (2 pts)</w:t>
+      </w:r>
+    </w:p>
+    <w:p>
+      <w:pPr>
+        <w:keepNext/>
+        <w:spacing w:before="0" w:after="40"/>
+      </w:pPr>
+      <w:r>
+        <w:rPr>
+          <w:rFonts w:ascii="Times New Roman" w:hAnsi="Times New Roman" w:eastAsia="Times New Roman"/>
+          <w:b w:val="0"/>
+          <w:i w:val="0"/>
+          <w:sz w:val="23"/>
+        </w:rPr>
+        <w:t>Read the 0320 nursing note. Marcus (RASS -3 earlier) becomes restless, thrashes his head, bites the endotracheal tube and the ventilator pressure alarms sound. (a) In order, what do you check and do FIRST, before any medication, and why? (b) The provider orders lorazepam 1 mg IV. Name one concern about giving a benzodiazepine to this patient and one question you could ask the provider. (c) What are the rules for the soft wrist restraint you are using? (d) Besides the 0300 recheck, what do you document and who do you notify?</w:t>
+      </w:r>
+    </w:p>
+    <w:p>
+      <w:pPr>
+        <w:keepNext/>
+        <w:spacing w:before="0" w:after="60"/>
+      </w:pPr>
+      <w:r>
+        <w:rPr>
+          <w:rFonts w:ascii="Times New Roman" w:hAnsi="Times New Roman" w:eastAsia="Times New Roman"/>
+          <w:b w:val="0"/>
+          <w:i/>
+          <w:color w:val="555555"/>
+          <w:sz w:val="19"/>
+        </w:rPr>
+        <w:t>Where to look in the EHR: Chart Review &gt; Notes (Nursing Note 0320); Orders (soft wrist restraint, lorazepam); Flowsheets (RASS, CPOT, ventilator); MAR</w:t>
+      </w:r>
+    </w:p>
+    <w:tbl>
+      <w:tblPr>
+        <w:tblW w:type="auto" w:w="0"/>
+        <w:jc w:val="center"/>
+        <w:tblLayout w:type="fixed"/>
+        <w:tblLook w:firstColumn="1" w:firstRow="1" w:lastColumn="0" w:lastRow="0" w:noHBand="0" w:noVBand="1" w:val="04A0"/>
+      </w:tblPr>
+      <w:tblGrid>
+        <w:gridCol w:w="10080"/>
+      </w:tblGrid>
+      <w:tr>
+        <w:trPr>
+          <w:trHeight w:val="432" w:hRule="exact"/>
+          <w:cantSplit/>
+        </w:trPr>
+        <w:tc>
+          <w:tcPr>
+            <w:tcW w:type="dxa" w:w="10080"/>
+            <w:tcBorders>
+              <w:top w:val="single" w:sz="10" w:color="000000" w:space="0"/>
+              <w:left w:val="single" w:sz="10" w:color="000000" w:space="0"/>
+              <w:bottom w:val="single" w:sz="4" w:color="808080" w:space="0"/>
+              <w:right w:val="single" w:sz="10" w:color="000000" w:space="0"/>
+            </w:tcBorders>
+          </w:tcPr>
+          <w:p>
+            <w:pPr>
+              <w:keepNext/>
+              <w:spacing w:after="0"/>
+            </w:pPr>
+          </w:p>
+        </w:tc>
+      </w:tr>
+      <w:tr>
+        <w:trPr>
+          <w:trHeight w:val="432" w:hRule="exact"/>
+          <w:cantSplit/>
+        </w:trPr>
+        <w:tc>
+          <w:tcPr>
+            <w:tcW w:type="dxa" w:w="10080"/>
+            <w:tcBorders>
+              <w:top w:val="single" w:sz="4" w:color="808080" w:space="0"/>
+              <w:left w:val="single" w:sz="10" w:color="000000" w:space="0"/>
+              <w:bottom w:val="single" w:sz="4" w:color="808080" w:space="0"/>
+              <w:right w:val="single" w:sz="10" w:color="000000" w:space="0"/>
+            </w:tcBorders>
+          </w:tcPr>
+          <w:p>
+            <w:pPr>
+              <w:keepNext/>
+              <w:spacing w:after="0"/>
+            </w:pPr>
+          </w:p>
+        </w:tc>
+      </w:tr>
+      <w:tr>
+        <w:trPr>
+          <w:trHeight w:val="432" w:hRule="exact"/>
+          <w:cantSplit/>
+        </w:trPr>
+        <w:tc>
+          <w:tcPr>
+            <w:tcW w:type="dxa" w:w="10080"/>
+            <w:tcBorders>
+              <w:top w:val="single" w:sz="4" w:color="808080" w:space="0"/>
+              <w:left w:val="single" w:sz="10" w:color="000000" w:space="0"/>
+              <w:bottom w:val="single" w:sz="4" w:color="808080" w:space="0"/>
+              <w:right w:val="single" w:sz="10" w:color="000000" w:space="0"/>
+            </w:tcBorders>
+          </w:tcPr>
+          <w:p>
+            <w:pPr>
+              <w:keepNext/>
+              <w:spacing w:after="0"/>
+            </w:pPr>
+          </w:p>
+        </w:tc>
+      </w:tr>
+      <w:tr>
+        <w:trPr>
+          <w:trHeight w:val="432" w:hRule="exact"/>
+          <w:cantSplit/>
+        </w:trPr>
+        <w:tc>
+          <w:tcPr>
+            <w:tcW w:type="dxa" w:w="10080"/>
+            <w:tcBorders>
+              <w:top w:val="single" w:sz="4" w:color="808080" w:space="0"/>
+              <w:left w:val="single" w:sz="10" w:color="000000" w:space="0"/>
+              <w:bottom w:val="single" w:sz="4" w:color="808080" w:space="0"/>
+              <w:right w:val="single" w:sz="10" w:color="000000" w:space="0"/>
+            </w:tcBorders>
+          </w:tcPr>
+          <w:p>
+            <w:pPr>
+              <w:keepNext/>
+              <w:spacing w:after="0"/>
+            </w:pPr>
+          </w:p>
+        </w:tc>
+      </w:tr>
+      <w:tr>
+        <w:trPr>
+          <w:trHeight w:val="432" w:hRule="exact"/>
+          <w:cantSplit/>
+        </w:trPr>
+        <w:tc>
+          <w:tcPr>
+            <w:tcW w:type="dxa" w:w="10080"/>
+            <w:tcBorders>
+              <w:top w:val="single" w:sz="4" w:color="808080" w:space="0"/>
+              <w:left w:val="single" w:sz="10" w:color="000000" w:space="0"/>
+              <w:bottom w:val="single" w:sz="4" w:color="808080" w:space="0"/>
+              <w:right w:val="single" w:sz="10" w:color="000000" w:space="0"/>
+            </w:tcBorders>
+          </w:tcPr>
+          <w:p>
+            <w:pPr>
+              <w:keepNext/>
+              <w:spacing w:after="0"/>
+            </w:pPr>
+          </w:p>
+        </w:tc>
+      </w:tr>
+      <w:tr>
+        <w:trPr>
+          <w:trHeight w:val="432" w:hRule="exact"/>
+          <w:cantSplit/>
+        </w:trPr>
+        <w:tc>
+          <w:tcPr>
+            <w:tcW w:type="dxa" w:w="10080"/>
+            <w:tcBorders>
+              <w:top w:val="single" w:sz="4" w:color="808080" w:space="0"/>
+              <w:left w:val="single" w:sz="10" w:color="000000" w:space="0"/>
+              <w:bottom w:val="single" w:sz="4" w:color="808080" w:space="0"/>
+              <w:right w:val="single" w:sz="10" w:color="000000" w:space="0"/>
+            </w:tcBorders>
+          </w:tcPr>
+          <w:p>
+            <w:pPr>
+              <w:keepNext/>
+              <w:spacing w:after="0"/>
+            </w:pPr>
+          </w:p>
+        </w:tc>
+      </w:tr>
+      <w:tr>
+        <w:trPr>
+          <w:trHeight w:val="432" w:hRule="exact"/>
+          <w:cantSplit/>
+        </w:trPr>
+        <w:tc>
+          <w:tcPr>
+            <w:tcW w:type="dxa" w:w="10080"/>
+            <w:tcBorders>
+              <w:top w:val="single" w:sz="4" w:color="808080" w:space="0"/>
+              <w:left w:val="single" w:sz="10" w:color="000000" w:space="0"/>
+              <w:bottom w:val="single" w:sz="4" w:color="808080" w:space="0"/>
+              <w:right w:val="single" w:sz="10" w:color="000000" w:space="0"/>
+            </w:tcBorders>
+          </w:tcPr>
+          <w:p>
+            <w:pPr>
+              <w:keepNext/>
+              <w:spacing w:after="0"/>
+            </w:pPr>
+          </w:p>
+        </w:tc>
+      </w:tr>
+      <w:tr>
+        <w:trPr>
+          <w:trHeight w:val="432" w:hRule="exact"/>
+          <w:cantSplit/>
+        </w:trPr>
+        <w:tc>
+          <w:tcPr>
+            <w:tcW w:type="dxa" w:w="10080"/>
+            <w:tcBorders>
+              <w:top w:val="single" w:sz="4" w:color="808080" w:space="0"/>
+              <w:left w:val="single" w:sz="10" w:color="000000" w:space="0"/>
+              <w:bottom w:val="single" w:sz="4" w:color="808080" w:space="0"/>
+              <w:right w:val="single" w:sz="10" w:color="000000" w:space="0"/>
+            </w:tcBorders>
+          </w:tcPr>
+          <w:p>
+            <w:pPr>
+              <w:keepNext/>
+              <w:spacing w:after="0"/>
+            </w:pPr>
+          </w:p>
+        </w:tc>
+      </w:tr>
+      <w:tr>
+        <w:trPr>
+          <w:trHeight w:val="432" w:hRule="exact"/>
+          <w:cantSplit/>
+        </w:trPr>
+        <w:tc>
+          <w:tcPr>
+            <w:tcW w:type="dxa" w:w="10080"/>
+            <w:tcBorders>
+              <w:top w:val="single" w:sz="4" w:color="808080" w:space="0"/>
+              <w:left w:val="single" w:sz="10" w:color="000000" w:space="0"/>
+              <w:bottom w:val="single" w:sz="4" w:color="808080" w:space="0"/>
+              <w:right w:val="single" w:sz="10" w:color="000000" w:space="0"/>
+            </w:tcBorders>
+          </w:tcPr>
+          <w:p>
+            <w:pPr>
+              <w:keepNext/>
+              <w:spacing w:after="0"/>
+            </w:pPr>
+          </w:p>
+        </w:tc>
+      </w:tr>
+      <w:tr>
+        <w:trPr>
+          <w:trHeight w:val="432" w:hRule="exact"/>
+          <w:cantSplit/>
+        </w:trPr>
+        <w:tc>
+          <w:tcPr>
+            <w:tcW w:type="dxa" w:w="10080"/>
+            <w:tcBorders>
+              <w:top w:val="single" w:sz="4" w:color="808080" w:space="0"/>
+              <w:left w:val="single" w:sz="10" w:color="000000" w:space="0"/>
+              <w:bottom w:val="single" w:sz="4" w:color="808080" w:space="0"/>
+              <w:right w:val="single" w:sz="10" w:color="000000" w:space="0"/>
+            </w:tcBorders>
+          </w:tcPr>
+          <w:p>
+            <w:pPr>
+              <w:keepNext/>
+              <w:spacing w:after="0"/>
+            </w:pPr>
+          </w:p>
+        </w:tc>
+      </w:tr>
+      <w:tr>
+        <w:trPr>
+          <w:trHeight w:val="432" w:hRule="exact"/>
+          <w:cantSplit/>
+        </w:trPr>
+        <w:tc>
+          <w:tcPr>
+            <w:tcW w:type="dxa" w:w="10080"/>
+            <w:tcBorders>
+              <w:top w:val="single" w:sz="4" w:color="808080" w:space="0"/>
+              <w:left w:val="single" w:sz="10" w:color="000000" w:space="0"/>
+              <w:bottom w:val="single" w:sz="4" w:color="808080" w:space="0"/>
+              <w:right w:val="single" w:sz="10" w:color="000000" w:space="0"/>
+            </w:tcBorders>
+          </w:tcPr>
+          <w:p>
+            <w:pPr>
+              <w:keepNext/>
+              <w:spacing w:after="0"/>
+            </w:pPr>
+          </w:p>
+        </w:tc>
+      </w:tr>
+      <w:tr>
+        <w:trPr>
+          <w:trHeight w:val="432" w:hRule="exact"/>
+          <w:cantSplit/>
+        </w:trPr>
+        <w:tc>
+          <w:tcPr>
+            <w:tcW w:type="dxa" w:w="10080"/>
+            <w:tcBorders>
+              <w:top w:val="single" w:sz="4" w:color="808080" w:space="0"/>
+              <w:left w:val="single" w:sz="10" w:color="000000" w:space="0"/>
+              <w:bottom w:val="single" w:sz="4" w:color="808080" w:space="0"/>
+              <w:right w:val="single" w:sz="10" w:color="000000" w:space="0"/>
+            </w:tcBorders>
+          </w:tcPr>
+          <w:p>
+            <w:pPr>
+              <w:keepNext/>
+              <w:spacing w:after="0"/>
+            </w:pPr>
+          </w:p>
+        </w:tc>
+      </w:tr>
+      <w:tr>
+        <w:trPr>
+          <w:trHeight w:val="432" w:hRule="exact"/>
+          <w:cantSplit/>
+        </w:trPr>
+        <w:tc>
+          <w:tcPr>
+            <w:tcW w:type="dxa" w:w="10080"/>
+            <w:tcBorders>
+              <w:top w:val="single" w:sz="4" w:color="808080" w:space="0"/>
+              <w:left w:val="single" w:sz="10" w:color="000000" w:space="0"/>
+              <w:bottom w:val="single" w:sz="4" w:color="808080" w:space="0"/>
+              <w:right w:val="single" w:sz="10" w:color="000000" w:space="0"/>
+            </w:tcBorders>
+          </w:tcPr>
+          <w:p>
+            <w:pPr>
+              <w:keepNext/>
+              <w:spacing w:after="0"/>
+            </w:pPr>
+          </w:p>
+        </w:tc>
+      </w:tr>
+      <w:tr>
+        <w:trPr>
+          <w:trHeight w:val="432" w:hRule="exact"/>
+          <w:cantSplit/>
+        </w:trPr>
+        <w:tc>
+          <w:tcPr>
+            <w:tcW w:type="dxa" w:w="10080"/>
+            <w:tcBorders>
+              <w:top w:val="single" w:sz="4" w:color="808080" w:space="0"/>
+              <w:left w:val="single" w:sz="10" w:color="000000" w:space="0"/>
+              <w:bottom w:val="single" w:sz="4" w:color="808080" w:space="0"/>
+              <w:right w:val="single" w:sz="10" w:color="000000" w:space="0"/>
+            </w:tcBorders>
+          </w:tcPr>
+          <w:p>
+            <w:pPr>
+              <w:keepNext/>
+              <w:spacing w:after="0"/>
+            </w:pPr>
+          </w:p>
+        </w:tc>
+      </w:tr>
+      <w:tr>
+        <w:trPr>
+          <w:trHeight w:val="432" w:hRule="exact"/>
+          <w:cantSplit/>
+        </w:trPr>
+        <w:tc>
+          <w:tcPr>
+            <w:tcW w:type="dxa" w:w="10080"/>
+            <w:tcBorders>
+              <w:top w:val="single" w:sz="4" w:color="808080" w:space="0"/>
+              <w:left w:val="single" w:sz="10" w:color="000000" w:space="0"/>
+              <w:bottom w:val="single" w:sz="4" w:color="808080" w:space="0"/>
+              <w:right w:val="single" w:sz="10" w:color="000000" w:space="0"/>
+            </w:tcBorders>
+          </w:tcPr>
+          <w:p>
+            <w:pPr>
+              <w:keepNext/>
+              <w:spacing w:after="0"/>
+            </w:pPr>
+          </w:p>
+        </w:tc>
+      </w:tr>
+      <w:tr>
+        <w:trPr>
+          <w:trHeight w:val="432" w:hRule="exact"/>
+          <w:cantSplit/>
+        </w:trPr>
+        <w:tc>
+          <w:tcPr>
+            <w:tcW w:type="dxa" w:w="10080"/>
+            <w:tcBorders>
+              <w:top w:val="single" w:sz="4" w:color="808080" w:space="0"/>
+              <w:left w:val="single" w:sz="10" w:color="000000" w:space="0"/>
+              <w:bottom w:val="single" w:sz="4" w:color="808080" w:space="0"/>
+              <w:right w:val="single" w:sz="10" w:color="000000" w:space="0"/>
+            </w:tcBorders>
+          </w:tcPr>
+          <w:p>
+            <w:pPr>
+              <w:keepNext/>
+              <w:spacing w:after="0"/>
+            </w:pPr>
+          </w:p>
+        </w:tc>
+      </w:tr>
+      <w:tr>
+        <w:trPr>
+          <w:trHeight w:val="432" w:hRule="exact"/>
+          <w:cantSplit/>
+        </w:trPr>
+        <w:tc>
+          <w:tcPr>
+            <w:tcW w:type="dxa" w:w="10080"/>
+            <w:tcBorders>
+              <w:top w:val="single" w:sz="4" w:color="808080" w:space="0"/>
+              <w:left w:val="single" w:sz="10" w:color="000000" w:space="0"/>
+              <w:bottom w:val="single" w:sz="4" w:color="808080" w:space="0"/>
+              <w:right w:val="single" w:sz="10" w:color="000000" w:space="0"/>
+            </w:tcBorders>
+          </w:tcPr>
+          <w:p>
+            <w:pPr>
+              <w:keepNext/>
+              <w:spacing w:after="0"/>
+            </w:pPr>
+          </w:p>
+        </w:tc>
+      </w:tr>
+      <w:tr>
+        <w:trPr>
+          <w:trHeight w:val="432" w:hRule="exact"/>
+          <w:cantSplit/>
+        </w:trPr>
+        <w:tc>
+          <w:tcPr>
+            <w:tcW w:type="dxa" w:w="10080"/>
+            <w:tcBorders>
+              <w:top w:val="single" w:sz="4" w:color="808080" w:space="0"/>
+              <w:left w:val="single" w:sz="10" w:color="000000" w:space="0"/>
+              <w:bottom w:val="single" w:sz="4" w:color="808080" w:space="0"/>
+              <w:right w:val="single" w:sz="10" w:color="000000" w:space="0"/>
+            </w:tcBorders>
+          </w:tcPr>
+          <w:p>
+            <w:pPr>
+              <w:keepNext/>
+              <w:spacing w:after="0"/>
+            </w:pPr>
+          </w:p>
+        </w:tc>
+      </w:tr>
+      <w:tr>
+        <w:trPr>
+          <w:trHeight w:val="432" w:hRule="exact"/>
+          <w:cantSplit/>
+        </w:trPr>
+        <w:tc>
+          <w:tcPr>
+            <w:tcW w:type="dxa" w:w="10080"/>
+            <w:tcBorders>
+              <w:top w:val="single" w:sz="4" w:color="808080" w:space="0"/>
+              <w:left w:val="single" w:sz="10" w:color="000000" w:space="0"/>
+              <w:bottom w:val="single" w:sz="4" w:color="808080" w:space="0"/>
+              <w:right w:val="single" w:sz="10" w:color="000000" w:space="0"/>
+            </w:tcBorders>
+          </w:tcPr>
+          <w:p>
+            <w:pPr>
+              <w:keepNext/>
+              <w:spacing w:after="0"/>
+            </w:pPr>
+          </w:p>
+        </w:tc>
+      </w:tr>
+      <w:tr>
+        <w:trPr>
+          <w:trHeight w:val="432" w:hRule="exact"/>
+          <w:cantSplit/>
+        </w:trPr>
+        <w:tc>
+          <w:tcPr>
+            <w:tcW w:type="dxa" w:w="10080"/>
+            <w:tcBorders>
+              <w:top w:val="single" w:sz="4" w:color="808080" w:space="0"/>
+              <w:left w:val="single" w:sz="10" w:color="000000" w:space="0"/>
+              <w:bottom w:val="single" w:sz="4" w:color="808080" w:space="0"/>
+              <w:right w:val="single" w:sz="10" w:color="000000" w:space="0"/>
+            </w:tcBorders>
+          </w:tcPr>
+          <w:p>
+            <w:pPr>
+              <w:keepNext/>
+              <w:spacing w:after="0"/>
+            </w:pPr>
+          </w:p>
+        </w:tc>
+      </w:tr>
+      <w:tr>
+        <w:trPr>
+          <w:trHeight w:val="432" w:hRule="exact"/>
+          <w:cantSplit/>
+        </w:trPr>
+        <w:tc>
+          <w:tcPr>
+            <w:tcW w:type="dxa" w:w="10080"/>
+            <w:tcBorders>
+              <w:top w:val="single" w:sz="4" w:color="808080" w:space="0"/>
+              <w:left w:val="single" w:sz="10" w:color="000000" w:space="0"/>
+              <w:bottom w:val="single" w:sz="4" w:color="808080" w:space="0"/>
+              <w:right w:val="single" w:sz="10" w:color="000000" w:space="0"/>
+            </w:tcBorders>
+          </w:tcPr>
+          <w:p>
+            <w:pPr>
+              <w:keepNext/>
+              <w:spacing w:after="0"/>
+            </w:pPr>
+          </w:p>
+        </w:tc>
+      </w:tr>
+      <w:tr>
+        <w:trPr>
+          <w:trHeight w:val="432" w:hRule="exact"/>
+          <w:cantSplit/>
+        </w:trPr>
+        <w:tc>
+          <w:tcPr>
+            <w:tcW w:type="dxa" w:w="10080"/>
+            <w:tcBorders>
+              <w:top w:val="single" w:sz="4" w:color="808080" w:space="0"/>
+              <w:left w:val="single" w:sz="10" w:color="000000" w:space="0"/>
+              <w:bottom w:val="single" w:sz="4" w:color="808080" w:space="0"/>
+              <w:right w:val="single" w:sz="10" w:color="000000" w:space="0"/>
+            </w:tcBorders>
+          </w:tcPr>
+          <w:p>
+            <w:pPr>
+              <w:keepNext/>
+              <w:spacing w:after="0"/>
+            </w:pPr>
+          </w:p>
+        </w:tc>
+      </w:tr>
+      <w:tr>
+        <w:trPr>
+          <w:trHeight w:val="432" w:hRule="exact"/>
+          <w:cantSplit/>
+        </w:trPr>
+        <w:tc>
+          <w:tcPr>
+            <w:tcW w:type="dxa" w:w="10080"/>
+            <w:tcBorders>
+              <w:top w:val="single" w:sz="4" w:color="808080" w:space="0"/>
+              <w:left w:val="single" w:sz="10" w:color="000000" w:space="0"/>
+              <w:bottom w:val="single" w:sz="10" w:color="000000" w:space="0"/>
+              <w:right w:val="single" w:sz="10" w:color="000000" w:space="0"/>
+            </w:tcBorders>
+          </w:tcPr>
+          <w:p>
+            <w:pPr>
+              <w:spacing w:after="0"/>
+            </w:pPr>
+          </w:p>
+        </w:tc>
+      </w:tr>
+    </w:tbl>
+    <w:p>
+      <w:pPr>
+        <w:spacing w:before="0" w:after="40"/>
+      </w:pPr>
+    </w:p>
+    <w:p>
+      <w:pPr>
+        <w:keepNext/>
+        <w:spacing w:before="160" w:after="40"/>
+      </w:pPr>
+      <w:r>
+        <w:rPr>
+          <w:rFonts w:ascii="Times New Roman" w:hAnsi="Times New Roman" w:eastAsia="Times New Roman"/>
+          <w:b/>
+          <w:i w:val="0"/>
+          <w:sz w:val="25"/>
+        </w:rPr>
+        <w:t xml:space="preserve">2.6  </w:t>
+      </w:r>
+      <w:r>
+        <w:rPr>
+          <w:rFonts w:ascii="Times New Roman" w:hAnsi="Times New Roman" w:eastAsia="Times New Roman"/>
+          <w:b/>
+          <w:i w:val="0"/>
+          <w:sz w:val="25"/>
+        </w:rPr>
+        <w:t>Checking the Right Hand and the Abdomen</w:t>
+      </w:r>
+      <w:r>
+        <w:rPr>
+          <w:rFonts w:ascii="Times New Roman" w:hAnsi="Times New Roman" w:eastAsia="Times New Roman"/>
+          <w:b w:val="0"/>
+          <w:i/>
+          <w:color w:val="444444"/>
+          <w:sz w:val="21"/>
+        </w:rPr>
+        <w:t xml:space="preserve">   (1.5 pts)</w:t>
+      </w:r>
+    </w:p>
+    <w:p>
+      <w:pPr>
+        <w:keepNext/>
+        <w:spacing w:before="0" w:after="40"/>
+      </w:pPr>
+      <w:r>
+        <w:rPr>
+          <w:rFonts w:ascii="Times New Roman" w:hAnsi="Times New Roman" w:eastAsia="Times New Roman"/>
+          <w:b w:val="0"/>
+          <w:i w:val="0"/>
+          <w:sz w:val="23"/>
+        </w:rPr>
+        <w:t>Compartment syndrome is a risk after a circumferential burn and a large fluid resuscitation. For each of the six Ps, write what you can or cannot check in Marcus (he is sedated and intubated) and what the chart showed at 2300-0300. Then name the abdominal check ordered every six hours.</w:t>
+      </w:r>
+    </w:p>
+    <w:p>
+      <w:pPr>
+        <w:keepNext/>
+        <w:spacing w:before="0" w:after="60"/>
+      </w:pPr>
+      <w:r>
+        <w:rPr>
+          <w:rFonts w:ascii="Times New Roman" w:hAnsi="Times New Roman" w:eastAsia="Times New Roman"/>
+          <w:b w:val="0"/>
+          <w:i/>
+          <w:color w:val="555555"/>
+          <w:sz w:val="19"/>
+        </w:rPr>
+        <w:t>Where to look in the EHR: Flowsheets &gt; Musculoskeletal / Mobility (Right Hand Neurovascular check); Nursing Notes; Orders (bladder pressure)</w:t>
+      </w:r>
+    </w:p>
+    <w:tbl>
+      <w:tblPr>
+        <w:tblW w:type="auto" w:w="0"/>
+        <w:jc w:val="center"/>
+        <w:tblLayout w:type="fixed"/>
+        <w:tblLook w:firstColumn="1" w:firstRow="1" w:lastColumn="0" w:lastRow="0" w:noHBand="0" w:noVBand="1" w:val="04A0"/>
+      </w:tblPr>
+      <w:tblGrid>
+        <w:gridCol w:w="2016"/>
+        <w:gridCol w:w="4320"/>
+        <w:gridCol w:w="3744"/>
+      </w:tblGrid>
+      <w:tr>
+        <w:tc>
+          <w:tcPr>
+            <w:tcW w:type="dxa" w:w="2016"/>
+            <w:shd w:val="clear" w:color="auto" w:fill="D9D9D9"/>
+            <w:tcBorders>
+              <w:top w:val="single" w:sz="10" w:color="000000" w:space="0"/>
+              <w:left w:val="single" w:sz="10" w:color="000000" w:space="0"/>
+              <w:bottom w:val="single" w:sz="10" w:color="000000" w:space="0"/>
+              <w:right w:val="single" w:sz="10" w:color="000000" w:space="0"/>
+            </w:tcBorders>
+          </w:tcPr>
+          <w:p>
+            <w:pPr>
+              <w:spacing w:after="0" w:before="0"/>
+            </w:pPr>
+            <w:r/>
+            <w:r>
+              <w:rPr>
+                <w:rFonts w:ascii="Times New Roman" w:hAnsi="Times New Roman" w:eastAsia="Times New Roman"/>
+                <w:b/>
+                <w:i w:val="0"/>
+                <w:sz w:val="19"/>
+              </w:rPr>
+              <w:t>The 6 Ps</w:t>
+            </w:r>
+          </w:p>
+        </w:tc>
+        <w:tc>
+          <w:tcPr>
+            <w:tcW w:type="dxa" w:w="4320"/>
+            <w:shd w:val="clear" w:color="auto" w:fill="D9D9D9"/>
+            <w:tcBorders>
+              <w:top w:val="single" w:sz="10" w:color="000000" w:space="0"/>
+              <w:left w:val="single" w:sz="10" w:color="000000" w:space="0"/>
+              <w:bottom w:val="single" w:sz="10" w:color="000000" w:space="0"/>
+              <w:right w:val="single" w:sz="10" w:color="000000" w:space="0"/>
+            </w:tcBorders>
+          </w:tcPr>
+          <w:p>
+            <w:pPr>
+              <w:spacing w:after="0" w:before="0"/>
+            </w:pPr>
+            <w:r/>
+            <w:r>
+              <w:rPr>
+                <w:rFonts w:ascii="Times New Roman" w:hAnsi="Times New Roman" w:eastAsia="Times New Roman"/>
+                <w:b/>
+                <w:i w:val="0"/>
+                <w:sz w:val="19"/>
+              </w:rPr>
+              <w:t>Can you check it in Marcus? How?</w:t>
+            </w:r>
+          </w:p>
+        </w:tc>
+        <w:tc>
+          <w:tcPr>
+            <w:tcW w:type="dxa" w:w="3744"/>
+            <w:shd w:val="clear" w:color="auto" w:fill="D9D9D9"/>
+            <w:tcBorders>
+              <w:top w:val="single" w:sz="10" w:color="000000" w:space="0"/>
+              <w:left w:val="single" w:sz="10" w:color="000000" w:space="0"/>
+              <w:bottom w:val="single" w:sz="10" w:color="000000" w:space="0"/>
+              <w:right w:val="single" w:sz="10" w:color="000000" w:space="0"/>
+            </w:tcBorders>
+          </w:tcPr>
+          <w:p>
+            <w:pPr>
+              <w:spacing w:after="0" w:before="0"/>
+            </w:pPr>
+            <w:r/>
+            <w:r>
+              <w:rPr>
+                <w:rFonts w:ascii="Times New Roman" w:hAnsi="Times New Roman" w:eastAsia="Times New Roman"/>
+                <w:b/>
+                <w:i w:val="0"/>
+                <w:sz w:val="19"/>
+              </w:rPr>
+              <w:t>What the chart showed</w:t>
+            </w:r>
+          </w:p>
+        </w:tc>
+      </w:tr>
+      <w:tr>
+        <w:trPr>
+          <w:trHeight w:val="1512" w:hRule="atLeast"/>
+          <w:cantSplit/>
+        </w:trPr>
+        <w:tc>
+          <w:tcPr>
+            <w:tcW w:type="dxa" w:w="2016"/>
+            <w:tcBorders>
+              <w:top w:val="single" w:sz="10" w:color="000000" w:space="0"/>
+              <w:left w:val="single" w:sz="10" w:color="000000" w:space="0"/>
+              <w:bottom w:val="single" w:sz="10" w:color="000000" w:space="0"/>
+              <w:right w:val="single" w:sz="10" w:color="000000" w:space="0"/>
+            </w:tcBorders>
+          </w:tcPr>
+          <w:p/>
+        </w:tc>
+        <w:tc>
+          <w:tcPr>
+            <w:tcW w:type="dxa" w:w="4320"/>
+            <w:tcBorders>
+              <w:top w:val="single" w:sz="10" w:color="000000" w:space="0"/>
+              <w:left w:val="single" w:sz="10" w:color="000000" w:space="0"/>
+              <w:bottom w:val="single" w:sz="10" w:color="000000" w:space="0"/>
+              <w:right w:val="single" w:sz="10" w:color="000000" w:space="0"/>
+            </w:tcBorders>
+          </w:tcPr>
+          <w:p/>
+        </w:tc>
+        <w:tc>
+          <w:tcPr>
+            <w:tcW w:type="dxa" w:w="3744"/>
+            <w:tcBorders>
+              <w:top w:val="single" w:sz="10" w:color="000000" w:space="0"/>
+              <w:left w:val="single" w:sz="10" w:color="000000" w:space="0"/>
+              <w:bottom w:val="single" w:sz="10" w:color="000000" w:space="0"/>
+              <w:right w:val="single" w:sz="10" w:color="000000" w:space="0"/>
+            </w:tcBorders>
+          </w:tcPr>
+          <w:p/>
+        </w:tc>
+      </w:tr>
+      <w:tr>
+        <w:trPr>
+          <w:trHeight w:val="1512" w:hRule="atLeast"/>
+          <w:cantSplit/>
+        </w:trPr>
+        <w:tc>
+          <w:tcPr>
+            <w:tcW w:type="dxa" w:w="2016"/>
+            <w:tcBorders>
+              <w:top w:val="single" w:sz="10" w:color="000000" w:space="0"/>
+              <w:left w:val="single" w:sz="10" w:color="000000" w:space="0"/>
+              <w:bottom w:val="single" w:sz="10" w:color="000000" w:space="0"/>
+              <w:right w:val="single" w:sz="10" w:color="000000" w:space="0"/>
+            </w:tcBorders>
+          </w:tcPr>
+          <w:p/>
+        </w:tc>
+        <w:tc>
+          <w:tcPr>
+            <w:tcW w:type="dxa" w:w="4320"/>
+            <w:tcBorders>
+              <w:top w:val="single" w:sz="10" w:color="000000" w:space="0"/>
+              <w:left w:val="single" w:sz="10" w:color="000000" w:space="0"/>
+              <w:bottom w:val="single" w:sz="10" w:color="000000" w:space="0"/>
+              <w:right w:val="single" w:sz="10" w:color="000000" w:space="0"/>
+            </w:tcBorders>
+          </w:tcPr>
+          <w:p/>
+        </w:tc>
+        <w:tc>
+          <w:tcPr>
+            <w:tcW w:type="dxa" w:w="3744"/>
+            <w:tcBorders>
+              <w:top w:val="single" w:sz="10" w:color="000000" w:space="0"/>
+              <w:left w:val="single" w:sz="10" w:color="000000" w:space="0"/>
+              <w:bottom w:val="single" w:sz="10" w:color="000000" w:space="0"/>
+              <w:right w:val="single" w:sz="10" w:color="000000" w:space="0"/>
+            </w:tcBorders>
+          </w:tcPr>
+          <w:p/>
+        </w:tc>
+      </w:tr>
+      <w:tr>
+        <w:trPr>
+          <w:trHeight w:val="1512" w:hRule="atLeast"/>
+          <w:cantSplit/>
+        </w:trPr>
+        <w:tc>
+          <w:tcPr>
+            <w:tcW w:type="dxa" w:w="2016"/>
+            <w:tcBorders>
+              <w:top w:val="single" w:sz="10" w:color="000000" w:space="0"/>
+              <w:left w:val="single" w:sz="10" w:color="000000" w:space="0"/>
+              <w:bottom w:val="single" w:sz="10" w:color="000000" w:space="0"/>
+              <w:right w:val="single" w:sz="10" w:color="000000" w:space="0"/>
+            </w:tcBorders>
+          </w:tcPr>
+          <w:p/>
+        </w:tc>
+        <w:tc>
+          <w:tcPr>
+            <w:tcW w:type="dxa" w:w="4320"/>
+            <w:tcBorders>
+              <w:top w:val="single" w:sz="10" w:color="000000" w:space="0"/>
+              <w:left w:val="single" w:sz="10" w:color="000000" w:space="0"/>
+              <w:bottom w:val="single" w:sz="10" w:color="000000" w:space="0"/>
+              <w:right w:val="single" w:sz="10" w:color="000000" w:space="0"/>
+            </w:tcBorders>
+          </w:tcPr>
+          <w:p/>
+        </w:tc>
+        <w:tc>
+          <w:tcPr>
+            <w:tcW w:type="dxa" w:w="3744"/>
+            <w:tcBorders>
+              <w:top w:val="single" w:sz="10" w:color="000000" w:space="0"/>
+              <w:left w:val="single" w:sz="10" w:color="000000" w:space="0"/>
+              <w:bottom w:val="single" w:sz="10" w:color="000000" w:space="0"/>
+              <w:right w:val="single" w:sz="10" w:color="000000" w:space="0"/>
+            </w:tcBorders>
+          </w:tcPr>
+          <w:p/>
+        </w:tc>
+      </w:tr>
+      <w:tr>
+        <w:trPr>
+          <w:trHeight w:val="1512" w:hRule="atLeast"/>
+          <w:cantSplit/>
+        </w:trPr>
+        <w:tc>
+          <w:tcPr>
+            <w:tcW w:type="dxa" w:w="2016"/>
+            <w:tcBorders>
+              <w:top w:val="single" w:sz="10" w:color="000000" w:space="0"/>
+              <w:left w:val="single" w:sz="10" w:color="000000" w:space="0"/>
+              <w:bottom w:val="single" w:sz="10" w:color="000000" w:space="0"/>
+              <w:right w:val="single" w:sz="10" w:color="000000" w:space="0"/>
+            </w:tcBorders>
+          </w:tcPr>
+          <w:p/>
+        </w:tc>
+        <w:tc>
+          <w:tcPr>
+            <w:tcW w:type="dxa" w:w="4320"/>
+            <w:tcBorders>
+              <w:top w:val="single" w:sz="10" w:color="000000" w:space="0"/>
+              <w:left w:val="single" w:sz="10" w:color="000000" w:space="0"/>
+              <w:bottom w:val="single" w:sz="10" w:color="000000" w:space="0"/>
+              <w:right w:val="single" w:sz="10" w:color="000000" w:space="0"/>
+            </w:tcBorders>
+          </w:tcPr>
+          <w:p/>
+        </w:tc>
+        <w:tc>
+          <w:tcPr>
+            <w:tcW w:type="dxa" w:w="3744"/>
+            <w:tcBorders>
+              <w:top w:val="single" w:sz="10" w:color="000000" w:space="0"/>
+              <w:left w:val="single" w:sz="10" w:color="000000" w:space="0"/>
+              <w:bottom w:val="single" w:sz="10" w:color="000000" w:space="0"/>
+              <w:right w:val="single" w:sz="10" w:color="000000" w:space="0"/>
+            </w:tcBorders>
+          </w:tcPr>
+          <w:p/>
+        </w:tc>
+      </w:tr>
+      <w:tr>
+        <w:trPr>
+          <w:trHeight w:val="1512" w:hRule="atLeast"/>
+          <w:cantSplit/>
+        </w:trPr>
+        <w:tc>
+          <w:tcPr>
+            <w:tcW w:type="dxa" w:w="2016"/>
+            <w:tcBorders>
+              <w:top w:val="single" w:sz="10" w:color="000000" w:space="0"/>
+              <w:left w:val="single" w:sz="10" w:color="000000" w:space="0"/>
+              <w:bottom w:val="single" w:sz="10" w:color="000000" w:space="0"/>
+              <w:right w:val="single" w:sz="10" w:color="000000" w:space="0"/>
+            </w:tcBorders>
+          </w:tcPr>
+          <w:p/>
+        </w:tc>
+        <w:tc>
+          <w:tcPr>
+            <w:tcW w:type="dxa" w:w="4320"/>
+            <w:tcBorders>
+              <w:top w:val="single" w:sz="10" w:color="000000" w:space="0"/>
+              <w:left w:val="single" w:sz="10" w:color="000000" w:space="0"/>
+              <w:bottom w:val="single" w:sz="10" w:color="000000" w:space="0"/>
+              <w:right w:val="single" w:sz="10" w:color="000000" w:space="0"/>
+            </w:tcBorders>
+          </w:tcPr>
+          <w:p/>
+        </w:tc>
+        <w:tc>
+          <w:tcPr>
+            <w:tcW w:type="dxa" w:w="3744"/>
+            <w:tcBorders>
+              <w:top w:val="single" w:sz="10" w:color="000000" w:space="0"/>
+              <w:left w:val="single" w:sz="10" w:color="000000" w:space="0"/>
+              <w:bottom w:val="single" w:sz="10" w:color="000000" w:space="0"/>
+              <w:right w:val="single" w:sz="10" w:color="000000" w:space="0"/>
+            </w:tcBorders>
+          </w:tcPr>
+          <w:p/>
+        </w:tc>
+      </w:tr>
+      <w:tr>
+        <w:trPr>
+          <w:trHeight w:val="1512" w:hRule="atLeast"/>
+          <w:cantSplit/>
+        </w:trPr>
+        <w:tc>
+          <w:tcPr>
+            <w:tcW w:type="dxa" w:w="2016"/>
+            <w:tcBorders>
+              <w:top w:val="single" w:sz="10" w:color="000000" w:space="0"/>
+              <w:left w:val="single" w:sz="10" w:color="000000" w:space="0"/>
+              <w:bottom w:val="single" w:sz="10" w:color="000000" w:space="0"/>
+              <w:right w:val="single" w:sz="10" w:color="000000" w:space="0"/>
+            </w:tcBorders>
+          </w:tcPr>
+          <w:p/>
+        </w:tc>
+        <w:tc>
+          <w:tcPr>
+            <w:tcW w:type="dxa" w:w="4320"/>
+            <w:tcBorders>
+              <w:top w:val="single" w:sz="10" w:color="000000" w:space="0"/>
+              <w:left w:val="single" w:sz="10" w:color="000000" w:space="0"/>
+              <w:bottom w:val="single" w:sz="10" w:color="000000" w:space="0"/>
+              <w:right w:val="single" w:sz="10" w:color="000000" w:space="0"/>
+            </w:tcBorders>
+          </w:tcPr>
+          <w:p/>
+        </w:tc>
+        <w:tc>
+          <w:tcPr>
+            <w:tcW w:type="dxa" w:w="3744"/>
+            <w:tcBorders>
+              <w:top w:val="single" w:sz="10" w:color="000000" w:space="0"/>
+              <w:left w:val="single" w:sz="10" w:color="000000" w:space="0"/>
+              <w:bottom w:val="single" w:sz="10" w:color="000000" w:space="0"/>
+              <w:right w:val="single" w:sz="10" w:color="000000" w:space="0"/>
+            </w:tcBorders>
+          </w:tcPr>
+          <w:p/>
+        </w:tc>
+      </w:tr>
+      <w:tr>
+        <w:trPr>
+          <w:trHeight w:val="1512" w:hRule="atLeast"/>
+          <w:cantSplit/>
+        </w:trPr>
+        <w:tc>
+          <w:tcPr>
+            <w:tcW w:type="dxa" w:w="2016"/>
+            <w:tcBorders>
+              <w:top w:val="single" w:sz="10" w:color="000000" w:space="0"/>
+              <w:left w:val="single" w:sz="10" w:color="000000" w:space="0"/>
+              <w:bottom w:val="single" w:sz="10" w:color="000000" w:space="0"/>
+              <w:right w:val="single" w:sz="10" w:color="000000" w:space="0"/>
+            </w:tcBorders>
+          </w:tcPr>
+          <w:p/>
+        </w:tc>
+        <w:tc>
+          <w:tcPr>
+            <w:tcW w:type="dxa" w:w="4320"/>
+            <w:tcBorders>
+              <w:top w:val="single" w:sz="10" w:color="000000" w:space="0"/>
+              <w:left w:val="single" w:sz="10" w:color="000000" w:space="0"/>
+              <w:bottom w:val="single" w:sz="10" w:color="000000" w:space="0"/>
+              <w:right w:val="single" w:sz="10" w:color="000000" w:space="0"/>
+            </w:tcBorders>
+          </w:tcPr>
+          <w:p/>
+        </w:tc>
+        <w:tc>
+          <w:tcPr>
+            <w:tcW w:type="dxa" w:w="3744"/>
+            <w:tcBorders>
+              <w:top w:val="single" w:sz="10" w:color="000000" w:space="0"/>
+              <w:left w:val="single" w:sz="10" w:color="000000" w:space="0"/>
+              <w:bottom w:val="single" w:sz="10" w:color="000000" w:space="0"/>
+              <w:right w:val="single" w:sz="10" w:color="000000" w:space="0"/>
+            </w:tcBorders>
+          </w:tcPr>
+          <w:p/>
+        </w:tc>
+      </w:tr>
+    </w:tbl>
+    <w:p>
+      <w:pPr>
+        <w:spacing w:before="0" w:after="40"/>
+      </w:pPr>
+    </w:p>
+    <w:p>
+      <w:pPr>
+        <w:keepNext/>
+        <w:spacing w:before="160" w:after="40"/>
+      </w:pPr>
+      <w:r>
+        <w:rPr>
+          <w:rFonts w:ascii="Times New Roman" w:hAnsi="Times New Roman" w:eastAsia="Times New Roman"/>
+          <w:b/>
+          <w:i w:val="0"/>
+          <w:sz w:val="25"/>
+        </w:rPr>
+        <w:t xml:space="preserve">2.7  </w:t>
+      </w:r>
+      <w:r>
+        <w:rPr>
+          <w:rFonts w:ascii="Times New Roman" w:hAnsi="Times New Roman" w:eastAsia="Times New Roman"/>
+          <w:b/>
+          <w:i w:val="0"/>
+          <w:sz w:val="25"/>
+        </w:rPr>
+        <w:t>Tube Feeding and Calories</w:t>
+      </w:r>
+      <w:r>
+        <w:rPr>
+          <w:rFonts w:ascii="Times New Roman" w:hAnsi="Times New Roman" w:eastAsia="Times New Roman"/>
+          <w:b w:val="0"/>
+          <w:i/>
+          <w:color w:val="444444"/>
+          <w:sz w:val="21"/>
+        </w:rPr>
+        <w:t xml:space="preserve">   (1.5 pts)</w:t>
+      </w:r>
+    </w:p>
+    <w:p>
+      <w:pPr>
+        <w:keepNext/>
+        <w:spacing w:before="0" w:after="40"/>
+      </w:pPr>
+      <w:r>
+        <w:rPr>
+          <w:rFonts w:ascii="Times New Roman" w:hAnsi="Times New Roman" w:eastAsia="Times New Roman"/>
+          <w:b w:val="0"/>
+          <w:i w:val="0"/>
+          <w:sz w:val="23"/>
+        </w:rPr>
+        <w:t>Open the tube feeding order and the flowsheet. (a) Write the advancing schedule from 1000 Monday and the rate at 0600 on Tuesday. (b) The formula is Osmolite 1.5, which has 1.5 kcal per mL and 62.7 g of protein per liter: how many calories and grams of protein will he receive in 24 hours at 70 mL/h? (c) Give two reasons burn patients are fed early through the gut. (d) What do you check before advancing, and what do you do for a residual over 500 mL?</w:t>
+      </w:r>
+    </w:p>
+    <w:p>
+      <w:pPr>
+        <w:keepNext/>
+        <w:spacing w:before="0" w:after="60"/>
+      </w:pPr>
+      <w:r>
+        <w:rPr>
+          <w:rFonts w:ascii="Times New Roman" w:hAnsi="Times New Roman" w:eastAsia="Times New Roman"/>
+          <w:b w:val="0"/>
+          <w:i/>
+          <w:color w:val="555555"/>
+          <w:sz w:val="19"/>
+        </w:rPr>
+        <w:t>Where to look in the EHR: Orders (Osmolite 1.5); Flowsheets &gt; GI (Diet / Feeding); Intake/Output; Chart Review (Nutrition Assessment)</w:t>
+      </w:r>
+    </w:p>
+    <w:tbl>
+      <w:tblPr>
+        <w:tblW w:type="auto" w:w="0"/>
+        <w:jc w:val="center"/>
+        <w:tblLayout w:type="fixed"/>
+        <w:tblLook w:firstColumn="1" w:firstRow="1" w:lastColumn="0" w:lastRow="0" w:noHBand="0" w:noVBand="1" w:val="04A0"/>
+      </w:tblPr>
+      <w:tblGrid>
+        <w:gridCol w:w="10080"/>
+      </w:tblGrid>
+      <w:tr>
+        <w:trPr>
+          <w:trHeight w:val="432" w:hRule="exact"/>
+          <w:cantSplit/>
+        </w:trPr>
+        <w:tc>
+          <w:tcPr>
+            <w:tcW w:type="dxa" w:w="10080"/>
+            <w:tcBorders>
+              <w:top w:val="single" w:sz="10" w:color="000000" w:space="0"/>
+              <w:left w:val="single" w:sz="10" w:color="000000" w:space="0"/>
+              <w:bottom w:val="single" w:sz="4" w:color="808080" w:space="0"/>
+              <w:right w:val="single" w:sz="10" w:color="000000" w:space="0"/>
+            </w:tcBorders>
+          </w:tcPr>
+          <w:p>
+            <w:pPr>
+              <w:keepNext/>
+              <w:spacing w:after="0"/>
+            </w:pPr>
+          </w:p>
+        </w:tc>
+      </w:tr>
+      <w:tr>
+        <w:trPr>
+          <w:trHeight w:val="432" w:hRule="exact"/>
+          <w:cantSplit/>
+        </w:trPr>
+        <w:tc>
+          <w:tcPr>
+            <w:tcW w:type="dxa" w:w="10080"/>
+            <w:tcBorders>
+              <w:top w:val="single" w:sz="4" w:color="808080" w:space="0"/>
+              <w:left w:val="single" w:sz="10" w:color="000000" w:space="0"/>
+              <w:bottom w:val="single" w:sz="4" w:color="808080" w:space="0"/>
+              <w:right w:val="single" w:sz="10" w:color="000000" w:space="0"/>
+            </w:tcBorders>
+          </w:tcPr>
+          <w:p>
+            <w:pPr>
+              <w:keepNext/>
+              <w:spacing w:after="0"/>
+            </w:pPr>
+          </w:p>
+        </w:tc>
+      </w:tr>
+      <w:tr>
+        <w:trPr>
+          <w:trHeight w:val="432" w:hRule="exact"/>
+          <w:cantSplit/>
+        </w:trPr>
+        <w:tc>
+          <w:tcPr>
+            <w:tcW w:type="dxa" w:w="10080"/>
+            <w:tcBorders>
+              <w:top w:val="single" w:sz="4" w:color="808080" w:space="0"/>
+              <w:left w:val="single" w:sz="10" w:color="000000" w:space="0"/>
+              <w:bottom w:val="single" w:sz="4" w:color="808080" w:space="0"/>
+              <w:right w:val="single" w:sz="10" w:color="000000" w:space="0"/>
+            </w:tcBorders>
+          </w:tcPr>
+          <w:p>
+            <w:pPr>
+              <w:keepNext/>
+              <w:spacing w:after="0"/>
+            </w:pPr>
+          </w:p>
+        </w:tc>
+      </w:tr>
+      <w:tr>
+        <w:trPr>
+          <w:trHeight w:val="432" w:hRule="exact"/>
+          <w:cantSplit/>
+        </w:trPr>
+        <w:tc>
+          <w:tcPr>
+            <w:tcW w:type="dxa" w:w="10080"/>
+            <w:tcBorders>
+              <w:top w:val="single" w:sz="4" w:color="808080" w:space="0"/>
+              <w:left w:val="single" w:sz="10" w:color="000000" w:space="0"/>
+              <w:bottom w:val="single" w:sz="4" w:color="808080" w:space="0"/>
+              <w:right w:val="single" w:sz="10" w:color="000000" w:space="0"/>
+            </w:tcBorders>
+          </w:tcPr>
+          <w:p>
+            <w:pPr>
+              <w:keepNext/>
+              <w:spacing w:after="0"/>
+            </w:pPr>
+          </w:p>
+        </w:tc>
+      </w:tr>
+      <w:tr>
+        <w:trPr>
+          <w:trHeight w:val="432" w:hRule="exact"/>
+          <w:cantSplit/>
+        </w:trPr>
+        <w:tc>
+          <w:tcPr>
+            <w:tcW w:type="dxa" w:w="10080"/>
+            <w:tcBorders>
+              <w:top w:val="single" w:sz="4" w:color="808080" w:space="0"/>
+              <w:left w:val="single" w:sz="10" w:color="000000" w:space="0"/>
+              <w:bottom w:val="single" w:sz="4" w:color="808080" w:space="0"/>
+              <w:right w:val="single" w:sz="10" w:color="000000" w:space="0"/>
+            </w:tcBorders>
+          </w:tcPr>
+          <w:p>
+            <w:pPr>
+              <w:keepNext/>
+              <w:spacing w:after="0"/>
+            </w:pPr>
+          </w:p>
+        </w:tc>
+      </w:tr>
+      <w:tr>
+        <w:trPr>
+          <w:trHeight w:val="432" w:hRule="exact"/>
+          <w:cantSplit/>
+        </w:trPr>
+        <w:tc>
+          <w:tcPr>
+            <w:tcW w:type="dxa" w:w="10080"/>
+            <w:tcBorders>
+              <w:top w:val="single" w:sz="4" w:color="808080" w:space="0"/>
+              <w:left w:val="single" w:sz="10" w:color="000000" w:space="0"/>
+              <w:bottom w:val="single" w:sz="4" w:color="808080" w:space="0"/>
+              <w:right w:val="single" w:sz="10" w:color="000000" w:space="0"/>
+            </w:tcBorders>
+          </w:tcPr>
+          <w:p>
+            <w:pPr>
+              <w:keepNext/>
+              <w:spacing w:after="0"/>
+            </w:pPr>
+          </w:p>
+        </w:tc>
+      </w:tr>
+      <w:tr>
+        <w:trPr>
+          <w:trHeight w:val="432" w:hRule="exact"/>
+          <w:cantSplit/>
+        </w:trPr>
+        <w:tc>
+          <w:tcPr>
+            <w:tcW w:type="dxa" w:w="10080"/>
+            <w:tcBorders>
+              <w:top w:val="single" w:sz="4" w:color="808080" w:space="0"/>
+              <w:left w:val="single" w:sz="10" w:color="000000" w:space="0"/>
+              <w:bottom w:val="single" w:sz="4" w:color="808080" w:space="0"/>
+              <w:right w:val="single" w:sz="10" w:color="000000" w:space="0"/>
+            </w:tcBorders>
+          </w:tcPr>
+          <w:p>
+            <w:pPr>
+              <w:keepNext/>
+              <w:spacing w:after="0"/>
+            </w:pPr>
+          </w:p>
+        </w:tc>
+      </w:tr>
+      <w:tr>
+        <w:trPr>
+          <w:trHeight w:val="432" w:hRule="exact"/>
+          <w:cantSplit/>
+        </w:trPr>
+        <w:tc>
+          <w:tcPr>
+            <w:tcW w:type="dxa" w:w="10080"/>
+            <w:tcBorders>
+              <w:top w:val="single" w:sz="4" w:color="808080" w:space="0"/>
+              <w:left w:val="single" w:sz="10" w:color="000000" w:space="0"/>
+              <w:bottom w:val="single" w:sz="4" w:color="808080" w:space="0"/>
+              <w:right w:val="single" w:sz="10" w:color="000000" w:space="0"/>
+            </w:tcBorders>
+          </w:tcPr>
+          <w:p>
+            <w:pPr>
+              <w:keepNext/>
+              <w:spacing w:after="0"/>
+            </w:pPr>
+          </w:p>
+        </w:tc>
+      </w:tr>
+      <w:tr>
+        <w:trPr>
+          <w:trHeight w:val="432" w:hRule="exact"/>
+          <w:cantSplit/>
+        </w:trPr>
+        <w:tc>
+          <w:tcPr>
+            <w:tcW w:type="dxa" w:w="10080"/>
+            <w:tcBorders>
+              <w:top w:val="single" w:sz="4" w:color="808080" w:space="0"/>
+              <w:left w:val="single" w:sz="10" w:color="000000" w:space="0"/>
+              <w:bottom w:val="single" w:sz="10" w:color="000000" w:space="0"/>
+              <w:right w:val="single" w:sz="10" w:color="000000" w:space="0"/>
+            </w:tcBorders>
+          </w:tcPr>
+          <w:p>
+            <w:pPr>
+              <w:spacing w:after="0"/>
+            </w:pPr>
+          </w:p>
+        </w:tc>
+      </w:tr>
+    </w:tbl>
+    <w:p>
+      <w:pPr>
+        <w:spacing w:before="0" w:after="40"/>
+      </w:pPr>
+    </w:p>
+    <w:p>
+      <w:pPr>
+        <w:keepNext/>
+        <w:spacing w:before="160" w:after="40"/>
+      </w:pPr>
+      <w:r>
+        <w:rPr>
+          <w:rFonts w:ascii="Times New Roman" w:hAnsi="Times New Roman" w:eastAsia="Times New Roman"/>
+          <w:b/>
+          <w:i w:val="0"/>
+          <w:sz w:val="25"/>
+        </w:rPr>
+        <w:t xml:space="preserve">2.8  </w:t>
+      </w:r>
+      <w:r>
+        <w:rPr>
+          <w:rFonts w:ascii="Times New Roman" w:hAnsi="Times New Roman" w:eastAsia="Times New Roman"/>
+          <w:b/>
+          <w:i w:val="0"/>
+          <w:sz w:val="25"/>
+        </w:rPr>
+        <w:t>The Midnight and 0600 Labs</w:t>
+      </w:r>
+      <w:r>
+        <w:rPr>
+          <w:rFonts w:ascii="Times New Roman" w:hAnsi="Times New Roman" w:eastAsia="Times New Roman"/>
+          <w:b w:val="0"/>
+          <w:i/>
+          <w:color w:val="444444"/>
+          <w:sz w:val="21"/>
+        </w:rPr>
+        <w:t xml:space="preserve">   (1.5 pts)</w:t>
+      </w:r>
+    </w:p>
+    <w:p>
+      <w:pPr>
+        <w:keepNext/>
+        <w:spacing w:before="0" w:after="40"/>
+      </w:pPr>
+      <w:r>
+        <w:rPr>
+          <w:rFonts w:ascii="Times New Roman" w:hAnsi="Times New Roman" w:eastAsia="Times New Roman"/>
+          <w:b w:val="0"/>
+          <w:i w:val="0"/>
+          <w:sz w:val="23"/>
+        </w:rPr>
+        <w:t>Open Lab Results and compare the 0000 and 0600 draws (and the 0500 albumin and coagulation labs) with the day shift values. Choose FOUR results. Write the values, why they happen in a burn patient on propofol and tube feeding, and what you do or ask for.</w:t>
+      </w:r>
+    </w:p>
+    <w:p>
+      <w:pPr>
+        <w:keepNext/>
+        <w:spacing w:before="0" w:after="60"/>
+      </w:pPr>
+      <w:r>
+        <w:rPr>
+          <w:rFonts w:ascii="Times New Roman" w:hAnsi="Times New Roman" w:eastAsia="Times New Roman"/>
+          <w:b w:val="0"/>
+          <w:i/>
+          <w:color w:val="555555"/>
+          <w:sz w:val="19"/>
+        </w:rPr>
+        <w:t>Where to look in the EHR: Lab Results (Chemistry, CBC, Coagulation, Blood Gas)</w:t>
+      </w:r>
+    </w:p>
+    <w:tbl>
+      <w:tblPr>
+        <w:tblW w:type="auto" w:w="0"/>
+        <w:jc w:val="center"/>
+        <w:tblLayout w:type="fixed"/>
+        <w:tblLook w:firstColumn="1" w:firstRow="1" w:lastColumn="0" w:lastRow="0" w:noHBand="0" w:noVBand="1" w:val="04A0"/>
+      </w:tblPr>
+      <w:tblGrid>
+        <w:gridCol w:w="2736"/>
+        <w:gridCol w:w="3888"/>
+        <w:gridCol w:w="3456"/>
+      </w:tblGrid>
+      <w:tr>
+        <w:tc>
+          <w:tcPr>
+            <w:tcW w:type="dxa" w:w="2736"/>
+            <w:shd w:val="clear" w:color="auto" w:fill="D9D9D9"/>
+            <w:tcBorders>
+              <w:top w:val="single" w:sz="10" w:color="000000" w:space="0"/>
+              <w:left w:val="single" w:sz="10" w:color="000000" w:space="0"/>
+              <w:bottom w:val="single" w:sz="10" w:color="000000" w:space="0"/>
+              <w:right w:val="single" w:sz="10" w:color="000000" w:space="0"/>
+            </w:tcBorders>
+          </w:tcPr>
+          <w:p>
+            <w:pPr>
+              <w:spacing w:after="0" w:before="0"/>
+            </w:pPr>
+            <w:r/>
+            <w:r>
+              <w:rPr>
+                <w:rFonts w:ascii="Times New Roman" w:hAnsi="Times New Roman" w:eastAsia="Times New Roman"/>
+                <w:b/>
+                <w:i w:val="0"/>
+                <w:sz w:val="19"/>
+              </w:rPr>
+              <w:t>Lab and values</w:t>
+            </w:r>
+          </w:p>
+        </w:tc>
+        <w:tc>
+          <w:tcPr>
+            <w:tcW w:type="dxa" w:w="3888"/>
+            <w:shd w:val="clear" w:color="auto" w:fill="D9D9D9"/>
+            <w:tcBorders>
+              <w:top w:val="single" w:sz="10" w:color="000000" w:space="0"/>
+              <w:left w:val="single" w:sz="10" w:color="000000" w:space="0"/>
+              <w:bottom w:val="single" w:sz="10" w:color="000000" w:space="0"/>
+              <w:right w:val="single" w:sz="10" w:color="000000" w:space="0"/>
+            </w:tcBorders>
+          </w:tcPr>
+          <w:p>
+            <w:pPr>
+              <w:spacing w:after="0" w:before="0"/>
+            </w:pPr>
+            <w:r/>
+            <w:r>
+              <w:rPr>
+                <w:rFonts w:ascii="Times New Roman" w:hAnsi="Times New Roman" w:eastAsia="Times New Roman"/>
+                <w:b/>
+                <w:i w:val="0"/>
+                <w:sz w:val="19"/>
+              </w:rPr>
+              <w:t>Why this happens in Marcus</w:t>
+            </w:r>
+          </w:p>
+        </w:tc>
+        <w:tc>
+          <w:tcPr>
+            <w:tcW w:type="dxa" w:w="3456"/>
+            <w:shd w:val="clear" w:color="auto" w:fill="D9D9D9"/>
+            <w:tcBorders>
+              <w:top w:val="single" w:sz="10" w:color="000000" w:space="0"/>
+              <w:left w:val="single" w:sz="10" w:color="000000" w:space="0"/>
+              <w:bottom w:val="single" w:sz="10" w:color="000000" w:space="0"/>
+              <w:right w:val="single" w:sz="10" w:color="000000" w:space="0"/>
+            </w:tcBorders>
+          </w:tcPr>
+          <w:p>
+            <w:pPr>
+              <w:spacing w:after="0" w:before="0"/>
+            </w:pPr>
+            <w:r/>
+            <w:r>
+              <w:rPr>
+                <w:rFonts w:ascii="Times New Roman" w:hAnsi="Times New Roman" w:eastAsia="Times New Roman"/>
+                <w:b/>
+                <w:i w:val="0"/>
+                <w:sz w:val="19"/>
+              </w:rPr>
+              <w:t>What you do or ask for</w:t>
+            </w:r>
+          </w:p>
+        </w:tc>
+      </w:tr>
+      <w:tr>
+        <w:trPr>
+          <w:trHeight w:val="1512" w:hRule="atLeast"/>
+          <w:cantSplit/>
+        </w:trPr>
+        <w:tc>
+          <w:tcPr>
+            <w:tcW w:type="dxa" w:w="2736"/>
+            <w:tcBorders>
+              <w:top w:val="single" w:sz="10" w:color="000000" w:space="0"/>
+              <w:left w:val="single" w:sz="10" w:color="000000" w:space="0"/>
+              <w:bottom w:val="single" w:sz="10" w:color="000000" w:space="0"/>
+              <w:right w:val="single" w:sz="10" w:color="000000" w:space="0"/>
+            </w:tcBorders>
+          </w:tcPr>
+          <w:p/>
+        </w:tc>
+        <w:tc>
+          <w:tcPr>
+            <w:tcW w:type="dxa" w:w="3888"/>
+            <w:tcBorders>
+              <w:top w:val="single" w:sz="10" w:color="000000" w:space="0"/>
+              <w:left w:val="single" w:sz="10" w:color="000000" w:space="0"/>
+              <w:bottom w:val="single" w:sz="10" w:color="000000" w:space="0"/>
+              <w:right w:val="single" w:sz="10" w:color="000000" w:space="0"/>
+            </w:tcBorders>
+          </w:tcPr>
+          <w:p/>
+        </w:tc>
+        <w:tc>
+          <w:tcPr>
+            <w:tcW w:type="dxa" w:w="3456"/>
+            <w:tcBorders>
+              <w:top w:val="single" w:sz="10" w:color="000000" w:space="0"/>
+              <w:left w:val="single" w:sz="10" w:color="000000" w:space="0"/>
+              <w:bottom w:val="single" w:sz="10" w:color="000000" w:space="0"/>
+              <w:right w:val="single" w:sz="10" w:color="000000" w:space="0"/>
+            </w:tcBorders>
+          </w:tcPr>
+          <w:p/>
+        </w:tc>
+      </w:tr>
+      <w:tr>
+        <w:trPr>
+          <w:trHeight w:val="1512" w:hRule="atLeast"/>
+          <w:cantSplit/>
+        </w:trPr>
+        <w:tc>
+          <w:tcPr>
+            <w:tcW w:type="dxa" w:w="2736"/>
+            <w:tcBorders>
+              <w:top w:val="single" w:sz="10" w:color="000000" w:space="0"/>
+              <w:left w:val="single" w:sz="10" w:color="000000" w:space="0"/>
+              <w:bottom w:val="single" w:sz="10" w:color="000000" w:space="0"/>
+              <w:right w:val="single" w:sz="10" w:color="000000" w:space="0"/>
+            </w:tcBorders>
+          </w:tcPr>
+          <w:p/>
+        </w:tc>
+        <w:tc>
+          <w:tcPr>
+            <w:tcW w:type="dxa" w:w="3888"/>
+            <w:tcBorders>
+              <w:top w:val="single" w:sz="10" w:color="000000" w:space="0"/>
+              <w:left w:val="single" w:sz="10" w:color="000000" w:space="0"/>
+              <w:bottom w:val="single" w:sz="10" w:color="000000" w:space="0"/>
+              <w:right w:val="single" w:sz="10" w:color="000000" w:space="0"/>
+            </w:tcBorders>
+          </w:tcPr>
+          <w:p/>
+        </w:tc>
+        <w:tc>
+          <w:tcPr>
+            <w:tcW w:type="dxa" w:w="3456"/>
+            <w:tcBorders>
+              <w:top w:val="single" w:sz="10" w:color="000000" w:space="0"/>
+              <w:left w:val="single" w:sz="10" w:color="000000" w:space="0"/>
+              <w:bottom w:val="single" w:sz="10" w:color="000000" w:space="0"/>
+              <w:right w:val="single" w:sz="10" w:color="000000" w:space="0"/>
+            </w:tcBorders>
+          </w:tcPr>
+          <w:p/>
+        </w:tc>
+      </w:tr>
+      <w:tr>
+        <w:trPr>
+          <w:trHeight w:val="1512" w:hRule="atLeast"/>
+          <w:cantSplit/>
+        </w:trPr>
+        <w:tc>
+          <w:tcPr>
+            <w:tcW w:type="dxa" w:w="2736"/>
+            <w:tcBorders>
+              <w:top w:val="single" w:sz="10" w:color="000000" w:space="0"/>
+              <w:left w:val="single" w:sz="10" w:color="000000" w:space="0"/>
+              <w:bottom w:val="single" w:sz="10" w:color="000000" w:space="0"/>
+              <w:right w:val="single" w:sz="10" w:color="000000" w:space="0"/>
+            </w:tcBorders>
+          </w:tcPr>
+          <w:p/>
+        </w:tc>
+        <w:tc>
+          <w:tcPr>
+            <w:tcW w:type="dxa" w:w="3888"/>
+            <w:tcBorders>
+              <w:top w:val="single" w:sz="10" w:color="000000" w:space="0"/>
+              <w:left w:val="single" w:sz="10" w:color="000000" w:space="0"/>
+              <w:bottom w:val="single" w:sz="10" w:color="000000" w:space="0"/>
+              <w:right w:val="single" w:sz="10" w:color="000000" w:space="0"/>
+            </w:tcBorders>
+          </w:tcPr>
+          <w:p/>
+        </w:tc>
+        <w:tc>
+          <w:tcPr>
+            <w:tcW w:type="dxa" w:w="3456"/>
+            <w:tcBorders>
+              <w:top w:val="single" w:sz="10" w:color="000000" w:space="0"/>
+              <w:left w:val="single" w:sz="10" w:color="000000" w:space="0"/>
+              <w:bottom w:val="single" w:sz="10" w:color="000000" w:space="0"/>
+              <w:right w:val="single" w:sz="10" w:color="000000" w:space="0"/>
+            </w:tcBorders>
+          </w:tcPr>
+          <w:p/>
+        </w:tc>
+      </w:tr>
+      <w:tr>
+        <w:trPr>
+          <w:trHeight w:val="1512" w:hRule="atLeast"/>
+          <w:cantSplit/>
+        </w:trPr>
+        <w:tc>
+          <w:tcPr>
+            <w:tcW w:type="dxa" w:w="2736"/>
+            <w:tcBorders>
+              <w:top w:val="single" w:sz="10" w:color="000000" w:space="0"/>
+              <w:left w:val="single" w:sz="10" w:color="000000" w:space="0"/>
+              <w:bottom w:val="single" w:sz="10" w:color="000000" w:space="0"/>
+              <w:right w:val="single" w:sz="10" w:color="000000" w:space="0"/>
+            </w:tcBorders>
+          </w:tcPr>
+          <w:p/>
+        </w:tc>
+        <w:tc>
+          <w:tcPr>
+            <w:tcW w:type="dxa" w:w="3888"/>
+            <w:tcBorders>
+              <w:top w:val="single" w:sz="10" w:color="000000" w:space="0"/>
+              <w:left w:val="single" w:sz="10" w:color="000000" w:space="0"/>
+              <w:bottom w:val="single" w:sz="10" w:color="000000" w:space="0"/>
+              <w:right w:val="single" w:sz="10" w:color="000000" w:space="0"/>
+            </w:tcBorders>
+          </w:tcPr>
+          <w:p/>
+        </w:tc>
+        <w:tc>
+          <w:tcPr>
+            <w:tcW w:type="dxa" w:w="3456"/>
+            <w:tcBorders>
+              <w:top w:val="single" w:sz="10" w:color="000000" w:space="0"/>
+              <w:left w:val="single" w:sz="10" w:color="000000" w:space="0"/>
+              <w:bottom w:val="single" w:sz="10" w:color="000000" w:space="0"/>
+              <w:right w:val="single" w:sz="10" w:color="000000" w:space="0"/>
+            </w:tcBorders>
+          </w:tcPr>
+          <w:p/>
+        </w:tc>
+      </w:tr>
+    </w:tbl>
+    <w:p>
+      <w:pPr>
+        <w:spacing w:before="0" w:after="40"/>
+      </w:pPr>
+    </w:p>
+    <w:p>
+      <w:pPr>
+        <w:keepNext/>
+        <w:spacing w:before="160" w:after="40"/>
+      </w:pPr>
+      <w:r>
+        <w:rPr>
+          <w:rFonts w:ascii="Times New Roman" w:hAnsi="Times New Roman" w:eastAsia="Times New Roman"/>
+          <w:b/>
+          <w:i w:val="0"/>
+          <w:sz w:val="25"/>
+        </w:rPr>
+        <w:t xml:space="preserve">2.9  </w:t>
+      </w:r>
+      <w:r>
+        <w:rPr>
+          <w:rFonts w:ascii="Times New Roman" w:hAnsi="Times New Roman" w:eastAsia="Times New Roman"/>
+          <w:b/>
+          <w:i w:val="0"/>
+          <w:sz w:val="25"/>
+        </w:rPr>
+        <w:t>Propofol: Math and Safety</w:t>
+      </w:r>
+      <w:r>
+        <w:rPr>
+          <w:rFonts w:ascii="Times New Roman" w:hAnsi="Times New Roman" w:eastAsia="Times New Roman"/>
+          <w:b w:val="0"/>
+          <w:i/>
+          <w:color w:val="444444"/>
+          <w:sz w:val="21"/>
+        </w:rPr>
+        <w:t xml:space="preserve">   (1.5 pts)</w:t>
+      </w:r>
+    </w:p>
+    <w:p>
+      <w:pPr>
+        <w:keepNext/>
+        <w:spacing w:before="0" w:after="40"/>
+      </w:pPr>
+      <w:r>
+        <w:rPr>
+          <w:rFonts w:ascii="Times New Roman" w:hAnsi="Times New Roman" w:eastAsia="Times New Roman"/>
+          <w:b w:val="0"/>
+          <w:i w:val="0"/>
+          <w:sz w:val="23"/>
+        </w:rPr>
+        <w:t>At 1900 on Monday the propofol is running at 35 mcg/kg/min. The bag is propofol 10 mg/mL and his weight is 82 kg. (a) Calculate the rate in mL/h. (b) Propofol gives 1.1 kcal per mL: how many calories does the sedation add in 24 hours? (c) Name two reasons you check the triglyceride level and two signs of propofol infusion syndrome. (d) Name two nursing actions for the bag and tubing.</w:t>
+      </w:r>
+    </w:p>
+    <w:p>
+      <w:pPr>
+        <w:keepNext/>
+        <w:spacing w:before="0" w:after="60"/>
+      </w:pPr>
+      <w:r>
+        <w:rPr>
+          <w:rFonts w:ascii="Times New Roman" w:hAnsi="Times New Roman" w:eastAsia="Times New Roman"/>
+          <w:b w:val="0"/>
+          <w:i/>
+          <w:color w:val="555555"/>
+          <w:sz w:val="19"/>
+        </w:rPr>
+        <w:t>Where to look in the EHR: MAR (propofol); Orders (propofol); Lab Results (Triglycerides); Flowsheets (RASS)</w:t>
+      </w:r>
+    </w:p>
+    <w:tbl>
+      <w:tblPr>
+        <w:tblW w:type="auto" w:w="0"/>
+        <w:jc w:val="center"/>
+        <w:tblLayout w:type="fixed"/>
+        <w:tblLook w:firstColumn="1" w:firstRow="1" w:lastColumn="0" w:lastRow="0" w:noHBand="0" w:noVBand="1" w:val="04A0"/>
+      </w:tblPr>
+      <w:tblGrid>
+        <w:gridCol w:w="10080"/>
+      </w:tblGrid>
+      <w:tr>
+        <w:trPr>
+          <w:trHeight w:val="432" w:hRule="exact"/>
+          <w:cantSplit/>
+        </w:trPr>
+        <w:tc>
+          <w:tcPr>
+            <w:tcW w:type="dxa" w:w="10080"/>
+            <w:tcBorders>
+              <w:top w:val="single" w:sz="10" w:color="000000" w:space="0"/>
+              <w:left w:val="single" w:sz="10" w:color="000000" w:space="0"/>
+              <w:bottom w:val="single" w:sz="4" w:color="808080" w:space="0"/>
+              <w:right w:val="single" w:sz="10" w:color="000000" w:space="0"/>
+            </w:tcBorders>
+          </w:tcPr>
+          <w:p>
+            <w:pPr>
+              <w:keepNext/>
+              <w:spacing w:after="0"/>
+            </w:pPr>
+          </w:p>
+        </w:tc>
+      </w:tr>
+      <w:tr>
+        <w:trPr>
+          <w:trHeight w:val="432" w:hRule="exact"/>
+          <w:cantSplit/>
+        </w:trPr>
+        <w:tc>
+          <w:tcPr>
+            <w:tcW w:type="dxa" w:w="10080"/>
+            <w:tcBorders>
+              <w:top w:val="single" w:sz="4" w:color="808080" w:space="0"/>
+              <w:left w:val="single" w:sz="10" w:color="000000" w:space="0"/>
+              <w:bottom w:val="single" w:sz="4" w:color="808080" w:space="0"/>
+              <w:right w:val="single" w:sz="10" w:color="000000" w:space="0"/>
+            </w:tcBorders>
+          </w:tcPr>
+          <w:p>
+            <w:pPr>
+              <w:keepNext/>
+              <w:spacing w:after="0"/>
+            </w:pPr>
+          </w:p>
+        </w:tc>
+      </w:tr>
+      <w:tr>
+        <w:trPr>
+          <w:trHeight w:val="432" w:hRule="exact"/>
+          <w:cantSplit/>
+        </w:trPr>
+        <w:tc>
+          <w:tcPr>
+            <w:tcW w:type="dxa" w:w="10080"/>
+            <w:tcBorders>
+              <w:top w:val="single" w:sz="4" w:color="808080" w:space="0"/>
+              <w:left w:val="single" w:sz="10" w:color="000000" w:space="0"/>
+              <w:bottom w:val="single" w:sz="4" w:color="808080" w:space="0"/>
+              <w:right w:val="single" w:sz="10" w:color="000000" w:space="0"/>
+            </w:tcBorders>
+          </w:tcPr>
+          <w:p>
+            <w:pPr>
+              <w:keepNext/>
+              <w:spacing w:after="0"/>
+            </w:pPr>
+          </w:p>
+        </w:tc>
+      </w:tr>
+      <w:tr>
+        <w:trPr>
+          <w:trHeight w:val="432" w:hRule="exact"/>
+          <w:cantSplit/>
+        </w:trPr>
+        <w:tc>
+          <w:tcPr>
+            <w:tcW w:type="dxa" w:w="10080"/>
+            <w:tcBorders>
+              <w:top w:val="single" w:sz="4" w:color="808080" w:space="0"/>
+              <w:left w:val="single" w:sz="10" w:color="000000" w:space="0"/>
+              <w:bottom w:val="single" w:sz="4" w:color="808080" w:space="0"/>
+              <w:right w:val="single" w:sz="10" w:color="000000" w:space="0"/>
+            </w:tcBorders>
+          </w:tcPr>
+          <w:p>
+            <w:pPr>
+              <w:keepNext/>
+              <w:spacing w:after="0"/>
+            </w:pPr>
+          </w:p>
+        </w:tc>
+      </w:tr>
+      <w:tr>
+        <w:trPr>
+          <w:trHeight w:val="432" w:hRule="exact"/>
+          <w:cantSplit/>
+        </w:trPr>
+        <w:tc>
+          <w:tcPr>
+            <w:tcW w:type="dxa" w:w="10080"/>
+            <w:tcBorders>
+              <w:top w:val="single" w:sz="4" w:color="808080" w:space="0"/>
+              <w:left w:val="single" w:sz="10" w:color="000000" w:space="0"/>
+              <w:bottom w:val="single" w:sz="4" w:color="808080" w:space="0"/>
+              <w:right w:val="single" w:sz="10" w:color="000000" w:space="0"/>
+            </w:tcBorders>
+          </w:tcPr>
+          <w:p>
+            <w:pPr>
+              <w:keepNext/>
+              <w:spacing w:after="0"/>
+            </w:pPr>
+          </w:p>
+        </w:tc>
+      </w:tr>
+      <w:tr>
+        <w:trPr>
+          <w:trHeight w:val="432" w:hRule="exact"/>
+          <w:cantSplit/>
+        </w:trPr>
+        <w:tc>
+          <w:tcPr>
+            <w:tcW w:type="dxa" w:w="10080"/>
+            <w:tcBorders>
+              <w:top w:val="single" w:sz="4" w:color="808080" w:space="0"/>
+              <w:left w:val="single" w:sz="10" w:color="000000" w:space="0"/>
+              <w:bottom w:val="single" w:sz="4" w:color="808080" w:space="0"/>
+              <w:right w:val="single" w:sz="10" w:color="000000" w:space="0"/>
+            </w:tcBorders>
+          </w:tcPr>
+          <w:p>
+            <w:pPr>
+              <w:keepNext/>
+              <w:spacing w:after="0"/>
+            </w:pPr>
+          </w:p>
+        </w:tc>
+      </w:tr>
+      <w:tr>
+        <w:trPr>
+          <w:trHeight w:val="432" w:hRule="exact"/>
+          <w:cantSplit/>
+        </w:trPr>
+        <w:tc>
+          <w:tcPr>
+            <w:tcW w:type="dxa" w:w="10080"/>
+            <w:tcBorders>
+              <w:top w:val="single" w:sz="4" w:color="808080" w:space="0"/>
+              <w:left w:val="single" w:sz="10" w:color="000000" w:space="0"/>
+              <w:bottom w:val="single" w:sz="10" w:color="000000" w:space="0"/>
+              <w:right w:val="single" w:sz="10" w:color="000000" w:space="0"/>
+            </w:tcBorders>
+          </w:tcPr>
+          <w:p>
+            <w:pPr>
+              <w:spacing w:after="0"/>
+            </w:pPr>
+          </w:p>
+        </w:tc>
+      </w:tr>
+    </w:tbl>
+    <w:p>
+      <w:pPr>
+        <w:spacing w:before="0" w:after="40"/>
+      </w:pPr>
+    </w:p>
+    <w:p>
+      <w:pPr>
+        <w:keepNext/>
+        <w:spacing w:before="160" w:after="40"/>
+      </w:pPr>
+      <w:r>
+        <w:rPr>
+          <w:rFonts w:ascii="Times New Roman" w:hAnsi="Times New Roman" w:eastAsia="Times New Roman"/>
+          <w:b/>
+          <w:i w:val="0"/>
+          <w:sz w:val="25"/>
+        </w:rPr>
+        <w:t xml:space="preserve">2.10  </w:t>
+      </w:r>
+      <w:r>
+        <w:rPr>
+          <w:rFonts w:ascii="Times New Roman" w:hAnsi="Times New Roman" w:eastAsia="Times New Roman"/>
+          <w:b/>
+          <w:i w:val="0"/>
+          <w:sz w:val="25"/>
+        </w:rPr>
+        <w:t>Handoff at 0650</w:t>
+      </w:r>
+      <w:r>
+        <w:rPr>
+          <w:rFonts w:ascii="Times New Roman" w:hAnsi="Times New Roman" w:eastAsia="Times New Roman"/>
+          <w:b w:val="0"/>
+          <w:i/>
+          <w:color w:val="444444"/>
+          <w:sz w:val="21"/>
+        </w:rPr>
+        <w:t xml:space="preserve">   (2 pts)</w:t>
+      </w:r>
+    </w:p>
+    <w:p>
+      <w:pPr>
+        <w:keepNext/>
+        <w:spacing w:before="0" w:after="40"/>
+      </w:pPr>
+      <w:r>
+        <w:rPr>
+          <w:rFonts w:ascii="Times New Roman" w:hAnsi="Times New Roman" w:eastAsia="Times New Roman"/>
+          <w:b w:val="0"/>
+          <w:i w:val="0"/>
+          <w:sz w:val="23"/>
+        </w:rPr>
+        <w:t>It is 0650 on Tuesday. Write your SBAR handoff for J. Morales, RN, the day nurse. Use real numbers, include the events of the night, what is happening in the next few hours (look at the orders and MAR), and anything you would like the day team to follow up.</w:t>
+      </w:r>
+    </w:p>
+    <w:p>
+      <w:pPr>
+        <w:keepNext/>
+        <w:spacing w:before="0" w:after="60"/>
+      </w:pPr>
+      <w:r>
+        <w:rPr>
+          <w:rFonts w:ascii="Times New Roman" w:hAnsi="Times New Roman" w:eastAsia="Times New Roman"/>
+          <w:b w:val="0"/>
+          <w:i/>
+          <w:color w:val="555555"/>
+          <w:sz w:val="19"/>
+        </w:rPr>
+        <w:t>Where to look in the EHR: Everything you read and charted this night; Orders; MAR; Lab Results; Flowsheets</w:t>
+      </w:r>
+    </w:p>
+    <w:tbl>
+      <w:tblPr>
+        <w:tblW w:type="auto" w:w="0"/>
+        <w:jc w:val="center"/>
+        <w:tblLayout w:type="fixed"/>
+        <w:tblLook w:firstColumn="1" w:firstRow="1" w:lastColumn="0" w:lastRow="0" w:noHBand="0" w:noVBand="1" w:val="04A0"/>
+      </w:tblPr>
+      <w:tblGrid>
+        <w:gridCol w:w="10080"/>
+      </w:tblGrid>
+      <w:tr>
+        <w:trPr>
+          <w:trHeight w:val="432" w:hRule="exact"/>
+          <w:cantSplit/>
+        </w:trPr>
+        <w:tc>
+          <w:tcPr>
+            <w:tcW w:type="dxa" w:w="10080"/>
+            <w:tcBorders>
+              <w:top w:val="single" w:sz="10" w:color="000000" w:space="0"/>
               <w:left w:val="single" w:sz="10" w:color="000000" w:space="0"/>
               <w:bottom w:val="single" w:sz="4" w:color="808080" w:space="0"/>
               <w:right w:val="single" w:sz="10" w:color="000000" w:space="0"/>

</xml_diff>